<commit_message>
Rebuild the 2525 Word, PDF and contents files from website_new.html
The files in files/ came from the old 2540-based pipeline and no longer
matched the charter on the site. tools/build_charter_files.py now reads
the 1,160 articles from website_new.html, writes the Word file (Garuda
cover, gazette header), the contents table, the print page and the PDF,
and checks every character of all three against the site.

Co-Authored-By: Claude Opus 5.5 <noreply@anthropic.com>
Claude-Session: https://claude.ai/code/session_01U2SdPW1rHLhRKCXxNJ4pJp
</commit_message>
<xml_diff>
--- a/files/สารบัญรัฐธรรมนูญ.docx
+++ b/files/สารบัญรัฐธรรมนูญ.docx
@@ -8,7 +8,6 @@
         <w:jc w:val="center"/>
         <w:rPr>
           <w:noProof/>
-          <w:lang w:val="th-TH" w:bidi="th-TH"/>
         </w:rPr>
       </w:pPr>
       <w:r>
@@ -29,7 +28,6 @@
         <w:jc w:val="center"/>
         <w:rPr>
           <w:noProof/>
-          <w:lang w:val="th-TH" w:bidi="th-TH"/>
         </w:rPr>
       </w:pPr>
       <w:r>
@@ -44,35 +42,17 @@
         <w:t>รัฐธรรมนูญแห่งราชอาณาจักรไทย พุทธศักราช ๒๕๒๕</w:t>
       </w:r>
     </w:p>
-    <w:p>
-      <w:pPr>
-        <w:spacing w:after="240"/>
-        <w:rPr>
-          <w:noProof/>
-          <w:lang w:val="th-TH" w:bidi="th-TH"/>
-        </w:rPr>
-      </w:pPr>
-      <w:r>
-        <w:rPr>
-          <w:rFonts w:ascii="TH Sarabun New" w:hAnsi="TH Sarabun New" w:cs="TH Sarabun New"/>
-          <w:b w:val="0"/>
-          <w:sz w:val="20"/>
-          <w:szCs w:val="20"/>
-          <w:lang w:val="th-TH" w:bidi="th-TH" w:eastAsia="th-TH"/>
-        </w:rPr>
-        <w:t>────────────────────────────────────────────────────────────</w:t>
-      </w:r>
-    </w:p>
     <w:tbl>
       <w:tblPr>
         <w:tblStyle w:val="TableGrid"/>
         <w:tblW w:type="auto" w:w="0"/>
+        <w:tblLayout w:type="fixed"/>
         <w:tblLook w:firstColumn="1" w:firstRow="1" w:lastColumn="0" w:lastRow="0" w:noHBand="0" w:noVBand="1" w:val="04A0"/>
       </w:tblPr>
       <w:tblGrid>
-        <w:gridCol w:w="2890"/>
-        <w:gridCol w:w="2890"/>
-        <w:gridCol w:w="2890"/>
+        <w:gridCol w:w="5669"/>
+        <w:gridCol w:w="1701"/>
+        <w:gridCol w:w="1701"/>
       </w:tblGrid>
       <w:tr>
         <w:tc>
@@ -83,10 +63,6 @@
           <w:p>
             <w:pPr>
               <w:jc w:val="center"/>
-              <w:rPr>
-                <w:noProof/>
-                <w:lang w:val="th-TH" w:bidi="th-TH"/>
-              </w:rPr>
             </w:pPr>
             <w:r>
               <w:rPr>
@@ -110,10 +86,6 @@
           <w:p>
             <w:pPr>
               <w:jc w:val="center"/>
-              <w:rPr>
-                <w:noProof/>
-                <w:lang w:val="th-TH" w:bidi="th-TH"/>
-              </w:rPr>
             </w:pPr>
             <w:r>
               <w:rPr>
@@ -137,10 +109,6 @@
           <w:p>
             <w:pPr>
               <w:jc w:val="center"/>
-              <w:rPr>
-                <w:noProof/>
-                <w:lang w:val="th-TH" w:bidi="th-TH"/>
-              </w:rPr>
             </w:pPr>
             <w:r>
               <w:rPr>
@@ -160,16 +128,10 @@
       <w:tr>
         <w:tc>
           <w:tcPr>
-            <w:tcW w:type="dxa" w:w="2890"/>
+            <w:tcW w:type="dxa" w:w="5669"/>
             <w:shd w:fill="EBF5FB" w:val="clear"/>
           </w:tcPr>
           <w:p>
-            <w:pPr>
-              <w:rPr>
-                <w:noProof/>
-                <w:lang w:val="th-TH" w:bidi="th-TH"/>
-              </w:rPr>
-            </w:pPr>
             <w:r>
               <w:rPr>
                 <w:rFonts w:ascii="TH Sarabun New" w:hAnsi="TH Sarabun New" w:cs="TH Sarabun New"/>
@@ -184,16 +146,12 @@
         </w:tc>
         <w:tc>
           <w:tcPr>
-            <w:tcW w:type="dxa" w:w="2890"/>
+            <w:tcW w:type="dxa" w:w="1701"/>
             <w:shd w:fill="EBF5FB" w:val="clear"/>
           </w:tcPr>
           <w:p>
             <w:pPr>
               <w:jc w:val="center"/>
-              <w:rPr>
-                <w:noProof/>
-                <w:lang w:val="th-TH" w:bidi="th-TH"/>
-              </w:rPr>
             </w:pPr>
             <w:r>
               <w:rPr>
@@ -209,16 +167,12 @@
         </w:tc>
         <w:tc>
           <w:tcPr>
-            <w:tcW w:type="dxa" w:w="2890"/>
+            <w:tcW w:type="dxa" w:w="1701"/>
             <w:shd w:fill="EBF5FB" w:val="clear"/>
           </w:tcPr>
           <w:p>
             <w:pPr>
               <w:jc w:val="center"/>
-              <w:rPr>
-                <w:noProof/>
-                <w:lang w:val="th-TH" w:bidi="th-TH"/>
-              </w:rPr>
             </w:pPr>
             <w:r>
               <w:rPr>
@@ -236,16 +190,10 @@
       <w:tr>
         <w:tc>
           <w:tcPr>
-            <w:tcW w:type="dxa" w:w="2890"/>
+            <w:tcW w:type="dxa" w:w="5669"/>
             <w:shd w:fill="FFFFFF" w:val="clear"/>
           </w:tcPr>
           <w:p>
-            <w:pPr>
-              <w:rPr>
-                <w:noProof/>
-                <w:lang w:val="th-TH" w:bidi="th-TH"/>
-              </w:rPr>
-            </w:pPr>
             <w:r>
               <w:rPr>
                 <w:rFonts w:ascii="TH Sarabun New" w:hAnsi="TH Sarabun New" w:cs="TH Sarabun New"/>
@@ -260,16 +208,12 @@
         </w:tc>
         <w:tc>
           <w:tcPr>
-            <w:tcW w:type="dxa" w:w="2890"/>
+            <w:tcW w:type="dxa" w:w="1701"/>
             <w:shd w:fill="FFFFFF" w:val="clear"/>
           </w:tcPr>
           <w:p>
             <w:pPr>
               <w:jc w:val="center"/>
-              <w:rPr>
-                <w:noProof/>
-                <w:lang w:val="th-TH" w:bidi="th-TH"/>
-              </w:rPr>
             </w:pPr>
             <w:r>
               <w:rPr>
@@ -285,16 +229,12 @@
         </w:tc>
         <w:tc>
           <w:tcPr>
-            <w:tcW w:type="dxa" w:w="2890"/>
+            <w:tcW w:type="dxa" w:w="1701"/>
             <w:shd w:fill="FFFFFF" w:val="clear"/>
           </w:tcPr>
           <w:p>
             <w:pPr>
               <w:jc w:val="center"/>
-              <w:rPr>
-                <w:noProof/>
-                <w:lang w:val="th-TH" w:bidi="th-TH"/>
-              </w:rPr>
             </w:pPr>
             <w:r>
               <w:rPr>
@@ -312,16 +252,10 @@
       <w:tr>
         <w:tc>
           <w:tcPr>
-            <w:tcW w:type="dxa" w:w="2890"/>
+            <w:tcW w:type="dxa" w:w="5669"/>
             <w:shd w:fill="EBF5FB" w:val="clear"/>
           </w:tcPr>
           <w:p>
-            <w:pPr>
-              <w:rPr>
-                <w:noProof/>
-                <w:lang w:val="th-TH" w:bidi="th-TH"/>
-              </w:rPr>
-            </w:pPr>
             <w:r>
               <w:rPr>
                 <w:rFonts w:ascii="TH Sarabun New" w:hAnsi="TH Sarabun New" w:cs="TH Sarabun New"/>
@@ -336,16 +270,12 @@
         </w:tc>
         <w:tc>
           <w:tcPr>
-            <w:tcW w:type="dxa" w:w="2890"/>
+            <w:tcW w:type="dxa" w:w="1701"/>
             <w:shd w:fill="EBF5FB" w:val="clear"/>
           </w:tcPr>
           <w:p>
             <w:pPr>
               <w:jc w:val="center"/>
-              <w:rPr>
-                <w:noProof/>
-                <w:lang w:val="th-TH" w:bidi="th-TH"/>
-              </w:rPr>
             </w:pPr>
             <w:r>
               <w:rPr>
@@ -361,16 +291,12 @@
         </w:tc>
         <w:tc>
           <w:tcPr>
-            <w:tcW w:type="dxa" w:w="2890"/>
+            <w:tcW w:type="dxa" w:w="1701"/>
             <w:shd w:fill="EBF5FB" w:val="clear"/>
           </w:tcPr>
           <w:p>
             <w:pPr>
               <w:jc w:val="center"/>
-              <w:rPr>
-                <w:noProof/>
-                <w:lang w:val="th-TH" w:bidi="th-TH"/>
-              </w:rPr>
             </w:pPr>
             <w:r>
               <w:rPr>
@@ -388,16 +314,10 @@
       <w:tr>
         <w:tc>
           <w:tcPr>
-            <w:tcW w:type="dxa" w:w="2890"/>
+            <w:tcW w:type="dxa" w:w="5669"/>
             <w:shd w:fill="FFFFFF" w:val="clear"/>
           </w:tcPr>
           <w:p>
-            <w:pPr>
-              <w:rPr>
-                <w:noProof/>
-                <w:lang w:val="th-TH" w:bidi="th-TH"/>
-              </w:rPr>
-            </w:pPr>
             <w:r>
               <w:rPr>
                 <w:rFonts w:ascii="TH Sarabun New" w:hAnsi="TH Sarabun New" w:cs="TH Sarabun New"/>
@@ -412,16 +332,12 @@
         </w:tc>
         <w:tc>
           <w:tcPr>
-            <w:tcW w:type="dxa" w:w="2890"/>
+            <w:tcW w:type="dxa" w:w="1701"/>
             <w:shd w:fill="FFFFFF" w:val="clear"/>
           </w:tcPr>
           <w:p>
             <w:pPr>
               <w:jc w:val="center"/>
-              <w:rPr>
-                <w:noProof/>
-                <w:lang w:val="th-TH" w:bidi="th-TH"/>
-              </w:rPr>
             </w:pPr>
             <w:r>
               <w:rPr>
@@ -437,16 +353,12 @@
         </w:tc>
         <w:tc>
           <w:tcPr>
-            <w:tcW w:type="dxa" w:w="2890"/>
+            <w:tcW w:type="dxa" w:w="1701"/>
             <w:shd w:fill="FFFFFF" w:val="clear"/>
           </w:tcPr>
           <w:p>
             <w:pPr>
               <w:jc w:val="center"/>
-              <w:rPr>
-                <w:noProof/>
-                <w:lang w:val="th-TH" w:bidi="th-TH"/>
-              </w:rPr>
             </w:pPr>
             <w:r>
               <w:rPr>
@@ -464,16 +376,10 @@
       <w:tr>
         <w:tc>
           <w:tcPr>
-            <w:tcW w:type="dxa" w:w="2890"/>
+            <w:tcW w:type="dxa" w:w="5669"/>
             <w:shd w:fill="EBF5FB" w:val="clear"/>
           </w:tcPr>
           <w:p>
-            <w:pPr>
-              <w:rPr>
-                <w:noProof/>
-                <w:lang w:val="th-TH" w:bidi="th-TH"/>
-              </w:rPr>
-            </w:pPr>
             <w:r>
               <w:rPr>
                 <w:rFonts w:ascii="TH Sarabun New" w:hAnsi="TH Sarabun New" w:cs="TH Sarabun New"/>
@@ -488,16 +394,12 @@
         </w:tc>
         <w:tc>
           <w:tcPr>
-            <w:tcW w:type="dxa" w:w="2890"/>
+            <w:tcW w:type="dxa" w:w="1701"/>
             <w:shd w:fill="EBF5FB" w:val="clear"/>
           </w:tcPr>
           <w:p>
             <w:pPr>
               <w:jc w:val="center"/>
-              <w:rPr>
-                <w:noProof/>
-                <w:lang w:val="th-TH" w:bidi="th-TH"/>
-              </w:rPr>
             </w:pPr>
             <w:r>
               <w:rPr>
@@ -513,16 +415,12 @@
         </w:tc>
         <w:tc>
           <w:tcPr>
-            <w:tcW w:type="dxa" w:w="2890"/>
+            <w:tcW w:type="dxa" w:w="1701"/>
             <w:shd w:fill="EBF5FB" w:val="clear"/>
           </w:tcPr>
           <w:p>
             <w:pPr>
               <w:jc w:val="center"/>
-              <w:rPr>
-                <w:noProof/>
-                <w:lang w:val="th-TH" w:bidi="th-TH"/>
-              </w:rPr>
             </w:pPr>
             <w:r>
               <w:rPr>
@@ -540,16 +438,10 @@
       <w:tr>
         <w:tc>
           <w:tcPr>
-            <w:tcW w:type="dxa" w:w="2890"/>
+            <w:tcW w:type="dxa" w:w="5669"/>
             <w:shd w:fill="FFFFFF" w:val="clear"/>
           </w:tcPr>
           <w:p>
-            <w:pPr>
-              <w:rPr>
-                <w:noProof/>
-                <w:lang w:val="th-TH" w:bidi="th-TH"/>
-              </w:rPr>
-            </w:pPr>
             <w:r>
               <w:rPr>
                 <w:rFonts w:ascii="TH Sarabun New" w:hAnsi="TH Sarabun New" w:cs="TH Sarabun New"/>
@@ -564,16 +456,12 @@
         </w:tc>
         <w:tc>
           <w:tcPr>
-            <w:tcW w:type="dxa" w:w="2890"/>
+            <w:tcW w:type="dxa" w:w="1701"/>
             <w:shd w:fill="FFFFFF" w:val="clear"/>
           </w:tcPr>
           <w:p>
             <w:pPr>
               <w:jc w:val="center"/>
-              <w:rPr>
-                <w:noProof/>
-                <w:lang w:val="th-TH" w:bidi="th-TH"/>
-              </w:rPr>
             </w:pPr>
             <w:r>
               <w:rPr>
@@ -589,16 +477,12 @@
         </w:tc>
         <w:tc>
           <w:tcPr>
-            <w:tcW w:type="dxa" w:w="2890"/>
+            <w:tcW w:type="dxa" w:w="1701"/>
             <w:shd w:fill="FFFFFF" w:val="clear"/>
           </w:tcPr>
           <w:p>
             <w:pPr>
               <w:jc w:val="center"/>
-              <w:rPr>
-                <w:noProof/>
-                <w:lang w:val="th-TH" w:bidi="th-TH"/>
-              </w:rPr>
             </w:pPr>
             <w:r>
               <w:rPr>
@@ -616,16 +500,10 @@
       <w:tr>
         <w:tc>
           <w:tcPr>
-            <w:tcW w:type="dxa" w:w="2890"/>
+            <w:tcW w:type="dxa" w:w="5669"/>
             <w:shd w:fill="EBF5FB" w:val="clear"/>
           </w:tcPr>
           <w:p>
-            <w:pPr>
-              <w:rPr>
-                <w:noProof/>
-                <w:lang w:val="th-TH" w:bidi="th-TH"/>
-              </w:rPr>
-            </w:pPr>
             <w:r>
               <w:rPr>
                 <w:rFonts w:ascii="TH Sarabun New" w:hAnsi="TH Sarabun New" w:cs="TH Sarabun New"/>
@@ -640,16 +518,12 @@
         </w:tc>
         <w:tc>
           <w:tcPr>
-            <w:tcW w:type="dxa" w:w="2890"/>
+            <w:tcW w:type="dxa" w:w="1701"/>
             <w:shd w:fill="EBF5FB" w:val="clear"/>
           </w:tcPr>
           <w:p>
             <w:pPr>
               <w:jc w:val="center"/>
-              <w:rPr>
-                <w:noProof/>
-                <w:lang w:val="th-TH" w:bidi="th-TH"/>
-              </w:rPr>
             </w:pPr>
             <w:r>
               <w:rPr>
@@ -665,16 +539,12 @@
         </w:tc>
         <w:tc>
           <w:tcPr>
-            <w:tcW w:type="dxa" w:w="2890"/>
+            <w:tcW w:type="dxa" w:w="1701"/>
             <w:shd w:fill="EBF5FB" w:val="clear"/>
           </w:tcPr>
           <w:p>
             <w:pPr>
               <w:jc w:val="center"/>
-              <w:rPr>
-                <w:noProof/>
-                <w:lang w:val="th-TH" w:bidi="th-TH"/>
-              </w:rPr>
             </w:pPr>
             <w:r>
               <w:rPr>
@@ -692,16 +562,10 @@
       <w:tr>
         <w:tc>
           <w:tcPr>
-            <w:tcW w:type="dxa" w:w="2890"/>
+            <w:tcW w:type="dxa" w:w="5669"/>
             <w:shd w:fill="FFFFFF" w:val="clear"/>
           </w:tcPr>
           <w:p>
-            <w:pPr>
-              <w:rPr>
-                <w:noProof/>
-                <w:lang w:val="th-TH" w:bidi="th-TH"/>
-              </w:rPr>
-            </w:pPr>
             <w:r>
               <w:rPr>
                 <w:rFonts w:ascii="TH Sarabun New" w:hAnsi="TH Sarabun New" w:cs="TH Sarabun New"/>
@@ -716,16 +580,12 @@
         </w:tc>
         <w:tc>
           <w:tcPr>
-            <w:tcW w:type="dxa" w:w="2890"/>
+            <w:tcW w:type="dxa" w:w="1701"/>
             <w:shd w:fill="FFFFFF" w:val="clear"/>
           </w:tcPr>
           <w:p>
             <w:pPr>
               <w:jc w:val="center"/>
-              <w:rPr>
-                <w:noProof/>
-                <w:lang w:val="th-TH" w:bidi="th-TH"/>
-              </w:rPr>
             </w:pPr>
             <w:r>
               <w:rPr>
@@ -741,16 +601,12 @@
         </w:tc>
         <w:tc>
           <w:tcPr>
-            <w:tcW w:type="dxa" w:w="2890"/>
+            <w:tcW w:type="dxa" w:w="1701"/>
             <w:shd w:fill="FFFFFF" w:val="clear"/>
           </w:tcPr>
           <w:p>
             <w:pPr>
               <w:jc w:val="center"/>
-              <w:rPr>
-                <w:noProof/>
-                <w:lang w:val="th-TH" w:bidi="th-TH"/>
-              </w:rPr>
             </w:pPr>
             <w:r>
               <w:rPr>
@@ -768,16 +624,10 @@
       <w:tr>
         <w:tc>
           <w:tcPr>
-            <w:tcW w:type="dxa" w:w="2890"/>
+            <w:tcW w:type="dxa" w:w="5669"/>
             <w:shd w:fill="EBF5FB" w:val="clear"/>
           </w:tcPr>
           <w:p>
-            <w:pPr>
-              <w:rPr>
-                <w:noProof/>
-                <w:lang w:val="th-TH" w:bidi="th-TH"/>
-              </w:rPr>
-            </w:pPr>
             <w:r>
               <w:rPr>
                 <w:rFonts w:ascii="TH Sarabun New" w:hAnsi="TH Sarabun New" w:cs="TH Sarabun New"/>
@@ -792,16 +642,12 @@
         </w:tc>
         <w:tc>
           <w:tcPr>
-            <w:tcW w:type="dxa" w:w="2890"/>
+            <w:tcW w:type="dxa" w:w="1701"/>
             <w:shd w:fill="EBF5FB" w:val="clear"/>
           </w:tcPr>
           <w:p>
             <w:pPr>
               <w:jc w:val="center"/>
-              <w:rPr>
-                <w:noProof/>
-                <w:lang w:val="th-TH" w:bidi="th-TH"/>
-              </w:rPr>
             </w:pPr>
             <w:r>
               <w:rPr>
@@ -817,16 +663,12 @@
         </w:tc>
         <w:tc>
           <w:tcPr>
-            <w:tcW w:type="dxa" w:w="2890"/>
+            <w:tcW w:type="dxa" w:w="1701"/>
             <w:shd w:fill="EBF5FB" w:val="clear"/>
           </w:tcPr>
           <w:p>
             <w:pPr>
               <w:jc w:val="center"/>
-              <w:rPr>
-                <w:noProof/>
-                <w:lang w:val="th-TH" w:bidi="th-TH"/>
-              </w:rPr>
             </w:pPr>
             <w:r>
               <w:rPr>
@@ -844,16 +686,10 @@
       <w:tr>
         <w:tc>
           <w:tcPr>
-            <w:tcW w:type="dxa" w:w="2890"/>
+            <w:tcW w:type="dxa" w:w="5669"/>
             <w:shd w:fill="FFFFFF" w:val="clear"/>
           </w:tcPr>
           <w:p>
-            <w:pPr>
-              <w:rPr>
-                <w:noProof/>
-                <w:lang w:val="th-TH" w:bidi="th-TH"/>
-              </w:rPr>
-            </w:pPr>
             <w:r>
               <w:rPr>
                 <w:rFonts w:ascii="TH Sarabun New" w:hAnsi="TH Sarabun New" w:cs="TH Sarabun New"/>
@@ -868,16 +704,12 @@
         </w:tc>
         <w:tc>
           <w:tcPr>
-            <w:tcW w:type="dxa" w:w="2890"/>
+            <w:tcW w:type="dxa" w:w="1701"/>
             <w:shd w:fill="FFFFFF" w:val="clear"/>
           </w:tcPr>
           <w:p>
             <w:pPr>
               <w:jc w:val="center"/>
-              <w:rPr>
-                <w:noProof/>
-                <w:lang w:val="th-TH" w:bidi="th-TH"/>
-              </w:rPr>
             </w:pPr>
             <w:r>
               <w:rPr>
@@ -893,16 +725,12 @@
         </w:tc>
         <w:tc>
           <w:tcPr>
-            <w:tcW w:type="dxa" w:w="2890"/>
+            <w:tcW w:type="dxa" w:w="1701"/>
             <w:shd w:fill="FFFFFF" w:val="clear"/>
           </w:tcPr>
           <w:p>
             <w:pPr>
               <w:jc w:val="center"/>
-              <w:rPr>
-                <w:noProof/>
-                <w:lang w:val="th-TH" w:bidi="th-TH"/>
-              </w:rPr>
             </w:pPr>
             <w:r>
               <w:rPr>
@@ -920,16 +748,10 @@
       <w:tr>
         <w:tc>
           <w:tcPr>
-            <w:tcW w:type="dxa" w:w="2890"/>
+            <w:tcW w:type="dxa" w:w="5669"/>
             <w:shd w:fill="EBF5FB" w:val="clear"/>
           </w:tcPr>
           <w:p>
-            <w:pPr>
-              <w:rPr>
-                <w:noProof/>
-                <w:lang w:val="th-TH" w:bidi="th-TH"/>
-              </w:rPr>
-            </w:pPr>
             <w:r>
               <w:rPr>
                 <w:rFonts w:ascii="TH Sarabun New" w:hAnsi="TH Sarabun New" w:cs="TH Sarabun New"/>
@@ -944,16 +766,12 @@
         </w:tc>
         <w:tc>
           <w:tcPr>
-            <w:tcW w:type="dxa" w:w="2890"/>
+            <w:tcW w:type="dxa" w:w="1701"/>
             <w:shd w:fill="EBF5FB" w:val="clear"/>
           </w:tcPr>
           <w:p>
             <w:pPr>
               <w:jc w:val="center"/>
-              <w:rPr>
-                <w:noProof/>
-                <w:lang w:val="th-TH" w:bidi="th-TH"/>
-              </w:rPr>
             </w:pPr>
             <w:r>
               <w:rPr>
@@ -969,16 +787,12 @@
         </w:tc>
         <w:tc>
           <w:tcPr>
-            <w:tcW w:type="dxa" w:w="2890"/>
+            <w:tcW w:type="dxa" w:w="1701"/>
             <w:shd w:fill="EBF5FB" w:val="clear"/>
           </w:tcPr>
           <w:p>
             <w:pPr>
               <w:jc w:val="center"/>
-              <w:rPr>
-                <w:noProof/>
-                <w:lang w:val="th-TH" w:bidi="th-TH"/>
-              </w:rPr>
             </w:pPr>
             <w:r>
               <w:rPr>
@@ -996,16 +810,10 @@
       <w:tr>
         <w:tc>
           <w:tcPr>
-            <w:tcW w:type="dxa" w:w="2890"/>
+            <w:tcW w:type="dxa" w:w="5669"/>
             <w:shd w:fill="FFFFFF" w:val="clear"/>
           </w:tcPr>
           <w:p>
-            <w:pPr>
-              <w:rPr>
-                <w:noProof/>
-                <w:lang w:val="th-TH" w:bidi="th-TH"/>
-              </w:rPr>
-            </w:pPr>
             <w:r>
               <w:rPr>
                 <w:rFonts w:ascii="TH Sarabun New" w:hAnsi="TH Sarabun New" w:cs="TH Sarabun New"/>
@@ -1014,22 +822,18 @@
                 <w:szCs w:val="28"/>
                 <w:lang w:val="th-TH" w:bidi="th-TH" w:eastAsia="th-TH"/>
               </w:rPr>
-              <w:t>หมวด ๑๒ การแก้ไขเพิ่มเติมรัฐธรรมนูญ</w:t>
+              <w:t>หมวด ๑๒ การแก้ไขเพิ่มเติมรัฐธรรมนูญและการร่างรัฐธรรมนูญ</w:t>
             </w:r>
           </w:p>
         </w:tc>
         <w:tc>
           <w:tcPr>
-            <w:tcW w:type="dxa" w:w="2890"/>
+            <w:tcW w:type="dxa" w:w="1701"/>
             <w:shd w:fill="FFFFFF" w:val="clear"/>
           </w:tcPr>
           <w:p>
             <w:pPr>
               <w:jc w:val="center"/>
-              <w:rPr>
-                <w:noProof/>
-                <w:lang w:val="th-TH" w:bidi="th-TH"/>
-              </w:rPr>
             </w:pPr>
             <w:r>
               <w:rPr>
@@ -1045,16 +849,12 @@
         </w:tc>
         <w:tc>
           <w:tcPr>
-            <w:tcW w:type="dxa" w:w="2890"/>
+            <w:tcW w:type="dxa" w:w="1701"/>
             <w:shd w:fill="FFFFFF" w:val="clear"/>
           </w:tcPr>
           <w:p>
             <w:pPr>
               <w:jc w:val="center"/>
-              <w:rPr>
-                <w:noProof/>
-                <w:lang w:val="th-TH" w:bidi="th-TH"/>
-              </w:rPr>
             </w:pPr>
             <w:r>
               <w:rPr>
@@ -1064,7 +864,7 @@
                 <w:szCs w:val="28"/>
                 <w:lang w:val="th-TH" w:bidi="th-TH" w:eastAsia="th-TH"/>
               </w:rPr>
-              <w:t>๒๙๕</w:t>
+              <w:t>๒๙๖</w:t>
             </w:r>
           </w:p>
         </w:tc>
@@ -1072,16 +872,10 @@
       <w:tr>
         <w:tc>
           <w:tcPr>
-            <w:tcW w:type="dxa" w:w="2890"/>
+            <w:tcW w:type="dxa" w:w="5669"/>
             <w:shd w:fill="EBF5FB" w:val="clear"/>
           </w:tcPr>
           <w:p>
-            <w:pPr>
-              <w:rPr>
-                <w:noProof/>
-                <w:lang w:val="th-TH" w:bidi="th-TH"/>
-              </w:rPr>
-            </w:pPr>
             <w:r>
               <w:rPr>
                 <w:rFonts w:ascii="TH Sarabun New" w:hAnsi="TH Sarabun New" w:cs="TH Sarabun New"/>
@@ -1096,16 +890,12 @@
         </w:tc>
         <w:tc>
           <w:tcPr>
-            <w:tcW w:type="dxa" w:w="2890"/>
+            <w:tcW w:type="dxa" w:w="1701"/>
             <w:shd w:fill="EBF5FB" w:val="clear"/>
           </w:tcPr>
           <w:p>
             <w:pPr>
               <w:jc w:val="center"/>
-              <w:rPr>
-                <w:noProof/>
-                <w:lang w:val="th-TH" w:bidi="th-TH"/>
-              </w:rPr>
             </w:pPr>
             <w:r>
               <w:rPr>
@@ -1115,22 +905,18 @@
                 <w:szCs w:val="28"/>
                 <w:lang w:val="th-TH" w:bidi="th-TH" w:eastAsia="th-TH"/>
               </w:rPr>
-              <w:t>๒๙๖</w:t>
+              <w:t>๒๙๗</w:t>
             </w:r>
           </w:p>
         </w:tc>
         <w:tc>
           <w:tcPr>
-            <w:tcW w:type="dxa" w:w="2890"/>
+            <w:tcW w:type="dxa" w:w="1701"/>
             <w:shd w:fill="EBF5FB" w:val="clear"/>
           </w:tcPr>
           <w:p>
             <w:pPr>
               <w:jc w:val="center"/>
-              <w:rPr>
-                <w:noProof/>
-                <w:lang w:val="th-TH" w:bidi="th-TH"/>
-              </w:rPr>
             </w:pPr>
             <w:r>
               <w:rPr>
@@ -1140,7 +926,7 @@
                 <w:szCs w:val="28"/>
                 <w:lang w:val="th-TH" w:bidi="th-TH" w:eastAsia="th-TH"/>
               </w:rPr>
-              <w:t>๒๙๘</w:t>
+              <w:t>๒๙๙</w:t>
             </w:r>
           </w:p>
         </w:tc>
@@ -1148,16 +934,10 @@
       <w:tr>
         <w:tc>
           <w:tcPr>
-            <w:tcW w:type="dxa" w:w="2890"/>
+            <w:tcW w:type="dxa" w:w="5669"/>
             <w:shd w:fill="FFFFFF" w:val="clear"/>
           </w:tcPr>
           <w:p>
-            <w:pPr>
-              <w:rPr>
-                <w:noProof/>
-                <w:lang w:val="th-TH" w:bidi="th-TH"/>
-              </w:rPr>
-            </w:pPr>
             <w:r>
               <w:rPr>
                 <w:rFonts w:ascii="TH Sarabun New" w:hAnsi="TH Sarabun New" w:cs="TH Sarabun New"/>
@@ -1172,16 +952,12 @@
         </w:tc>
         <w:tc>
           <w:tcPr>
-            <w:tcW w:type="dxa" w:w="2890"/>
+            <w:tcW w:type="dxa" w:w="1701"/>
             <w:shd w:fill="FFFFFF" w:val="clear"/>
           </w:tcPr>
           <w:p>
             <w:pPr>
               <w:jc w:val="center"/>
-              <w:rPr>
-                <w:noProof/>
-                <w:lang w:val="th-TH" w:bidi="th-TH"/>
-              </w:rPr>
             </w:pPr>
             <w:r>
               <w:rPr>
@@ -1191,22 +967,18 @@
                 <w:szCs w:val="28"/>
                 <w:lang w:val="th-TH" w:bidi="th-TH" w:eastAsia="th-TH"/>
               </w:rPr>
-              <w:t>๒๙๙</w:t>
+              <w:t>๓๐๐</w:t>
             </w:r>
           </w:p>
         </w:tc>
         <w:tc>
           <w:tcPr>
-            <w:tcW w:type="dxa" w:w="2890"/>
+            <w:tcW w:type="dxa" w:w="1701"/>
             <w:shd w:fill="FFFFFF" w:val="clear"/>
           </w:tcPr>
           <w:p>
             <w:pPr>
               <w:jc w:val="center"/>
-              <w:rPr>
-                <w:noProof/>
-                <w:lang w:val="th-TH" w:bidi="th-TH"/>
-              </w:rPr>
             </w:pPr>
             <w:r>
               <w:rPr>
@@ -1216,7 +988,7 @@
                 <w:szCs w:val="28"/>
                 <w:lang w:val="th-TH" w:bidi="th-TH" w:eastAsia="th-TH"/>
               </w:rPr>
-              <w:t>๓๐๕</w:t>
+              <w:t>๓๐๖</w:t>
             </w:r>
           </w:p>
         </w:tc>
@@ -1224,16 +996,10 @@
       <w:tr>
         <w:tc>
           <w:tcPr>
-            <w:tcW w:type="dxa" w:w="2890"/>
+            <w:tcW w:type="dxa" w:w="5669"/>
             <w:shd w:fill="EBF5FB" w:val="clear"/>
           </w:tcPr>
           <w:p>
-            <w:pPr>
-              <w:rPr>
-                <w:noProof/>
-                <w:lang w:val="th-TH" w:bidi="th-TH"/>
-              </w:rPr>
-            </w:pPr>
             <w:r>
               <w:rPr>
                 <w:rFonts w:ascii="TH Sarabun New" w:hAnsi="TH Sarabun New" w:cs="TH Sarabun New"/>
@@ -1248,16 +1014,12 @@
         </w:tc>
         <w:tc>
           <w:tcPr>
-            <w:tcW w:type="dxa" w:w="2890"/>
+            <w:tcW w:type="dxa" w:w="1701"/>
             <w:shd w:fill="EBF5FB" w:val="clear"/>
           </w:tcPr>
           <w:p>
             <w:pPr>
               <w:jc w:val="center"/>
-              <w:rPr>
-                <w:noProof/>
-                <w:lang w:val="th-TH" w:bidi="th-TH"/>
-              </w:rPr>
             </w:pPr>
             <w:r>
               <w:rPr>
@@ -1267,22 +1029,18 @@
                 <w:szCs w:val="28"/>
                 <w:lang w:val="th-TH" w:bidi="th-TH" w:eastAsia="th-TH"/>
               </w:rPr>
-              <w:t>๓๐๖</w:t>
+              <w:t>๓๐๗</w:t>
             </w:r>
           </w:p>
         </w:tc>
         <w:tc>
           <w:tcPr>
-            <w:tcW w:type="dxa" w:w="2890"/>
+            <w:tcW w:type="dxa" w:w="1701"/>
             <w:shd w:fill="EBF5FB" w:val="clear"/>
           </w:tcPr>
           <w:p>
             <w:pPr>
               <w:jc w:val="center"/>
-              <w:rPr>
-                <w:noProof/>
-                <w:lang w:val="th-TH" w:bidi="th-TH"/>
-              </w:rPr>
             </w:pPr>
             <w:r>
               <w:rPr>
@@ -1292,7 +1050,7 @@
                 <w:szCs w:val="28"/>
                 <w:lang w:val="th-TH" w:bidi="th-TH" w:eastAsia="th-TH"/>
               </w:rPr>
-              <w:t>๓๐๙</w:t>
+              <w:t>๓๑๐</w:t>
             </w:r>
           </w:p>
         </w:tc>
@@ -1300,16 +1058,10 @@
       <w:tr>
         <w:tc>
           <w:tcPr>
-            <w:tcW w:type="dxa" w:w="2890"/>
+            <w:tcW w:type="dxa" w:w="5669"/>
             <w:shd w:fill="FFFFFF" w:val="clear"/>
           </w:tcPr>
           <w:p>
-            <w:pPr>
-              <w:rPr>
-                <w:noProof/>
-                <w:lang w:val="th-TH" w:bidi="th-TH"/>
-              </w:rPr>
-            </w:pPr>
             <w:r>
               <w:rPr>
                 <w:rFonts w:ascii="TH Sarabun New" w:hAnsi="TH Sarabun New" w:cs="TH Sarabun New"/>
@@ -1324,16 +1076,12 @@
         </w:tc>
         <w:tc>
           <w:tcPr>
-            <w:tcW w:type="dxa" w:w="2890"/>
+            <w:tcW w:type="dxa" w:w="1701"/>
             <w:shd w:fill="FFFFFF" w:val="clear"/>
           </w:tcPr>
           <w:p>
             <w:pPr>
               <w:jc w:val="center"/>
-              <w:rPr>
-                <w:noProof/>
-                <w:lang w:val="th-TH" w:bidi="th-TH"/>
-              </w:rPr>
             </w:pPr>
             <w:r>
               <w:rPr>
@@ -1343,22 +1091,18 @@
                 <w:szCs w:val="28"/>
                 <w:lang w:val="th-TH" w:bidi="th-TH" w:eastAsia="th-TH"/>
               </w:rPr>
-              <w:t>๓๑๐</w:t>
+              <w:t>๓๑๑</w:t>
             </w:r>
           </w:p>
         </w:tc>
         <w:tc>
           <w:tcPr>
-            <w:tcW w:type="dxa" w:w="2890"/>
+            <w:tcW w:type="dxa" w:w="1701"/>
             <w:shd w:fill="FFFFFF" w:val="clear"/>
           </w:tcPr>
           <w:p>
             <w:pPr>
               <w:jc w:val="center"/>
-              <w:rPr>
-                <w:noProof/>
-                <w:lang w:val="th-TH" w:bidi="th-TH"/>
-              </w:rPr>
             </w:pPr>
             <w:r>
               <w:rPr>
@@ -1368,7 +1112,7 @@
                 <w:szCs w:val="28"/>
                 <w:lang w:val="th-TH" w:bidi="th-TH" w:eastAsia="th-TH"/>
               </w:rPr>
-              <w:t>๓๓๖</w:t>
+              <w:t>๓๓๗</w:t>
             </w:r>
           </w:p>
         </w:tc>
@@ -1376,16 +1120,10 @@
       <w:tr>
         <w:tc>
           <w:tcPr>
-            <w:tcW w:type="dxa" w:w="2890"/>
+            <w:tcW w:type="dxa" w:w="5669"/>
             <w:shd w:fill="EBF5FB" w:val="clear"/>
           </w:tcPr>
           <w:p>
-            <w:pPr>
-              <w:rPr>
-                <w:noProof/>
-                <w:lang w:val="th-TH" w:bidi="th-TH"/>
-              </w:rPr>
-            </w:pPr>
             <w:r>
               <w:rPr>
                 <w:rFonts w:ascii="TH Sarabun New" w:hAnsi="TH Sarabun New" w:cs="TH Sarabun New"/>
@@ -1400,16 +1138,12 @@
         </w:tc>
         <w:tc>
           <w:tcPr>
-            <w:tcW w:type="dxa" w:w="2890"/>
+            <w:tcW w:type="dxa" w:w="1701"/>
             <w:shd w:fill="EBF5FB" w:val="clear"/>
           </w:tcPr>
           <w:p>
             <w:pPr>
               <w:jc w:val="center"/>
-              <w:rPr>
-                <w:noProof/>
-                <w:lang w:val="th-TH" w:bidi="th-TH"/>
-              </w:rPr>
             </w:pPr>
             <w:r>
               <w:rPr>
@@ -1419,22 +1153,18 @@
                 <w:szCs w:val="28"/>
                 <w:lang w:val="th-TH" w:bidi="th-TH" w:eastAsia="th-TH"/>
               </w:rPr>
-              <w:t>๓๓๗</w:t>
+              <w:t>๓๓๘</w:t>
             </w:r>
           </w:p>
         </w:tc>
         <w:tc>
           <w:tcPr>
-            <w:tcW w:type="dxa" w:w="2890"/>
+            <w:tcW w:type="dxa" w:w="1701"/>
             <w:shd w:fill="EBF5FB" w:val="clear"/>
           </w:tcPr>
           <w:p>
             <w:pPr>
               <w:jc w:val="center"/>
-              <w:rPr>
-                <w:noProof/>
-                <w:lang w:val="th-TH" w:bidi="th-TH"/>
-              </w:rPr>
             </w:pPr>
             <w:r>
               <w:rPr>
@@ -1444,7 +1174,7 @@
                 <w:szCs w:val="28"/>
                 <w:lang w:val="th-TH" w:bidi="th-TH" w:eastAsia="th-TH"/>
               </w:rPr>
-              <w:t>๓๕๙</w:t>
+              <w:t>๓๖๐</w:t>
             </w:r>
           </w:p>
         </w:tc>
@@ -1452,16 +1182,10 @@
       <w:tr>
         <w:tc>
           <w:tcPr>
-            <w:tcW w:type="dxa" w:w="2890"/>
+            <w:tcW w:type="dxa" w:w="5669"/>
             <w:shd w:fill="FFFFFF" w:val="clear"/>
           </w:tcPr>
           <w:p>
-            <w:pPr>
-              <w:rPr>
-                <w:noProof/>
-                <w:lang w:val="th-TH" w:bidi="th-TH"/>
-              </w:rPr>
-            </w:pPr>
             <w:r>
               <w:rPr>
                 <w:rFonts w:ascii="TH Sarabun New" w:hAnsi="TH Sarabun New" w:cs="TH Sarabun New"/>
@@ -1476,16 +1200,12 @@
         </w:tc>
         <w:tc>
           <w:tcPr>
-            <w:tcW w:type="dxa" w:w="2890"/>
+            <w:tcW w:type="dxa" w:w="1701"/>
             <w:shd w:fill="FFFFFF" w:val="clear"/>
           </w:tcPr>
           <w:p>
             <w:pPr>
               <w:jc w:val="center"/>
-              <w:rPr>
-                <w:noProof/>
-                <w:lang w:val="th-TH" w:bidi="th-TH"/>
-              </w:rPr>
             </w:pPr>
             <w:r>
               <w:rPr>
@@ -1495,22 +1215,18 @@
                 <w:szCs w:val="28"/>
                 <w:lang w:val="th-TH" w:bidi="th-TH" w:eastAsia="th-TH"/>
               </w:rPr>
-              <w:t>๓๖๐</w:t>
+              <w:t>๓๖๑</w:t>
             </w:r>
           </w:p>
         </w:tc>
         <w:tc>
           <w:tcPr>
-            <w:tcW w:type="dxa" w:w="2890"/>
+            <w:tcW w:type="dxa" w:w="1701"/>
             <w:shd w:fill="FFFFFF" w:val="clear"/>
           </w:tcPr>
           <w:p>
             <w:pPr>
               <w:jc w:val="center"/>
-              <w:rPr>
-                <w:noProof/>
-                <w:lang w:val="th-TH" w:bidi="th-TH"/>
-              </w:rPr>
             </w:pPr>
             <w:r>
               <w:rPr>
@@ -1520,7 +1236,7 @@
                 <w:szCs w:val="28"/>
                 <w:lang w:val="th-TH" w:bidi="th-TH" w:eastAsia="th-TH"/>
               </w:rPr>
-              <w:t>๓๙๙</w:t>
+              <w:t>๔๐๐</w:t>
             </w:r>
           </w:p>
         </w:tc>
@@ -1528,16 +1244,10 @@
       <w:tr>
         <w:tc>
           <w:tcPr>
-            <w:tcW w:type="dxa" w:w="2890"/>
+            <w:tcW w:type="dxa" w:w="5669"/>
             <w:shd w:fill="EBF5FB" w:val="clear"/>
           </w:tcPr>
           <w:p>
-            <w:pPr>
-              <w:rPr>
-                <w:noProof/>
-                <w:lang w:val="th-TH" w:bidi="th-TH"/>
-              </w:rPr>
-            </w:pPr>
             <w:r>
               <w:rPr>
                 <w:rFonts w:ascii="TH Sarabun New" w:hAnsi="TH Sarabun New" w:cs="TH Sarabun New"/>
@@ -1552,16 +1262,12 @@
         </w:tc>
         <w:tc>
           <w:tcPr>
-            <w:tcW w:type="dxa" w:w="2890"/>
+            <w:tcW w:type="dxa" w:w="1701"/>
             <w:shd w:fill="EBF5FB" w:val="clear"/>
           </w:tcPr>
           <w:p>
             <w:pPr>
               <w:jc w:val="center"/>
-              <w:rPr>
-                <w:noProof/>
-                <w:lang w:val="th-TH" w:bidi="th-TH"/>
-              </w:rPr>
             </w:pPr>
             <w:r>
               <w:rPr>
@@ -1571,22 +1277,18 @@
                 <w:szCs w:val="28"/>
                 <w:lang w:val="th-TH" w:bidi="th-TH" w:eastAsia="th-TH"/>
               </w:rPr>
-              <w:t>๔๐๐</w:t>
+              <w:t>๔๐๑</w:t>
             </w:r>
           </w:p>
         </w:tc>
         <w:tc>
           <w:tcPr>
-            <w:tcW w:type="dxa" w:w="2890"/>
+            <w:tcW w:type="dxa" w:w="1701"/>
             <w:shd w:fill="EBF5FB" w:val="clear"/>
           </w:tcPr>
           <w:p>
             <w:pPr>
               <w:jc w:val="center"/>
-              <w:rPr>
-                <w:noProof/>
-                <w:lang w:val="th-TH" w:bidi="th-TH"/>
-              </w:rPr>
             </w:pPr>
             <w:r>
               <w:rPr>
@@ -1596,7 +1298,7 @@
                 <w:szCs w:val="28"/>
                 <w:lang w:val="th-TH" w:bidi="th-TH" w:eastAsia="th-TH"/>
               </w:rPr>
-              <w:t>๔๓๙</w:t>
+              <w:t>๔๔๐</w:t>
             </w:r>
           </w:p>
         </w:tc>
@@ -1604,16 +1306,10 @@
       <w:tr>
         <w:tc>
           <w:tcPr>
-            <w:tcW w:type="dxa" w:w="2890"/>
+            <w:tcW w:type="dxa" w:w="5669"/>
             <w:shd w:fill="FFFFFF" w:val="clear"/>
           </w:tcPr>
           <w:p>
-            <w:pPr>
-              <w:rPr>
-                <w:noProof/>
-                <w:lang w:val="th-TH" w:bidi="th-TH"/>
-              </w:rPr>
-            </w:pPr>
             <w:r>
               <w:rPr>
                 <w:rFonts w:ascii="TH Sarabun New" w:hAnsi="TH Sarabun New" w:cs="TH Sarabun New"/>
@@ -1628,16 +1324,12 @@
         </w:tc>
         <w:tc>
           <w:tcPr>
-            <w:tcW w:type="dxa" w:w="2890"/>
+            <w:tcW w:type="dxa" w:w="1701"/>
             <w:shd w:fill="FFFFFF" w:val="clear"/>
           </w:tcPr>
           <w:p>
             <w:pPr>
               <w:jc w:val="center"/>
-              <w:rPr>
-                <w:noProof/>
-                <w:lang w:val="th-TH" w:bidi="th-TH"/>
-              </w:rPr>
             </w:pPr>
             <w:r>
               <w:rPr>
@@ -1647,22 +1339,18 @@
                 <w:szCs w:val="28"/>
                 <w:lang w:val="th-TH" w:bidi="th-TH" w:eastAsia="th-TH"/>
               </w:rPr>
-              <w:t>๔๔๐</w:t>
+              <w:t>๔๔๑</w:t>
             </w:r>
           </w:p>
         </w:tc>
         <w:tc>
           <w:tcPr>
-            <w:tcW w:type="dxa" w:w="2890"/>
+            <w:tcW w:type="dxa" w:w="1701"/>
             <w:shd w:fill="FFFFFF" w:val="clear"/>
           </w:tcPr>
           <w:p>
             <w:pPr>
               <w:jc w:val="center"/>
-              <w:rPr>
-                <w:noProof/>
-                <w:lang w:val="th-TH" w:bidi="th-TH"/>
-              </w:rPr>
             </w:pPr>
             <w:r>
               <w:rPr>
@@ -1672,7 +1360,7 @@
                 <w:szCs w:val="28"/>
                 <w:lang w:val="th-TH" w:bidi="th-TH" w:eastAsia="th-TH"/>
               </w:rPr>
-              <w:t>๔๗๙</w:t>
+              <w:t>๔๘๐</w:t>
             </w:r>
           </w:p>
         </w:tc>
@@ -1680,16 +1368,10 @@
       <w:tr>
         <w:tc>
           <w:tcPr>
-            <w:tcW w:type="dxa" w:w="2890"/>
+            <w:tcW w:type="dxa" w:w="5669"/>
             <w:shd w:fill="EBF5FB" w:val="clear"/>
           </w:tcPr>
           <w:p>
-            <w:pPr>
-              <w:rPr>
-                <w:noProof/>
-                <w:lang w:val="th-TH" w:bidi="th-TH"/>
-              </w:rPr>
-            </w:pPr>
             <w:r>
               <w:rPr>
                 <w:rFonts w:ascii="TH Sarabun New" w:hAnsi="TH Sarabun New" w:cs="TH Sarabun New"/>
@@ -1704,16 +1386,12 @@
         </w:tc>
         <w:tc>
           <w:tcPr>
-            <w:tcW w:type="dxa" w:w="2890"/>
+            <w:tcW w:type="dxa" w:w="1701"/>
             <w:shd w:fill="EBF5FB" w:val="clear"/>
           </w:tcPr>
           <w:p>
             <w:pPr>
               <w:jc w:val="center"/>
-              <w:rPr>
-                <w:noProof/>
-                <w:lang w:val="th-TH" w:bidi="th-TH"/>
-              </w:rPr>
             </w:pPr>
             <w:r>
               <w:rPr>
@@ -1723,22 +1401,18 @@
                 <w:szCs w:val="28"/>
                 <w:lang w:val="th-TH" w:bidi="th-TH" w:eastAsia="th-TH"/>
               </w:rPr>
-              <w:t>๔๘๐</w:t>
+              <w:t>๔๘๑</w:t>
             </w:r>
           </w:p>
         </w:tc>
         <w:tc>
           <w:tcPr>
-            <w:tcW w:type="dxa" w:w="2890"/>
+            <w:tcW w:type="dxa" w:w="1701"/>
             <w:shd w:fill="EBF5FB" w:val="clear"/>
           </w:tcPr>
           <w:p>
             <w:pPr>
               <w:jc w:val="center"/>
-              <w:rPr>
-                <w:noProof/>
-                <w:lang w:val="th-TH" w:bidi="th-TH"/>
-              </w:rPr>
             </w:pPr>
             <w:r>
               <w:rPr>
@@ -1748,7 +1422,7 @@
                 <w:szCs w:val="28"/>
                 <w:lang w:val="th-TH" w:bidi="th-TH" w:eastAsia="th-TH"/>
               </w:rPr>
-              <w:t>๕๑๙</w:t>
+              <w:t>๕๒๐</w:t>
             </w:r>
           </w:p>
         </w:tc>
@@ -1756,16 +1430,10 @@
       <w:tr>
         <w:tc>
           <w:tcPr>
-            <w:tcW w:type="dxa" w:w="2890"/>
+            <w:tcW w:type="dxa" w:w="5669"/>
             <w:shd w:fill="FFFFFF" w:val="clear"/>
           </w:tcPr>
           <w:p>
-            <w:pPr>
-              <w:rPr>
-                <w:noProof/>
-                <w:lang w:val="th-TH" w:bidi="th-TH"/>
-              </w:rPr>
-            </w:pPr>
             <w:r>
               <w:rPr>
                 <w:rFonts w:ascii="TH Sarabun New" w:hAnsi="TH Sarabun New" w:cs="TH Sarabun New"/>
@@ -1780,16 +1448,12 @@
         </w:tc>
         <w:tc>
           <w:tcPr>
-            <w:tcW w:type="dxa" w:w="2890"/>
+            <w:tcW w:type="dxa" w:w="1701"/>
             <w:shd w:fill="FFFFFF" w:val="clear"/>
           </w:tcPr>
           <w:p>
             <w:pPr>
               <w:jc w:val="center"/>
-              <w:rPr>
-                <w:noProof/>
-                <w:lang w:val="th-TH" w:bidi="th-TH"/>
-              </w:rPr>
             </w:pPr>
             <w:r>
               <w:rPr>
@@ -1799,22 +1463,18 @@
                 <w:szCs w:val="28"/>
                 <w:lang w:val="th-TH" w:bidi="th-TH" w:eastAsia="th-TH"/>
               </w:rPr>
-              <w:t>๕๒๐</w:t>
+              <w:t>๕๒๑</w:t>
             </w:r>
           </w:p>
         </w:tc>
         <w:tc>
           <w:tcPr>
-            <w:tcW w:type="dxa" w:w="2890"/>
+            <w:tcW w:type="dxa" w:w="1701"/>
             <w:shd w:fill="FFFFFF" w:val="clear"/>
           </w:tcPr>
           <w:p>
             <w:pPr>
               <w:jc w:val="center"/>
-              <w:rPr>
-                <w:noProof/>
-                <w:lang w:val="th-TH" w:bidi="th-TH"/>
-              </w:rPr>
             </w:pPr>
             <w:r>
               <w:rPr>
@@ -1824,7 +1484,7 @@
                 <w:szCs w:val="28"/>
                 <w:lang w:val="th-TH" w:bidi="th-TH" w:eastAsia="th-TH"/>
               </w:rPr>
-              <w:t>๕๕๙</w:t>
+              <w:t>๕๖๐</w:t>
             </w:r>
           </w:p>
         </w:tc>
@@ -1832,16 +1492,10 @@
       <w:tr>
         <w:tc>
           <w:tcPr>
-            <w:tcW w:type="dxa" w:w="2890"/>
+            <w:tcW w:type="dxa" w:w="5669"/>
             <w:shd w:fill="EBF5FB" w:val="clear"/>
           </w:tcPr>
           <w:p>
-            <w:pPr>
-              <w:rPr>
-                <w:noProof/>
-                <w:lang w:val="th-TH" w:bidi="th-TH"/>
-              </w:rPr>
-            </w:pPr>
             <w:r>
               <w:rPr>
                 <w:rFonts w:ascii="TH Sarabun New" w:hAnsi="TH Sarabun New" w:cs="TH Sarabun New"/>
@@ -1856,16 +1510,12 @@
         </w:tc>
         <w:tc>
           <w:tcPr>
-            <w:tcW w:type="dxa" w:w="2890"/>
+            <w:tcW w:type="dxa" w:w="1701"/>
             <w:shd w:fill="EBF5FB" w:val="clear"/>
           </w:tcPr>
           <w:p>
             <w:pPr>
               <w:jc w:val="center"/>
-              <w:rPr>
-                <w:noProof/>
-                <w:lang w:val="th-TH" w:bidi="th-TH"/>
-              </w:rPr>
             </w:pPr>
             <w:r>
               <w:rPr>
@@ -1875,22 +1525,18 @@
                 <w:szCs w:val="28"/>
                 <w:lang w:val="th-TH" w:bidi="th-TH" w:eastAsia="th-TH"/>
               </w:rPr>
-              <w:t>๕๖๐</w:t>
+              <w:t>๕๖๑</w:t>
             </w:r>
           </w:p>
         </w:tc>
         <w:tc>
           <w:tcPr>
-            <w:tcW w:type="dxa" w:w="2890"/>
+            <w:tcW w:type="dxa" w:w="1701"/>
             <w:shd w:fill="EBF5FB" w:val="clear"/>
           </w:tcPr>
           <w:p>
             <w:pPr>
               <w:jc w:val="center"/>
-              <w:rPr>
-                <w:noProof/>
-                <w:lang w:val="th-TH" w:bidi="th-TH"/>
-              </w:rPr>
             </w:pPr>
             <w:r>
               <w:rPr>
@@ -1900,7 +1546,7 @@
                 <w:szCs w:val="28"/>
                 <w:lang w:val="th-TH" w:bidi="th-TH" w:eastAsia="th-TH"/>
               </w:rPr>
-              <w:t>๕๙๙</w:t>
+              <w:t>๖๐๐</w:t>
             </w:r>
           </w:p>
         </w:tc>
@@ -1908,16 +1554,10 @@
       <w:tr>
         <w:tc>
           <w:tcPr>
-            <w:tcW w:type="dxa" w:w="2890"/>
+            <w:tcW w:type="dxa" w:w="5669"/>
             <w:shd w:fill="FFFFFF" w:val="clear"/>
           </w:tcPr>
           <w:p>
-            <w:pPr>
-              <w:rPr>
-                <w:noProof/>
-                <w:lang w:val="th-TH" w:bidi="th-TH"/>
-              </w:rPr>
-            </w:pPr>
             <w:r>
               <w:rPr>
                 <w:rFonts w:ascii="TH Sarabun New" w:hAnsi="TH Sarabun New" w:cs="TH Sarabun New"/>
@@ -1932,16 +1572,12 @@
         </w:tc>
         <w:tc>
           <w:tcPr>
-            <w:tcW w:type="dxa" w:w="2890"/>
+            <w:tcW w:type="dxa" w:w="1701"/>
             <w:shd w:fill="FFFFFF" w:val="clear"/>
           </w:tcPr>
           <w:p>
             <w:pPr>
               <w:jc w:val="center"/>
-              <w:rPr>
-                <w:noProof/>
-                <w:lang w:val="th-TH" w:bidi="th-TH"/>
-              </w:rPr>
             </w:pPr>
             <w:r>
               <w:rPr>
@@ -1951,22 +1587,18 @@
                 <w:szCs w:val="28"/>
                 <w:lang w:val="th-TH" w:bidi="th-TH" w:eastAsia="th-TH"/>
               </w:rPr>
-              <w:t>๖๐๐</w:t>
+              <w:t>๖๐๑</w:t>
             </w:r>
           </w:p>
         </w:tc>
         <w:tc>
           <w:tcPr>
-            <w:tcW w:type="dxa" w:w="2890"/>
+            <w:tcW w:type="dxa" w:w="1701"/>
             <w:shd w:fill="FFFFFF" w:val="clear"/>
           </w:tcPr>
           <w:p>
             <w:pPr>
               <w:jc w:val="center"/>
-              <w:rPr>
-                <w:noProof/>
-                <w:lang w:val="th-TH" w:bidi="th-TH"/>
-              </w:rPr>
             </w:pPr>
             <w:r>
               <w:rPr>
@@ -1976,7 +1608,7 @@
                 <w:szCs w:val="28"/>
                 <w:lang w:val="th-TH" w:bidi="th-TH" w:eastAsia="th-TH"/>
               </w:rPr>
-              <w:t>๖๓๙</w:t>
+              <w:t>๖๔๐</w:t>
             </w:r>
           </w:p>
         </w:tc>
@@ -1984,16 +1616,10 @@
       <w:tr>
         <w:tc>
           <w:tcPr>
-            <w:tcW w:type="dxa" w:w="2890"/>
+            <w:tcW w:type="dxa" w:w="5669"/>
             <w:shd w:fill="EBF5FB" w:val="clear"/>
           </w:tcPr>
           <w:p>
-            <w:pPr>
-              <w:rPr>
-                <w:noProof/>
-                <w:lang w:val="th-TH" w:bidi="th-TH"/>
-              </w:rPr>
-            </w:pPr>
             <w:r>
               <w:rPr>
                 <w:rFonts w:ascii="TH Sarabun New" w:hAnsi="TH Sarabun New" w:cs="TH Sarabun New"/>
@@ -2008,16 +1634,12 @@
         </w:tc>
         <w:tc>
           <w:tcPr>
-            <w:tcW w:type="dxa" w:w="2890"/>
+            <w:tcW w:type="dxa" w:w="1701"/>
             <w:shd w:fill="EBF5FB" w:val="clear"/>
           </w:tcPr>
           <w:p>
             <w:pPr>
               <w:jc w:val="center"/>
-              <w:rPr>
-                <w:noProof/>
-                <w:lang w:val="th-TH" w:bidi="th-TH"/>
-              </w:rPr>
             </w:pPr>
             <w:r>
               <w:rPr>
@@ -2027,22 +1649,18 @@
                 <w:szCs w:val="28"/>
                 <w:lang w:val="th-TH" w:bidi="th-TH" w:eastAsia="th-TH"/>
               </w:rPr>
-              <w:t>๖๔๐</w:t>
+              <w:t>๖๔๑</w:t>
             </w:r>
           </w:p>
         </w:tc>
         <w:tc>
           <w:tcPr>
-            <w:tcW w:type="dxa" w:w="2890"/>
+            <w:tcW w:type="dxa" w:w="1701"/>
             <w:shd w:fill="EBF5FB" w:val="clear"/>
           </w:tcPr>
           <w:p>
             <w:pPr>
               <w:jc w:val="center"/>
-              <w:rPr>
-                <w:noProof/>
-                <w:lang w:val="th-TH" w:bidi="th-TH"/>
-              </w:rPr>
             </w:pPr>
             <w:r>
               <w:rPr>
@@ -2052,7 +1670,7 @@
                 <w:szCs w:val="28"/>
                 <w:lang w:val="th-TH" w:bidi="th-TH" w:eastAsia="th-TH"/>
               </w:rPr>
-              <w:t>๖๗๙</w:t>
+              <w:t>๖๘๐</w:t>
             </w:r>
           </w:p>
         </w:tc>
@@ -2060,16 +1678,10 @@
       <w:tr>
         <w:tc>
           <w:tcPr>
-            <w:tcW w:type="dxa" w:w="2890"/>
+            <w:tcW w:type="dxa" w:w="5669"/>
             <w:shd w:fill="FFFFFF" w:val="clear"/>
           </w:tcPr>
           <w:p>
-            <w:pPr>
-              <w:rPr>
-                <w:noProof/>
-                <w:lang w:val="th-TH" w:bidi="th-TH"/>
-              </w:rPr>
-            </w:pPr>
             <w:r>
               <w:rPr>
                 <w:rFonts w:ascii="TH Sarabun New" w:hAnsi="TH Sarabun New" w:cs="TH Sarabun New"/>
@@ -2084,16 +1696,12 @@
         </w:tc>
         <w:tc>
           <w:tcPr>
-            <w:tcW w:type="dxa" w:w="2890"/>
+            <w:tcW w:type="dxa" w:w="1701"/>
             <w:shd w:fill="FFFFFF" w:val="clear"/>
           </w:tcPr>
           <w:p>
             <w:pPr>
               <w:jc w:val="center"/>
-              <w:rPr>
-                <w:noProof/>
-                <w:lang w:val="th-TH" w:bidi="th-TH"/>
-              </w:rPr>
             </w:pPr>
             <w:r>
               <w:rPr>
@@ -2103,22 +1711,18 @@
                 <w:szCs w:val="28"/>
                 <w:lang w:val="th-TH" w:bidi="th-TH" w:eastAsia="th-TH"/>
               </w:rPr>
-              <w:t>๖๘๐</w:t>
+              <w:t>๖๘๑</w:t>
             </w:r>
           </w:p>
         </w:tc>
         <w:tc>
           <w:tcPr>
-            <w:tcW w:type="dxa" w:w="2890"/>
+            <w:tcW w:type="dxa" w:w="1701"/>
             <w:shd w:fill="FFFFFF" w:val="clear"/>
           </w:tcPr>
           <w:p>
             <w:pPr>
               <w:jc w:val="center"/>
-              <w:rPr>
-                <w:noProof/>
-                <w:lang w:val="th-TH" w:bidi="th-TH"/>
-              </w:rPr>
             </w:pPr>
             <w:r>
               <w:rPr>
@@ -2128,7 +1732,7 @@
                 <w:szCs w:val="28"/>
                 <w:lang w:val="th-TH" w:bidi="th-TH" w:eastAsia="th-TH"/>
               </w:rPr>
-              <w:t>๗๑๙</w:t>
+              <w:t>๗๒๐</w:t>
             </w:r>
           </w:p>
         </w:tc>
@@ -2136,16 +1740,10 @@
       <w:tr>
         <w:tc>
           <w:tcPr>
-            <w:tcW w:type="dxa" w:w="2890"/>
+            <w:tcW w:type="dxa" w:w="5669"/>
             <w:shd w:fill="EBF5FB" w:val="clear"/>
           </w:tcPr>
           <w:p>
-            <w:pPr>
-              <w:rPr>
-                <w:noProof/>
-                <w:lang w:val="th-TH" w:bidi="th-TH"/>
-              </w:rPr>
-            </w:pPr>
             <w:r>
               <w:rPr>
                 <w:rFonts w:ascii="TH Sarabun New" w:hAnsi="TH Sarabun New" w:cs="TH Sarabun New"/>
@@ -2160,16 +1758,12 @@
         </w:tc>
         <w:tc>
           <w:tcPr>
-            <w:tcW w:type="dxa" w:w="2890"/>
+            <w:tcW w:type="dxa" w:w="1701"/>
             <w:shd w:fill="EBF5FB" w:val="clear"/>
           </w:tcPr>
           <w:p>
             <w:pPr>
               <w:jc w:val="center"/>
-              <w:rPr>
-                <w:noProof/>
-                <w:lang w:val="th-TH" w:bidi="th-TH"/>
-              </w:rPr>
             </w:pPr>
             <w:r>
               <w:rPr>
@@ -2179,22 +1773,18 @@
                 <w:szCs w:val="28"/>
                 <w:lang w:val="th-TH" w:bidi="th-TH" w:eastAsia="th-TH"/>
               </w:rPr>
-              <w:t>๗๒๐</w:t>
+              <w:t>๗๒๑</w:t>
             </w:r>
           </w:p>
         </w:tc>
         <w:tc>
           <w:tcPr>
-            <w:tcW w:type="dxa" w:w="2890"/>
+            <w:tcW w:type="dxa" w:w="1701"/>
             <w:shd w:fill="EBF5FB" w:val="clear"/>
           </w:tcPr>
           <w:p>
             <w:pPr>
               <w:jc w:val="center"/>
-              <w:rPr>
-                <w:noProof/>
-                <w:lang w:val="th-TH" w:bidi="th-TH"/>
-              </w:rPr>
             </w:pPr>
             <w:r>
               <w:rPr>
@@ -2204,7 +1794,7 @@
                 <w:szCs w:val="28"/>
                 <w:lang w:val="th-TH" w:bidi="th-TH" w:eastAsia="th-TH"/>
               </w:rPr>
-              <w:t>๗๕๙</w:t>
+              <w:t>๗๖๐</w:t>
             </w:r>
           </w:p>
         </w:tc>
@@ -2212,16 +1802,10 @@
       <w:tr>
         <w:tc>
           <w:tcPr>
-            <w:tcW w:type="dxa" w:w="2890"/>
+            <w:tcW w:type="dxa" w:w="5669"/>
             <w:shd w:fill="FFFFFF" w:val="clear"/>
           </w:tcPr>
           <w:p>
-            <w:pPr>
-              <w:rPr>
-                <w:noProof/>
-                <w:lang w:val="th-TH" w:bidi="th-TH"/>
-              </w:rPr>
-            </w:pPr>
             <w:r>
               <w:rPr>
                 <w:rFonts w:ascii="TH Sarabun New" w:hAnsi="TH Sarabun New" w:cs="TH Sarabun New"/>
@@ -2236,16 +1820,12 @@
         </w:tc>
         <w:tc>
           <w:tcPr>
-            <w:tcW w:type="dxa" w:w="2890"/>
+            <w:tcW w:type="dxa" w:w="1701"/>
             <w:shd w:fill="FFFFFF" w:val="clear"/>
           </w:tcPr>
           <w:p>
             <w:pPr>
               <w:jc w:val="center"/>
-              <w:rPr>
-                <w:noProof/>
-                <w:lang w:val="th-TH" w:bidi="th-TH"/>
-              </w:rPr>
             </w:pPr>
             <w:r>
               <w:rPr>
@@ -2255,22 +1835,18 @@
                 <w:szCs w:val="28"/>
                 <w:lang w:val="th-TH" w:bidi="th-TH" w:eastAsia="th-TH"/>
               </w:rPr>
-              <w:t>๗๖๐</w:t>
+              <w:t>๗๖๑</w:t>
             </w:r>
           </w:p>
         </w:tc>
         <w:tc>
           <w:tcPr>
-            <w:tcW w:type="dxa" w:w="2890"/>
+            <w:tcW w:type="dxa" w:w="1701"/>
             <w:shd w:fill="FFFFFF" w:val="clear"/>
           </w:tcPr>
           <w:p>
             <w:pPr>
               <w:jc w:val="center"/>
-              <w:rPr>
-                <w:noProof/>
-                <w:lang w:val="th-TH" w:bidi="th-TH"/>
-              </w:rPr>
             </w:pPr>
             <w:r>
               <w:rPr>
@@ -2280,7 +1856,7 @@
                 <w:szCs w:val="28"/>
                 <w:lang w:val="th-TH" w:bidi="th-TH" w:eastAsia="th-TH"/>
               </w:rPr>
-              <w:t>๗๙๙</w:t>
+              <w:t>๘๐๐</w:t>
             </w:r>
           </w:p>
         </w:tc>
@@ -2288,16 +1864,10 @@
       <w:tr>
         <w:tc>
           <w:tcPr>
-            <w:tcW w:type="dxa" w:w="2890"/>
+            <w:tcW w:type="dxa" w:w="5669"/>
             <w:shd w:fill="EBF5FB" w:val="clear"/>
           </w:tcPr>
           <w:p>
-            <w:pPr>
-              <w:rPr>
-                <w:noProof/>
-                <w:lang w:val="th-TH" w:bidi="th-TH"/>
-              </w:rPr>
-            </w:pPr>
             <w:r>
               <w:rPr>
                 <w:rFonts w:ascii="TH Sarabun New" w:hAnsi="TH Sarabun New" w:cs="TH Sarabun New"/>
@@ -2312,16 +1882,12 @@
         </w:tc>
         <w:tc>
           <w:tcPr>
-            <w:tcW w:type="dxa" w:w="2890"/>
+            <w:tcW w:type="dxa" w:w="1701"/>
             <w:shd w:fill="EBF5FB" w:val="clear"/>
           </w:tcPr>
           <w:p>
             <w:pPr>
               <w:jc w:val="center"/>
-              <w:rPr>
-                <w:noProof/>
-                <w:lang w:val="th-TH" w:bidi="th-TH"/>
-              </w:rPr>
             </w:pPr>
             <w:r>
               <w:rPr>
@@ -2331,22 +1897,18 @@
                 <w:szCs w:val="28"/>
                 <w:lang w:val="th-TH" w:bidi="th-TH" w:eastAsia="th-TH"/>
               </w:rPr>
-              <w:t>๘๐๐</w:t>
+              <w:t>๘๐๑</w:t>
             </w:r>
           </w:p>
         </w:tc>
         <w:tc>
           <w:tcPr>
-            <w:tcW w:type="dxa" w:w="2890"/>
+            <w:tcW w:type="dxa" w:w="1701"/>
             <w:shd w:fill="EBF5FB" w:val="clear"/>
           </w:tcPr>
           <w:p>
             <w:pPr>
               <w:jc w:val="center"/>
-              <w:rPr>
-                <w:noProof/>
-                <w:lang w:val="th-TH" w:bidi="th-TH"/>
-              </w:rPr>
             </w:pPr>
             <w:r>
               <w:rPr>
@@ -2356,7 +1918,7 @@
                 <w:szCs w:val="28"/>
                 <w:lang w:val="th-TH" w:bidi="th-TH" w:eastAsia="th-TH"/>
               </w:rPr>
-              <w:t>๘๓๙</w:t>
+              <w:t>๘๔๐</w:t>
             </w:r>
           </w:p>
         </w:tc>
@@ -2364,16 +1926,10 @@
       <w:tr>
         <w:tc>
           <w:tcPr>
-            <w:tcW w:type="dxa" w:w="2890"/>
+            <w:tcW w:type="dxa" w:w="5669"/>
             <w:shd w:fill="FFFFFF" w:val="clear"/>
           </w:tcPr>
           <w:p>
-            <w:pPr>
-              <w:rPr>
-                <w:noProof/>
-                <w:lang w:val="th-TH" w:bidi="th-TH"/>
-              </w:rPr>
-            </w:pPr>
             <w:r>
               <w:rPr>
                 <w:rFonts w:ascii="TH Sarabun New" w:hAnsi="TH Sarabun New" w:cs="TH Sarabun New"/>
@@ -2388,16 +1944,12 @@
         </w:tc>
         <w:tc>
           <w:tcPr>
-            <w:tcW w:type="dxa" w:w="2890"/>
+            <w:tcW w:type="dxa" w:w="1701"/>
             <w:shd w:fill="FFFFFF" w:val="clear"/>
           </w:tcPr>
           <w:p>
             <w:pPr>
               <w:jc w:val="center"/>
-              <w:rPr>
-                <w:noProof/>
-                <w:lang w:val="th-TH" w:bidi="th-TH"/>
-              </w:rPr>
             </w:pPr>
             <w:r>
               <w:rPr>
@@ -2407,22 +1959,18 @@
                 <w:szCs w:val="28"/>
                 <w:lang w:val="th-TH" w:bidi="th-TH" w:eastAsia="th-TH"/>
               </w:rPr>
-              <w:t>๘๔๐</w:t>
+              <w:t>๘๔๑</w:t>
             </w:r>
           </w:p>
         </w:tc>
         <w:tc>
           <w:tcPr>
-            <w:tcW w:type="dxa" w:w="2890"/>
+            <w:tcW w:type="dxa" w:w="1701"/>
             <w:shd w:fill="FFFFFF" w:val="clear"/>
           </w:tcPr>
           <w:p>
             <w:pPr>
               <w:jc w:val="center"/>
-              <w:rPr>
-                <w:noProof/>
-                <w:lang w:val="th-TH" w:bidi="th-TH"/>
-              </w:rPr>
             </w:pPr>
             <w:r>
               <w:rPr>
@@ -2432,7 +1980,7 @@
                 <w:szCs w:val="28"/>
                 <w:lang w:val="th-TH" w:bidi="th-TH" w:eastAsia="th-TH"/>
               </w:rPr>
-              <w:t>๘๗๘</w:t>
+              <w:t>๘๗๙</w:t>
             </w:r>
           </w:p>
         </w:tc>
@@ -2440,16 +1988,10 @@
       <w:tr>
         <w:tc>
           <w:tcPr>
-            <w:tcW w:type="dxa" w:w="2890"/>
+            <w:tcW w:type="dxa" w:w="5669"/>
             <w:shd w:fill="EBF5FB" w:val="clear"/>
           </w:tcPr>
           <w:p>
-            <w:pPr>
-              <w:rPr>
-                <w:noProof/>
-                <w:lang w:val="th-TH" w:bidi="th-TH"/>
-              </w:rPr>
-            </w:pPr>
             <w:r>
               <w:rPr>
                 <w:rFonts w:ascii="TH Sarabun New" w:hAnsi="TH Sarabun New" w:cs="TH Sarabun New"/>
@@ -2464,16 +2006,12 @@
         </w:tc>
         <w:tc>
           <w:tcPr>
-            <w:tcW w:type="dxa" w:w="2890"/>
+            <w:tcW w:type="dxa" w:w="1701"/>
             <w:shd w:fill="EBF5FB" w:val="clear"/>
           </w:tcPr>
           <w:p>
             <w:pPr>
               <w:jc w:val="center"/>
-              <w:rPr>
-                <w:noProof/>
-                <w:lang w:val="th-TH" w:bidi="th-TH"/>
-              </w:rPr>
             </w:pPr>
             <w:r>
               <w:rPr>
@@ -2483,22 +2021,18 @@
                 <w:szCs w:val="28"/>
                 <w:lang w:val="th-TH" w:bidi="th-TH" w:eastAsia="th-TH"/>
               </w:rPr>
-              <w:t>๘๗๙</w:t>
+              <w:t>๘๘๐</w:t>
             </w:r>
           </w:p>
         </w:tc>
         <w:tc>
           <w:tcPr>
-            <w:tcW w:type="dxa" w:w="2890"/>
+            <w:tcW w:type="dxa" w:w="1701"/>
             <w:shd w:fill="EBF5FB" w:val="clear"/>
           </w:tcPr>
           <w:p>
             <w:pPr>
               <w:jc w:val="center"/>
-              <w:rPr>
-                <w:noProof/>
-                <w:lang w:val="th-TH" w:bidi="th-TH"/>
-              </w:rPr>
             </w:pPr>
             <w:r>
               <w:rPr>
@@ -2508,7 +2042,7 @@
                 <w:szCs w:val="28"/>
                 <w:lang w:val="th-TH" w:bidi="th-TH" w:eastAsia="th-TH"/>
               </w:rPr>
-              <w:t>๙๑๗</w:t>
+              <w:t>๙๑๘</w:t>
             </w:r>
           </w:p>
         </w:tc>
@@ -2516,16 +2050,10 @@
       <w:tr>
         <w:tc>
           <w:tcPr>
-            <w:tcW w:type="dxa" w:w="2890"/>
+            <w:tcW w:type="dxa" w:w="5669"/>
             <w:shd w:fill="FFFFFF" w:val="clear"/>
           </w:tcPr>
           <w:p>
-            <w:pPr>
-              <w:rPr>
-                <w:noProof/>
-                <w:lang w:val="th-TH" w:bidi="th-TH"/>
-              </w:rPr>
-            </w:pPr>
             <w:r>
               <w:rPr>
                 <w:rFonts w:ascii="TH Sarabun New" w:hAnsi="TH Sarabun New" w:cs="TH Sarabun New"/>
@@ -2540,16 +2068,12 @@
         </w:tc>
         <w:tc>
           <w:tcPr>
-            <w:tcW w:type="dxa" w:w="2890"/>
+            <w:tcW w:type="dxa" w:w="1701"/>
             <w:shd w:fill="FFFFFF" w:val="clear"/>
           </w:tcPr>
           <w:p>
             <w:pPr>
               <w:jc w:val="center"/>
-              <w:rPr>
-                <w:noProof/>
-                <w:lang w:val="th-TH" w:bidi="th-TH"/>
-              </w:rPr>
             </w:pPr>
             <w:r>
               <w:rPr>
@@ -2559,22 +2083,18 @@
                 <w:szCs w:val="28"/>
                 <w:lang w:val="th-TH" w:bidi="th-TH" w:eastAsia="th-TH"/>
               </w:rPr>
-              <w:t>๙๑๘</w:t>
+              <w:t>๙๑๙</w:t>
             </w:r>
           </w:p>
         </w:tc>
         <w:tc>
           <w:tcPr>
-            <w:tcW w:type="dxa" w:w="2890"/>
+            <w:tcW w:type="dxa" w:w="1701"/>
             <w:shd w:fill="FFFFFF" w:val="clear"/>
           </w:tcPr>
           <w:p>
             <w:pPr>
               <w:jc w:val="center"/>
-              <w:rPr>
-                <w:noProof/>
-                <w:lang w:val="th-TH" w:bidi="th-TH"/>
-              </w:rPr>
             </w:pPr>
             <w:r>
               <w:rPr>
@@ -2584,7 +2104,7 @@
                 <w:szCs w:val="28"/>
                 <w:lang w:val="th-TH" w:bidi="th-TH" w:eastAsia="th-TH"/>
               </w:rPr>
-              <w:t>๙๕๖</w:t>
+              <w:t>๙๕๗</w:t>
             </w:r>
           </w:p>
         </w:tc>
@@ -2592,16 +2112,10 @@
       <w:tr>
         <w:tc>
           <w:tcPr>
-            <w:tcW w:type="dxa" w:w="2890"/>
+            <w:tcW w:type="dxa" w:w="5669"/>
             <w:shd w:fill="EBF5FB" w:val="clear"/>
           </w:tcPr>
           <w:p>
-            <w:pPr>
-              <w:rPr>
-                <w:noProof/>
-                <w:lang w:val="th-TH" w:bidi="th-TH"/>
-              </w:rPr>
-            </w:pPr>
             <w:r>
               <w:rPr>
                 <w:rFonts w:ascii="TH Sarabun New" w:hAnsi="TH Sarabun New" w:cs="TH Sarabun New"/>
@@ -2616,16 +2130,12 @@
         </w:tc>
         <w:tc>
           <w:tcPr>
-            <w:tcW w:type="dxa" w:w="2890"/>
+            <w:tcW w:type="dxa" w:w="1701"/>
             <w:shd w:fill="EBF5FB" w:val="clear"/>
           </w:tcPr>
           <w:p>
             <w:pPr>
               <w:jc w:val="center"/>
-              <w:rPr>
-                <w:noProof/>
-                <w:lang w:val="th-TH" w:bidi="th-TH"/>
-              </w:rPr>
             </w:pPr>
             <w:r>
               <w:rPr>
@@ -2635,22 +2145,18 @@
                 <w:szCs w:val="28"/>
                 <w:lang w:val="th-TH" w:bidi="th-TH" w:eastAsia="th-TH"/>
               </w:rPr>
-              <w:t>๙๕๗</w:t>
+              <w:t>๙๕๘</w:t>
             </w:r>
           </w:p>
         </w:tc>
         <w:tc>
           <w:tcPr>
-            <w:tcW w:type="dxa" w:w="2890"/>
+            <w:tcW w:type="dxa" w:w="1701"/>
             <w:shd w:fill="EBF5FB" w:val="clear"/>
           </w:tcPr>
           <w:p>
             <w:pPr>
               <w:jc w:val="center"/>
-              <w:rPr>
-                <w:noProof/>
-                <w:lang w:val="th-TH" w:bidi="th-TH"/>
-              </w:rPr>
             </w:pPr>
             <w:r>
               <w:rPr>
@@ -2660,7 +2166,7 @@
                 <w:szCs w:val="28"/>
                 <w:lang w:val="th-TH" w:bidi="th-TH" w:eastAsia="th-TH"/>
               </w:rPr>
-              <w:t>๙๙๕</w:t>
+              <w:t>๙๙๖</w:t>
             </w:r>
           </w:p>
         </w:tc>
@@ -2668,16 +2174,10 @@
       <w:tr>
         <w:tc>
           <w:tcPr>
-            <w:tcW w:type="dxa" w:w="2890"/>
+            <w:tcW w:type="dxa" w:w="5669"/>
             <w:shd w:fill="FFFFFF" w:val="clear"/>
           </w:tcPr>
           <w:p>
-            <w:pPr>
-              <w:rPr>
-                <w:noProof/>
-                <w:lang w:val="th-TH" w:bidi="th-TH"/>
-              </w:rPr>
-            </w:pPr>
             <w:r>
               <w:rPr>
                 <w:rFonts w:ascii="TH Sarabun New" w:hAnsi="TH Sarabun New" w:cs="TH Sarabun New"/>
@@ -2692,16 +2192,12 @@
         </w:tc>
         <w:tc>
           <w:tcPr>
-            <w:tcW w:type="dxa" w:w="2890"/>
+            <w:tcW w:type="dxa" w:w="1701"/>
             <w:shd w:fill="FFFFFF" w:val="clear"/>
           </w:tcPr>
           <w:p>
             <w:pPr>
               <w:jc w:val="center"/>
-              <w:rPr>
-                <w:noProof/>
-                <w:lang w:val="th-TH" w:bidi="th-TH"/>
-              </w:rPr>
             </w:pPr>
             <w:r>
               <w:rPr>
@@ -2711,22 +2207,18 @@
                 <w:szCs w:val="28"/>
                 <w:lang w:val="th-TH" w:bidi="th-TH" w:eastAsia="th-TH"/>
               </w:rPr>
-              <w:t>๙๙๖</w:t>
+              <w:t>๙๙๗</w:t>
             </w:r>
           </w:p>
         </w:tc>
         <w:tc>
           <w:tcPr>
-            <w:tcW w:type="dxa" w:w="2890"/>
+            <w:tcW w:type="dxa" w:w="1701"/>
             <w:shd w:fill="FFFFFF" w:val="clear"/>
           </w:tcPr>
           <w:p>
             <w:pPr>
               <w:jc w:val="center"/>
-              <w:rPr>
-                <w:noProof/>
-                <w:lang w:val="th-TH" w:bidi="th-TH"/>
-              </w:rPr>
             </w:pPr>
             <w:r>
               <w:rPr>
@@ -2736,7 +2228,7 @@
                 <w:szCs w:val="28"/>
                 <w:lang w:val="th-TH" w:bidi="th-TH" w:eastAsia="th-TH"/>
               </w:rPr>
-              <w:t>๑๐๓๔</w:t>
+              <w:t>๑๐๓๕</w:t>
             </w:r>
           </w:p>
         </w:tc>
@@ -2744,16 +2236,10 @@
       <w:tr>
         <w:tc>
           <w:tcPr>
-            <w:tcW w:type="dxa" w:w="2890"/>
+            <w:tcW w:type="dxa" w:w="5669"/>
             <w:shd w:fill="EBF5FB" w:val="clear"/>
           </w:tcPr>
           <w:p>
-            <w:pPr>
-              <w:rPr>
-                <w:noProof/>
-                <w:lang w:val="th-TH" w:bidi="th-TH"/>
-              </w:rPr>
-            </w:pPr>
             <w:r>
               <w:rPr>
                 <w:rFonts w:ascii="TH Sarabun New" w:hAnsi="TH Sarabun New" w:cs="TH Sarabun New"/>
@@ -2768,16 +2254,12 @@
         </w:tc>
         <w:tc>
           <w:tcPr>
-            <w:tcW w:type="dxa" w:w="2890"/>
+            <w:tcW w:type="dxa" w:w="1701"/>
             <w:shd w:fill="EBF5FB" w:val="clear"/>
           </w:tcPr>
           <w:p>
             <w:pPr>
               <w:jc w:val="center"/>
-              <w:rPr>
-                <w:noProof/>
-                <w:lang w:val="th-TH" w:bidi="th-TH"/>
-              </w:rPr>
             </w:pPr>
             <w:r>
               <w:rPr>
@@ -2787,22 +2269,18 @@
                 <w:szCs w:val="28"/>
                 <w:lang w:val="th-TH" w:bidi="th-TH" w:eastAsia="th-TH"/>
               </w:rPr>
-              <w:t>๑๐๓๕</w:t>
+              <w:t>๑๐๓๖</w:t>
             </w:r>
           </w:p>
         </w:tc>
         <w:tc>
           <w:tcPr>
-            <w:tcW w:type="dxa" w:w="2890"/>
+            <w:tcW w:type="dxa" w:w="1701"/>
             <w:shd w:fill="EBF5FB" w:val="clear"/>
           </w:tcPr>
           <w:p>
             <w:pPr>
               <w:jc w:val="center"/>
-              <w:rPr>
-                <w:noProof/>
-                <w:lang w:val="th-TH" w:bidi="th-TH"/>
-              </w:rPr>
             </w:pPr>
             <w:r>
               <w:rPr>
@@ -2812,7 +2290,7 @@
                 <w:szCs w:val="28"/>
                 <w:lang w:val="th-TH" w:bidi="th-TH" w:eastAsia="th-TH"/>
               </w:rPr>
-              <w:t>๑๐๗๓</w:t>
+              <w:t>๑๐๗๔</w:t>
             </w:r>
           </w:p>
         </w:tc>
@@ -2820,16 +2298,10 @@
       <w:tr>
         <w:tc>
           <w:tcPr>
-            <w:tcW w:type="dxa" w:w="2890"/>
+            <w:tcW w:type="dxa" w:w="5669"/>
             <w:shd w:fill="FFFFFF" w:val="clear"/>
           </w:tcPr>
           <w:p>
-            <w:pPr>
-              <w:rPr>
-                <w:noProof/>
-                <w:lang w:val="th-TH" w:bidi="th-TH"/>
-              </w:rPr>
-            </w:pPr>
             <w:r>
               <w:rPr>
                 <w:rFonts w:ascii="TH Sarabun New" w:hAnsi="TH Sarabun New" w:cs="TH Sarabun New"/>
@@ -2844,16 +2316,12 @@
         </w:tc>
         <w:tc>
           <w:tcPr>
-            <w:tcW w:type="dxa" w:w="2890"/>
+            <w:tcW w:type="dxa" w:w="1701"/>
             <w:shd w:fill="FFFFFF" w:val="clear"/>
           </w:tcPr>
           <w:p>
             <w:pPr>
               <w:jc w:val="center"/>
-              <w:rPr>
-                <w:noProof/>
-                <w:lang w:val="th-TH" w:bidi="th-TH"/>
-              </w:rPr>
             </w:pPr>
             <w:r>
               <w:rPr>
@@ -2863,22 +2331,18 @@
                 <w:szCs w:val="28"/>
                 <w:lang w:val="th-TH" w:bidi="th-TH" w:eastAsia="th-TH"/>
               </w:rPr>
-              <w:t>๑๐๗๔</w:t>
+              <w:t>๑๐๗๕</w:t>
             </w:r>
           </w:p>
         </w:tc>
         <w:tc>
           <w:tcPr>
-            <w:tcW w:type="dxa" w:w="2890"/>
+            <w:tcW w:type="dxa" w:w="1701"/>
             <w:shd w:fill="FFFFFF" w:val="clear"/>
           </w:tcPr>
           <w:p>
             <w:pPr>
               <w:jc w:val="center"/>
-              <w:rPr>
-                <w:noProof/>
-                <w:lang w:val="th-TH" w:bidi="th-TH"/>
-              </w:rPr>
             </w:pPr>
             <w:r>
               <w:rPr>
@@ -2888,7 +2352,7 @@
                 <w:szCs w:val="28"/>
                 <w:lang w:val="th-TH" w:bidi="th-TH" w:eastAsia="th-TH"/>
               </w:rPr>
-              <w:t>๑๑๑๒</w:t>
+              <w:t>๑๑๑๓</w:t>
             </w:r>
           </w:p>
         </w:tc>
@@ -2896,16 +2360,10 @@
       <w:tr>
         <w:tc>
           <w:tcPr>
-            <w:tcW w:type="dxa" w:w="2890"/>
+            <w:tcW w:type="dxa" w:w="5669"/>
             <w:shd w:fill="EBF5FB" w:val="clear"/>
           </w:tcPr>
           <w:p>
-            <w:pPr>
-              <w:rPr>
-                <w:noProof/>
-                <w:lang w:val="th-TH" w:bidi="th-TH"/>
-              </w:rPr>
-            </w:pPr>
             <w:r>
               <w:rPr>
                 <w:rFonts w:ascii="TH Sarabun New" w:hAnsi="TH Sarabun New" w:cs="TH Sarabun New"/>
@@ -2920,16 +2378,12 @@
         </w:tc>
         <w:tc>
           <w:tcPr>
-            <w:tcW w:type="dxa" w:w="2890"/>
+            <w:tcW w:type="dxa" w:w="1701"/>
             <w:shd w:fill="EBF5FB" w:val="clear"/>
           </w:tcPr>
           <w:p>
             <w:pPr>
               <w:jc w:val="center"/>
-              <w:rPr>
-                <w:noProof/>
-                <w:lang w:val="th-TH" w:bidi="th-TH"/>
-              </w:rPr>
             </w:pPr>
             <w:r>
               <w:rPr>
@@ -2939,73 +2393,18 @@
                 <w:szCs w:val="28"/>
                 <w:lang w:val="th-TH" w:bidi="th-TH" w:eastAsia="th-TH"/>
               </w:rPr>
-              <w:t>๑๑๑๓</w:t>
+              <w:t>๑๑๑๔</w:t>
             </w:r>
           </w:p>
         </w:tc>
         <w:tc>
           <w:tcPr>
-            <w:tcW w:type="dxa" w:w="2890"/>
+            <w:tcW w:type="dxa" w:w="1701"/>
             <w:shd w:fill="EBF5FB" w:val="clear"/>
           </w:tcPr>
           <w:p>
             <w:pPr>
               <w:jc w:val="center"/>
-              <w:rPr>
-                <w:noProof/>
-                <w:lang w:val="th-TH" w:bidi="th-TH"/>
-              </w:rPr>
-            </w:pPr>
-            <w:r>
-              <w:rPr>
-                <w:rFonts w:ascii="TH Sarabun New" w:hAnsi="TH Sarabun New" w:cs="TH Sarabun New"/>
-                <w:b w:val="0"/>
-                <w:sz w:val="28"/>
-                <w:szCs w:val="28"/>
-                <w:lang w:val="th-TH" w:bidi="th-TH" w:eastAsia="th-TH"/>
-              </w:rPr>
-              <w:t>๑๑๕๑</w:t>
-            </w:r>
-          </w:p>
-        </w:tc>
-      </w:tr>
-      <w:tr>
-        <w:tc>
-          <w:tcPr>
-            <w:tcW w:type="dxa" w:w="2890"/>
-            <w:shd w:fill="FFFFFF" w:val="clear"/>
-          </w:tcPr>
-          <w:p>
-            <w:pPr>
-              <w:rPr>
-                <w:noProof/>
-                <w:lang w:val="th-TH" w:bidi="th-TH"/>
-              </w:rPr>
-            </w:pPr>
-            <w:r>
-              <w:rPr>
-                <w:rFonts w:ascii="TH Sarabun New" w:hAnsi="TH Sarabun New" w:cs="TH Sarabun New"/>
-                <w:b w:val="0"/>
-                <w:sz w:val="28"/>
-                <w:szCs w:val="28"/>
-                <w:lang w:val="th-TH" w:bidi="th-TH" w:eastAsia="th-TH"/>
-              </w:rPr>
-              <w:t>หมวดพิเศษ : อำนาจสูงสุดพิทักษ์ประชาชน (The Supreme People's Power)</w:t>
-            </w:r>
-          </w:p>
-        </w:tc>
-        <w:tc>
-          <w:tcPr>
-            <w:tcW w:type="dxa" w:w="2890"/>
-            <w:shd w:fill="FFFFFF" w:val="clear"/>
-          </w:tcPr>
-          <w:p>
-            <w:pPr>
-              <w:jc w:val="center"/>
-              <w:rPr>
-                <w:noProof/>
-                <w:lang w:val="th-TH" w:bidi="th-TH"/>
-              </w:rPr>
             </w:pPr>
             <w:r>
               <w:rPr>
@@ -3019,18 +2418,34 @@
             </w:r>
           </w:p>
         </w:tc>
+      </w:tr>
+      <w:tr>
         <w:tc>
           <w:tcPr>
-            <w:tcW w:type="dxa" w:w="2890"/>
+            <w:tcW w:type="dxa" w:w="5669"/>
+            <w:shd w:fill="FFFFFF" w:val="clear"/>
+          </w:tcPr>
+          <w:p>
+            <w:r>
+              <w:rPr>
+                <w:rFonts w:ascii="TH Sarabun New" w:hAnsi="TH Sarabun New" w:cs="TH Sarabun New"/>
+                <w:b w:val="0"/>
+                <w:sz w:val="28"/>
+                <w:szCs w:val="28"/>
+                <w:lang w:val="th-TH" w:bidi="th-TH" w:eastAsia="th-TH"/>
+              </w:rPr>
+              <w:t>หมวดพิเศษ อำนาจสูงสุดพิทักษ์ประชาชน (The Supreme People's Power)</w:t>
+            </w:r>
+          </w:p>
+        </w:tc>
+        <w:tc>
+          <w:tcPr>
+            <w:tcW w:type="dxa" w:w="1701"/>
             <w:shd w:fill="FFFFFF" w:val="clear"/>
           </w:tcPr>
           <w:p>
             <w:pPr>
               <w:jc w:val="center"/>
-              <w:rPr>
-                <w:noProof/>
-                <w:lang w:val="th-TH" w:bidi="th-TH"/>
-              </w:rPr>
             </w:pPr>
             <w:r>
               <w:rPr>
@@ -3040,7 +2455,28 @@
                 <w:szCs w:val="28"/>
                 <w:lang w:val="th-TH" w:bidi="th-TH" w:eastAsia="th-TH"/>
               </w:rPr>
-              <w:t>๑๑๕๙</w:t>
+              <w:t>๑๑๕๓</w:t>
+            </w:r>
+          </w:p>
+        </w:tc>
+        <w:tc>
+          <w:tcPr>
+            <w:tcW w:type="dxa" w:w="1701"/>
+            <w:shd w:fill="FFFFFF" w:val="clear"/>
+          </w:tcPr>
+          <w:p>
+            <w:pPr>
+              <w:jc w:val="center"/>
+            </w:pPr>
+            <w:r>
+              <w:rPr>
+                <w:rFonts w:ascii="TH Sarabun New" w:hAnsi="TH Sarabun New" w:cs="TH Sarabun New"/>
+                <w:b w:val="0"/>
+                <w:sz w:val="28"/>
+                <w:szCs w:val="28"/>
+                <w:lang w:val="th-TH" w:bidi="th-TH" w:eastAsia="th-TH"/>
+              </w:rPr>
+              <w:t>๑๑๖๐</w:t>
             </w:r>
           </w:p>
         </w:tc>
@@ -3051,7 +2487,6 @@
         <w:spacing w:before="360"/>
         <w:rPr>
           <w:noProof/>
-          <w:lang w:val="th-TH" w:bidi="th-TH"/>
         </w:rPr>
       </w:pPr>
       <w:r>
@@ -3063,7 +2498,7 @@
           <w:bCs/>
           <w:lang w:val="th-TH" w:bidi="th-TH" w:eastAsia="th-TH"/>
         </w:rPr>
-        <w:t>รวมทั้งสิ้น ๓๘ หมวด  ๑๑๕๙ มาตรา</w:t>
+        <w:t>รวมทั้งสิ้น ๓๘ หมวด  ๑๑๖๐ มาตรา</w:t>
       </w:r>
     </w:p>
     <w:sectPr>
@@ -3084,10 +2519,6 @@
     <w:pPr>
       <w:pStyle w:val="Footer"/>
       <w:jc w:val="center"/>
-      <w:rPr>
-        <w:noProof/>
-        <w:lang w:val="th-TH" w:bidi="th-TH"/>
-      </w:rPr>
     </w:pPr>
     <w:r>
       <w:fldChar w:fldCharType="begin"/>
@@ -3108,10 +2539,6 @@
     <w:pPr>
       <w:pStyle w:val="Header"/>
       <w:jc w:val="center"/>
-      <w:rPr>
-        <w:noProof/>
-        <w:lang w:val="th-TH" w:bidi="th-TH"/>
-      </w:rPr>
     </w:pPr>
     <w:r>
       <w:rPr>
@@ -3339,10 +2766,10 @@
         <w:sz w:val="22"/>
         <w:szCs w:val="22"/>
         <w:lang w:val="en-US" w:eastAsia="en-US" w:bidi="ar-SA"/>
-        <w:lang w:val="th-TH" w:bidi="th-TH" w:eastAsia="th-TH"/>
         <w:rFonts w:ascii="TH Sarabun New" w:hAnsi="TH Sarabun New" w:cs="TH Sarabun New" w:eastAsia="TH Sarabun New"/>
         <w:sz w:val="32"/>
         <w:szCs w:val="32"/>
+        <w:lang w:val="th-TH" w:bidi="th-TH" w:eastAsia="th-TH"/>
       </w:rPr>
     </w:rPrDefault>
     <w:pPrDefault>
@@ -3494,10 +2921,12 @@
     <w:name w:val="Normal"/>
     <w:qFormat/>
     <w:rsid w:val="00FC693F"/>
+    <w:pPr>
+      <w:spacing w:before="0" w:after="60" w:line="276" w:lineRule="auto"/>
+    </w:pPr>
     <w:rPr>
       <w:rFonts w:ascii="TH Sarabun New" w:hAnsi="TH Sarabun New" w:cs="TH Sarabun New"/>
       <w:sz w:val="32"/>
-      <w:lang w:val="th-TH" w:bidi="th-TH" w:eastAsia="th-TH"/>
     </w:rPr>
   </w:style>
   <w:style w:type="paragraph" w:styleId="Header">

</xml_diff>

<commit_message>
Lay out the 2525 Word and PDF files properly
Word: named paragraph styles instead of per-run formatting (which also
wrote w:szCs/w:bCs out of schema order), single spacing, Thai distributed
alignment, chapter and part headings on outline levels, gazette header
with Thai page numbers, and every chapter on a new page.
PDF: every chapter on a new page and left-aligned text, since Chromium
can only justify Thai by stretching the spaces between words.

Co-Authored-By: Claude Opus 5.5 <noreply@anthropic.com>
Claude-Session: https://claude.ai/code/session_01U2SdPW1rHLhRKCXxNJ4pJp
</commit_message>
<xml_diff>
--- a/files/สารบัญรัฐธรรมนูญ.docx
+++ b/files/สารบัญรัฐธรรมนูญ.docx
@@ -4,41 +4,17 @@
   <w:body>
     <w:p>
       <w:pPr>
-        <w:spacing w:before="720" w:after="120"/>
-        <w:jc w:val="center"/>
-        <w:rPr>
-          <w:noProof/>
-        </w:rPr>
+        <w:pStyle w:val="สารบัญ"/>
       </w:pPr>
       <w:r>
-        <w:rPr>
-          <w:rFonts w:ascii="TH Sarabun New" w:hAnsi="TH Sarabun New" w:cs="TH Sarabun New"/>
-          <w:b/>
-          <w:sz w:val="48"/>
-          <w:szCs w:val="48"/>
-          <w:bCs/>
-          <w:lang w:val="th-TH" w:bidi="th-TH" w:eastAsia="th-TH"/>
-        </w:rPr>
         <w:t>สารบัญ</w:t>
       </w:r>
     </w:p>
     <w:p>
       <w:pPr>
-        <w:spacing w:after="480"/>
-        <w:jc w:val="center"/>
-        <w:rPr>
-          <w:noProof/>
-        </w:rPr>
+        <w:pStyle w:val="สารบัญ-ชื่อ"/>
       </w:pPr>
       <w:r>
-        <w:rPr>
-          <w:rFonts w:ascii="TH Sarabun New" w:hAnsi="TH Sarabun New" w:cs="TH Sarabun New"/>
-          <w:b/>
-          <w:sz w:val="36"/>
-          <w:szCs w:val="36"/>
-          <w:bCs/>
-          <w:lang w:val="th-TH" w:bidi="th-TH" w:eastAsia="th-TH"/>
-        </w:rPr>
         <w:t>รัฐธรรมนูญแห่งราชอาณาจักรไทย พุทธศักราช ๒๕๒๕</w:t>
       </w:r>
     </w:p>
@@ -46,2436 +22,1975 @@
       <w:tblPr>
         <w:tblStyle w:val="TableGrid"/>
         <w:tblW w:type="auto" w:w="0"/>
+        <w:jc w:val="center"/>
         <w:tblLayout w:type="fixed"/>
         <w:tblLook w:firstColumn="1" w:firstRow="1" w:lastColumn="0" w:lastRow="0" w:noHBand="0" w:noVBand="1" w:val="04A0"/>
       </w:tblPr>
       <w:tblGrid>
-        <w:gridCol w:w="5669"/>
-        <w:gridCol w:w="1701"/>
-        <w:gridCol w:w="1701"/>
+        <w:gridCol w:w="5443"/>
+        <w:gridCol w:w="1814"/>
+        <w:gridCol w:w="1814"/>
       </w:tblGrid>
       <w:tr>
+        <w:trPr>
+          <w:tblHeader/>
+        </w:trPr>
         <w:tc>
           <w:tcPr>
-            <w:tcW w:type="dxa" w:w="5669"/>
-            <w:shd w:fill="2C3E50" w:val="clear"/>
+            <w:tcW w:type="dxa" w:w="5443"/>
+            <w:shd w:val="clear" w:color="auto" w:fill="2C3E50"/>
+            <w:vAlign w:val="center"/>
           </w:tcPr>
           <w:p>
             <w:pPr>
-              <w:jc w:val="center"/>
+              <w:pStyle w:val="ตาราง-กลาง"/>
             </w:pPr>
             <w:r>
               <w:rPr>
-                <w:rFonts w:ascii="TH Sarabun New" w:hAnsi="TH Sarabun New" w:cs="TH Sarabun New"/>
                 <w:b/>
+                <w:bCs/>
                 <w:color w:val="FFFFFF"/>
-                <w:sz w:val="32"/>
-                <w:szCs w:val="32"/>
-                <w:bCs/>
-                <w:lang w:val="th-TH" w:bidi="th-TH" w:eastAsia="th-TH"/>
               </w:rPr>
-              <w:t>หมวด / รายการ</w:t>
+              <w:t>หมวด</w:t>
             </w:r>
           </w:p>
         </w:tc>
         <w:tc>
           <w:tcPr>
-            <w:tcW w:type="dxa" w:w="1701"/>
-            <w:shd w:fill="2C3E50" w:val="clear"/>
+            <w:tcW w:type="dxa" w:w="1814"/>
+            <w:shd w:val="clear" w:color="auto" w:fill="2C3E50"/>
+            <w:vAlign w:val="center"/>
           </w:tcPr>
           <w:p>
             <w:pPr>
-              <w:jc w:val="center"/>
+              <w:pStyle w:val="ตาราง-กลาง"/>
             </w:pPr>
             <w:r>
               <w:rPr>
-                <w:rFonts w:ascii="TH Sarabun New" w:hAnsi="TH Sarabun New" w:cs="TH Sarabun New"/>
                 <w:b/>
+                <w:bCs/>
                 <w:color w:val="FFFFFF"/>
-                <w:sz w:val="28"/>
-                <w:szCs w:val="28"/>
-                <w:bCs/>
-                <w:lang w:val="th-TH" w:bidi="th-TH" w:eastAsia="th-TH"/>
               </w:rPr>
-              <w:t>มาตราเริ่มต้น</w:t>
+              <w:t>มาตราแรก</w:t>
             </w:r>
           </w:p>
         </w:tc>
         <w:tc>
           <w:tcPr>
-            <w:tcW w:type="dxa" w:w="1701"/>
-            <w:shd w:fill="2C3E50" w:val="clear"/>
+            <w:tcW w:type="dxa" w:w="1814"/>
+            <w:shd w:val="clear" w:color="auto" w:fill="2C3E50"/>
+            <w:vAlign w:val="center"/>
           </w:tcPr>
           <w:p>
             <w:pPr>
-              <w:jc w:val="center"/>
+              <w:pStyle w:val="ตาราง-กลาง"/>
             </w:pPr>
             <w:r>
               <w:rPr>
-                <w:rFonts w:ascii="TH Sarabun New" w:hAnsi="TH Sarabun New" w:cs="TH Sarabun New"/>
                 <w:b/>
+                <w:bCs/>
                 <w:color w:val="FFFFFF"/>
-                <w:sz w:val="28"/>
-                <w:szCs w:val="28"/>
-                <w:bCs/>
-                <w:lang w:val="th-TH" w:bidi="th-TH" w:eastAsia="th-TH"/>
               </w:rPr>
-              <w:t>มาตราสุดท้าย</w:t>
+              <w:t>มาตราท้าย</w:t>
             </w:r>
           </w:p>
         </w:tc>
       </w:tr>
       <w:tr>
+        <w:trPr>
+          <w:cantSplit/>
+        </w:trPr>
         <w:tc>
           <w:tcPr>
-            <w:tcW w:type="dxa" w:w="5669"/>
-            <w:shd w:fill="EBF5FB" w:val="clear"/>
+            <w:tcW w:type="dxa" w:w="5443"/>
+            <w:shd w:val="clear" w:color="auto" w:fill="EBF5FB"/>
+            <w:vAlign w:val="center"/>
           </w:tcPr>
           <w:p>
+            <w:pPr>
+              <w:pStyle w:val="ตาราง"/>
+            </w:pPr>
             <w:r>
-              <w:rPr>
-                <w:rFonts w:ascii="TH Sarabun New" w:hAnsi="TH Sarabun New" w:cs="TH Sarabun New"/>
-                <w:b w:val="0"/>
-                <w:sz w:val="28"/>
-                <w:szCs w:val="28"/>
-                <w:lang w:val="th-TH" w:bidi="th-TH" w:eastAsia="th-TH"/>
-              </w:rPr>
               <w:t>หมวด ๑ บททั่วไป</w:t>
             </w:r>
           </w:p>
         </w:tc>
         <w:tc>
           <w:tcPr>
-            <w:tcW w:type="dxa" w:w="1701"/>
-            <w:shd w:fill="EBF5FB" w:val="clear"/>
+            <w:tcW w:type="dxa" w:w="1814"/>
+            <w:shd w:val="clear" w:color="auto" w:fill="EBF5FB"/>
+            <w:vAlign w:val="center"/>
           </w:tcPr>
           <w:p>
             <w:pPr>
-              <w:jc w:val="center"/>
+              <w:pStyle w:val="ตาราง-กลาง"/>
             </w:pPr>
             <w:r>
-              <w:rPr>
-                <w:rFonts w:ascii="TH Sarabun New" w:hAnsi="TH Sarabun New" w:cs="TH Sarabun New"/>
-                <w:b w:val="0"/>
-                <w:sz w:val="28"/>
-                <w:szCs w:val="28"/>
-                <w:lang w:val="th-TH" w:bidi="th-TH" w:eastAsia="th-TH"/>
-              </w:rPr>
               <w:t>๑</w:t>
             </w:r>
           </w:p>
         </w:tc>
         <w:tc>
           <w:tcPr>
-            <w:tcW w:type="dxa" w:w="1701"/>
-            <w:shd w:fill="EBF5FB" w:val="clear"/>
+            <w:tcW w:type="dxa" w:w="1814"/>
+            <w:shd w:val="clear" w:color="auto" w:fill="EBF5FB"/>
+            <w:vAlign w:val="center"/>
           </w:tcPr>
           <w:p>
             <w:pPr>
-              <w:jc w:val="center"/>
+              <w:pStyle w:val="ตาราง-กลาง"/>
             </w:pPr>
             <w:r>
-              <w:rPr>
-                <w:rFonts w:ascii="TH Sarabun New" w:hAnsi="TH Sarabun New" w:cs="TH Sarabun New"/>
-                <w:b w:val="0"/>
-                <w:sz w:val="28"/>
-                <w:szCs w:val="28"/>
-                <w:lang w:val="th-TH" w:bidi="th-TH" w:eastAsia="th-TH"/>
-              </w:rPr>
               <w:t>๗</w:t>
             </w:r>
           </w:p>
         </w:tc>
       </w:tr>
       <w:tr>
+        <w:trPr>
+          <w:cantSplit/>
+        </w:trPr>
         <w:tc>
           <w:tcPr>
-            <w:tcW w:type="dxa" w:w="5669"/>
-            <w:shd w:fill="FFFFFF" w:val="clear"/>
+            <w:tcW w:type="dxa" w:w="5443"/>
+            <w:shd w:val="clear" w:color="auto" w:fill="FFFFFF"/>
+            <w:vAlign w:val="center"/>
           </w:tcPr>
           <w:p>
+            <w:pPr>
+              <w:pStyle w:val="ตาราง"/>
+            </w:pPr>
             <w:r>
-              <w:rPr>
-                <w:rFonts w:ascii="TH Sarabun New" w:hAnsi="TH Sarabun New" w:cs="TH Sarabun New"/>
-                <w:b w:val="0"/>
-                <w:sz w:val="28"/>
-                <w:szCs w:val="28"/>
-                <w:lang w:val="th-TH" w:bidi="th-TH" w:eastAsia="th-TH"/>
-              </w:rPr>
               <w:t>หมวด ๒ พระมหากษัตริย์</w:t>
             </w:r>
           </w:p>
         </w:tc>
         <w:tc>
           <w:tcPr>
-            <w:tcW w:type="dxa" w:w="1701"/>
-            <w:shd w:fill="FFFFFF" w:val="clear"/>
+            <w:tcW w:type="dxa" w:w="1814"/>
+            <w:shd w:val="clear" w:color="auto" w:fill="FFFFFF"/>
+            <w:vAlign w:val="center"/>
           </w:tcPr>
           <w:p>
             <w:pPr>
-              <w:jc w:val="center"/>
+              <w:pStyle w:val="ตาราง-กลาง"/>
             </w:pPr>
             <w:r>
-              <w:rPr>
-                <w:rFonts w:ascii="TH Sarabun New" w:hAnsi="TH Sarabun New" w:cs="TH Sarabun New"/>
-                <w:b w:val="0"/>
-                <w:sz w:val="28"/>
-                <w:szCs w:val="28"/>
-                <w:lang w:val="th-TH" w:bidi="th-TH" w:eastAsia="th-TH"/>
-              </w:rPr>
               <w:t>๘</w:t>
             </w:r>
           </w:p>
         </w:tc>
         <w:tc>
           <w:tcPr>
-            <w:tcW w:type="dxa" w:w="1701"/>
-            <w:shd w:fill="FFFFFF" w:val="clear"/>
+            <w:tcW w:type="dxa" w:w="1814"/>
+            <w:shd w:val="clear" w:color="auto" w:fill="FFFFFF"/>
+            <w:vAlign w:val="center"/>
           </w:tcPr>
           <w:p>
             <w:pPr>
-              <w:jc w:val="center"/>
+              <w:pStyle w:val="ตาราง-กลาง"/>
             </w:pPr>
             <w:r>
-              <w:rPr>
-                <w:rFonts w:ascii="TH Sarabun New" w:hAnsi="TH Sarabun New" w:cs="TH Sarabun New"/>
-                <w:b w:val="0"/>
-                <w:sz w:val="28"/>
-                <w:szCs w:val="28"/>
-                <w:lang w:val="th-TH" w:bidi="th-TH" w:eastAsia="th-TH"/>
-              </w:rPr>
               <w:t>๒๕</w:t>
             </w:r>
           </w:p>
         </w:tc>
       </w:tr>
       <w:tr>
+        <w:trPr>
+          <w:cantSplit/>
+        </w:trPr>
         <w:tc>
           <w:tcPr>
-            <w:tcW w:type="dxa" w:w="5669"/>
-            <w:shd w:fill="EBF5FB" w:val="clear"/>
+            <w:tcW w:type="dxa" w:w="5443"/>
+            <w:shd w:val="clear" w:color="auto" w:fill="EBF5FB"/>
+            <w:vAlign w:val="center"/>
           </w:tcPr>
           <w:p>
+            <w:pPr>
+              <w:pStyle w:val="ตาราง"/>
+            </w:pPr>
             <w:r>
-              <w:rPr>
-                <w:rFonts w:ascii="TH Sarabun New" w:hAnsi="TH Sarabun New" w:cs="TH Sarabun New"/>
-                <w:b w:val="0"/>
-                <w:sz w:val="28"/>
-                <w:szCs w:val="28"/>
-                <w:lang w:val="th-TH" w:bidi="th-TH" w:eastAsia="th-TH"/>
-              </w:rPr>
               <w:t>หมวด ๓ สิทธิและเสรีภาพของชนชาวไทย</w:t>
             </w:r>
           </w:p>
         </w:tc>
         <w:tc>
           <w:tcPr>
-            <w:tcW w:type="dxa" w:w="1701"/>
-            <w:shd w:fill="EBF5FB" w:val="clear"/>
+            <w:tcW w:type="dxa" w:w="1814"/>
+            <w:shd w:val="clear" w:color="auto" w:fill="EBF5FB"/>
+            <w:vAlign w:val="center"/>
           </w:tcPr>
           <w:p>
             <w:pPr>
-              <w:jc w:val="center"/>
+              <w:pStyle w:val="ตาราง-กลาง"/>
             </w:pPr>
             <w:r>
-              <w:rPr>
-                <w:rFonts w:ascii="TH Sarabun New" w:hAnsi="TH Sarabun New" w:cs="TH Sarabun New"/>
-                <w:b w:val="0"/>
-                <w:sz w:val="28"/>
-                <w:szCs w:val="28"/>
-                <w:lang w:val="th-TH" w:bidi="th-TH" w:eastAsia="th-TH"/>
-              </w:rPr>
               <w:t>๒๖</w:t>
             </w:r>
           </w:p>
         </w:tc>
         <w:tc>
           <w:tcPr>
-            <w:tcW w:type="dxa" w:w="1701"/>
-            <w:shd w:fill="EBF5FB" w:val="clear"/>
+            <w:tcW w:type="dxa" w:w="1814"/>
+            <w:shd w:val="clear" w:color="auto" w:fill="EBF5FB"/>
+            <w:vAlign w:val="center"/>
           </w:tcPr>
           <w:p>
             <w:pPr>
-              <w:jc w:val="center"/>
+              <w:pStyle w:val="ตาราง-กลาง"/>
             </w:pPr>
             <w:r>
-              <w:rPr>
-                <w:rFonts w:ascii="TH Sarabun New" w:hAnsi="TH Sarabun New" w:cs="TH Sarabun New"/>
-                <w:b w:val="0"/>
-                <w:sz w:val="28"/>
-                <w:szCs w:val="28"/>
-                <w:lang w:val="th-TH" w:bidi="th-TH" w:eastAsia="th-TH"/>
-              </w:rPr>
               <w:t>๖๖</w:t>
             </w:r>
           </w:p>
         </w:tc>
       </w:tr>
       <w:tr>
+        <w:trPr>
+          <w:cantSplit/>
+        </w:trPr>
         <w:tc>
           <w:tcPr>
-            <w:tcW w:type="dxa" w:w="5669"/>
-            <w:shd w:fill="FFFFFF" w:val="clear"/>
+            <w:tcW w:type="dxa" w:w="5443"/>
+            <w:shd w:val="clear" w:color="auto" w:fill="FFFFFF"/>
+            <w:vAlign w:val="center"/>
           </w:tcPr>
           <w:p>
+            <w:pPr>
+              <w:pStyle w:val="ตาราง"/>
+            </w:pPr>
             <w:r>
-              <w:rPr>
-                <w:rFonts w:ascii="TH Sarabun New" w:hAnsi="TH Sarabun New" w:cs="TH Sarabun New"/>
-                <w:b w:val="0"/>
-                <w:sz w:val="28"/>
-                <w:szCs w:val="28"/>
-                <w:lang w:val="th-TH" w:bidi="th-TH" w:eastAsia="th-TH"/>
-              </w:rPr>
               <w:t>หมวด ๔ หน้าที่ของชนชาวไทย</w:t>
             </w:r>
           </w:p>
         </w:tc>
         <w:tc>
           <w:tcPr>
-            <w:tcW w:type="dxa" w:w="1701"/>
-            <w:shd w:fill="FFFFFF" w:val="clear"/>
+            <w:tcW w:type="dxa" w:w="1814"/>
+            <w:shd w:val="clear" w:color="auto" w:fill="FFFFFF"/>
+            <w:vAlign w:val="center"/>
           </w:tcPr>
           <w:p>
             <w:pPr>
-              <w:jc w:val="center"/>
+              <w:pStyle w:val="ตาราง-กลาง"/>
             </w:pPr>
             <w:r>
-              <w:rPr>
-                <w:rFonts w:ascii="TH Sarabun New" w:hAnsi="TH Sarabun New" w:cs="TH Sarabun New"/>
-                <w:b w:val="0"/>
-                <w:sz w:val="28"/>
-                <w:szCs w:val="28"/>
-                <w:lang w:val="th-TH" w:bidi="th-TH" w:eastAsia="th-TH"/>
-              </w:rPr>
               <w:t>๖๗</w:t>
             </w:r>
           </w:p>
         </w:tc>
         <w:tc>
           <w:tcPr>
-            <w:tcW w:type="dxa" w:w="1701"/>
-            <w:shd w:fill="FFFFFF" w:val="clear"/>
+            <w:tcW w:type="dxa" w:w="1814"/>
+            <w:shd w:val="clear" w:color="auto" w:fill="FFFFFF"/>
+            <w:vAlign w:val="center"/>
           </w:tcPr>
           <w:p>
             <w:pPr>
-              <w:jc w:val="center"/>
+              <w:pStyle w:val="ตาราง-กลาง"/>
             </w:pPr>
             <w:r>
-              <w:rPr>
-                <w:rFonts w:ascii="TH Sarabun New" w:hAnsi="TH Sarabun New" w:cs="TH Sarabun New"/>
-                <w:b w:val="0"/>
-                <w:sz w:val="28"/>
-                <w:szCs w:val="28"/>
-                <w:lang w:val="th-TH" w:bidi="th-TH" w:eastAsia="th-TH"/>
-              </w:rPr>
               <w:t>๗๑</w:t>
             </w:r>
           </w:p>
         </w:tc>
       </w:tr>
       <w:tr>
+        <w:trPr>
+          <w:cantSplit/>
+        </w:trPr>
         <w:tc>
           <w:tcPr>
-            <w:tcW w:type="dxa" w:w="5669"/>
-            <w:shd w:fill="EBF5FB" w:val="clear"/>
+            <w:tcW w:type="dxa" w:w="5443"/>
+            <w:shd w:val="clear" w:color="auto" w:fill="EBF5FB"/>
+            <w:vAlign w:val="center"/>
           </w:tcPr>
           <w:p>
+            <w:pPr>
+              <w:pStyle w:val="ตาราง"/>
+            </w:pPr>
             <w:r>
-              <w:rPr>
-                <w:rFonts w:ascii="TH Sarabun New" w:hAnsi="TH Sarabun New" w:cs="TH Sarabun New"/>
-                <w:b w:val="0"/>
-                <w:sz w:val="28"/>
-                <w:szCs w:val="28"/>
-                <w:lang w:val="th-TH" w:bidi="th-TH" w:eastAsia="th-TH"/>
-              </w:rPr>
               <w:t>หมวด ๕ แนวนโยบายพื้นฐานแห่งรัฐ</w:t>
             </w:r>
           </w:p>
         </w:tc>
         <w:tc>
           <w:tcPr>
-            <w:tcW w:type="dxa" w:w="1701"/>
-            <w:shd w:fill="EBF5FB" w:val="clear"/>
+            <w:tcW w:type="dxa" w:w="1814"/>
+            <w:shd w:val="clear" w:color="auto" w:fill="EBF5FB"/>
+            <w:vAlign w:val="center"/>
           </w:tcPr>
           <w:p>
             <w:pPr>
-              <w:jc w:val="center"/>
+              <w:pStyle w:val="ตาราง-กลาง"/>
             </w:pPr>
             <w:r>
-              <w:rPr>
-                <w:rFonts w:ascii="TH Sarabun New" w:hAnsi="TH Sarabun New" w:cs="TH Sarabun New"/>
-                <w:b w:val="0"/>
-                <w:sz w:val="28"/>
-                <w:szCs w:val="28"/>
-                <w:lang w:val="th-TH" w:bidi="th-TH" w:eastAsia="th-TH"/>
-              </w:rPr>
               <w:t>๗๒</w:t>
             </w:r>
           </w:p>
         </w:tc>
         <w:tc>
           <w:tcPr>
-            <w:tcW w:type="dxa" w:w="1701"/>
-            <w:shd w:fill="EBF5FB" w:val="clear"/>
+            <w:tcW w:type="dxa" w:w="1814"/>
+            <w:shd w:val="clear" w:color="auto" w:fill="EBF5FB"/>
+            <w:vAlign w:val="center"/>
           </w:tcPr>
           <w:p>
             <w:pPr>
-              <w:jc w:val="center"/>
+              <w:pStyle w:val="ตาราง-กลาง"/>
             </w:pPr>
             <w:r>
-              <w:rPr>
-                <w:rFonts w:ascii="TH Sarabun New" w:hAnsi="TH Sarabun New" w:cs="TH Sarabun New"/>
-                <w:b w:val="0"/>
-                <w:sz w:val="28"/>
-                <w:szCs w:val="28"/>
-                <w:lang w:val="th-TH" w:bidi="th-TH" w:eastAsia="th-TH"/>
-              </w:rPr>
               <w:t>๙๐</w:t>
             </w:r>
           </w:p>
         </w:tc>
       </w:tr>
       <w:tr>
+        <w:trPr>
+          <w:cantSplit/>
+        </w:trPr>
         <w:tc>
           <w:tcPr>
-            <w:tcW w:type="dxa" w:w="5669"/>
-            <w:shd w:fill="FFFFFF" w:val="clear"/>
+            <w:tcW w:type="dxa" w:w="5443"/>
+            <w:shd w:val="clear" w:color="auto" w:fill="FFFFFF"/>
+            <w:vAlign w:val="center"/>
           </w:tcPr>
           <w:p>
+            <w:pPr>
+              <w:pStyle w:val="ตาราง"/>
+            </w:pPr>
             <w:r>
-              <w:rPr>
-                <w:rFonts w:ascii="TH Sarabun New" w:hAnsi="TH Sarabun New" w:cs="TH Sarabun New"/>
-                <w:b w:val="0"/>
-                <w:sz w:val="28"/>
-                <w:szCs w:val="28"/>
-                <w:lang w:val="th-TH" w:bidi="th-TH" w:eastAsia="th-TH"/>
-              </w:rPr>
               <w:t>หมวด ๖ รัฐสภา</w:t>
             </w:r>
           </w:p>
         </w:tc>
         <w:tc>
           <w:tcPr>
-            <w:tcW w:type="dxa" w:w="1701"/>
-            <w:shd w:fill="FFFFFF" w:val="clear"/>
+            <w:tcW w:type="dxa" w:w="1814"/>
+            <w:shd w:val="clear" w:color="auto" w:fill="FFFFFF"/>
+            <w:vAlign w:val="center"/>
           </w:tcPr>
           <w:p>
             <w:pPr>
-              <w:jc w:val="center"/>
+              <w:pStyle w:val="ตาราง-กลาง"/>
             </w:pPr>
             <w:r>
-              <w:rPr>
-                <w:rFonts w:ascii="TH Sarabun New" w:hAnsi="TH Sarabun New" w:cs="TH Sarabun New"/>
-                <w:b w:val="0"/>
-                <w:sz w:val="28"/>
-                <w:szCs w:val="28"/>
-                <w:lang w:val="th-TH" w:bidi="th-TH" w:eastAsia="th-TH"/>
-              </w:rPr>
               <w:t>๙๑</w:t>
             </w:r>
           </w:p>
         </w:tc>
         <w:tc>
           <w:tcPr>
-            <w:tcW w:type="dxa" w:w="1701"/>
-            <w:shd w:fill="FFFFFF" w:val="clear"/>
+            <w:tcW w:type="dxa" w:w="1814"/>
+            <w:shd w:val="clear" w:color="auto" w:fill="FFFFFF"/>
+            <w:vAlign w:val="center"/>
           </w:tcPr>
           <w:p>
             <w:pPr>
-              <w:jc w:val="center"/>
+              <w:pStyle w:val="ตาราง-กลาง"/>
             </w:pPr>
             <w:r>
-              <w:rPr>
-                <w:rFonts w:ascii="TH Sarabun New" w:hAnsi="TH Sarabun New" w:cs="TH Sarabun New"/>
-                <w:b w:val="0"/>
-                <w:sz w:val="28"/>
-                <w:szCs w:val="28"/>
-                <w:lang w:val="th-TH" w:bidi="th-TH" w:eastAsia="th-TH"/>
-              </w:rPr>
               <w:t>๑๘๗</w:t>
             </w:r>
           </w:p>
         </w:tc>
       </w:tr>
       <w:tr>
+        <w:trPr>
+          <w:cantSplit/>
+        </w:trPr>
         <w:tc>
           <w:tcPr>
-            <w:tcW w:type="dxa" w:w="5669"/>
-            <w:shd w:fill="EBF5FB" w:val="clear"/>
+            <w:tcW w:type="dxa" w:w="5443"/>
+            <w:shd w:val="clear" w:color="auto" w:fill="EBF5FB"/>
+            <w:vAlign w:val="center"/>
           </w:tcPr>
           <w:p>
+            <w:pPr>
+              <w:pStyle w:val="ตาราง"/>
+            </w:pPr>
             <w:r>
-              <w:rPr>
-                <w:rFonts w:ascii="TH Sarabun New" w:hAnsi="TH Sarabun New" w:cs="TH Sarabun New"/>
-                <w:b w:val="0"/>
-                <w:sz w:val="28"/>
-                <w:szCs w:val="28"/>
-                <w:lang w:val="th-TH" w:bidi="th-TH" w:eastAsia="th-TH"/>
-              </w:rPr>
               <w:t>หมวด ๗ คณะรัฐมนตรี</w:t>
             </w:r>
           </w:p>
         </w:tc>
         <w:tc>
           <w:tcPr>
-            <w:tcW w:type="dxa" w:w="1701"/>
-            <w:shd w:fill="EBF5FB" w:val="clear"/>
+            <w:tcW w:type="dxa" w:w="1814"/>
+            <w:shd w:val="clear" w:color="auto" w:fill="EBF5FB"/>
+            <w:vAlign w:val="center"/>
           </w:tcPr>
           <w:p>
             <w:pPr>
-              <w:jc w:val="center"/>
+              <w:pStyle w:val="ตาราง-กลาง"/>
             </w:pPr>
             <w:r>
-              <w:rPr>
-                <w:rFonts w:ascii="TH Sarabun New" w:hAnsi="TH Sarabun New" w:cs="TH Sarabun New"/>
-                <w:b w:val="0"/>
-                <w:sz w:val="28"/>
-                <w:szCs w:val="28"/>
-                <w:lang w:val="th-TH" w:bidi="th-TH" w:eastAsia="th-TH"/>
-              </w:rPr>
               <w:t>๑๘๘</w:t>
             </w:r>
           </w:p>
         </w:tc>
         <w:tc>
           <w:tcPr>
-            <w:tcW w:type="dxa" w:w="1701"/>
-            <w:shd w:fill="EBF5FB" w:val="clear"/>
+            <w:tcW w:type="dxa" w:w="1814"/>
+            <w:shd w:val="clear" w:color="auto" w:fill="EBF5FB"/>
+            <w:vAlign w:val="center"/>
           </w:tcPr>
           <w:p>
             <w:pPr>
-              <w:jc w:val="center"/>
+              <w:pStyle w:val="ตาราง-กลาง"/>
             </w:pPr>
             <w:r>
-              <w:rPr>
-                <w:rFonts w:ascii="TH Sarabun New" w:hAnsi="TH Sarabun New" w:cs="TH Sarabun New"/>
-                <w:b w:val="0"/>
-                <w:sz w:val="28"/>
-                <w:szCs w:val="28"/>
-                <w:lang w:val="th-TH" w:bidi="th-TH" w:eastAsia="th-TH"/>
-              </w:rPr>
               <w:t>๒๑๙</w:t>
             </w:r>
           </w:p>
         </w:tc>
       </w:tr>
       <w:tr>
+        <w:trPr>
+          <w:cantSplit/>
+        </w:trPr>
         <w:tc>
           <w:tcPr>
-            <w:tcW w:type="dxa" w:w="5669"/>
-            <w:shd w:fill="FFFFFF" w:val="clear"/>
+            <w:tcW w:type="dxa" w:w="5443"/>
+            <w:shd w:val="clear" w:color="auto" w:fill="FFFFFF"/>
+            <w:vAlign w:val="center"/>
           </w:tcPr>
           <w:p>
+            <w:pPr>
+              <w:pStyle w:val="ตาราง"/>
+            </w:pPr>
             <w:r>
-              <w:rPr>
-                <w:rFonts w:ascii="TH Sarabun New" w:hAnsi="TH Sarabun New" w:cs="TH Sarabun New"/>
-                <w:b w:val="0"/>
-                <w:sz w:val="28"/>
-                <w:szCs w:val="28"/>
-                <w:lang w:val="th-TH" w:bidi="th-TH" w:eastAsia="th-TH"/>
-              </w:rPr>
               <w:t>หมวด ๘ ศาล</w:t>
             </w:r>
           </w:p>
         </w:tc>
         <w:tc>
           <w:tcPr>
-            <w:tcW w:type="dxa" w:w="1701"/>
-            <w:shd w:fill="FFFFFF" w:val="clear"/>
+            <w:tcW w:type="dxa" w:w="1814"/>
+            <w:shd w:val="clear" w:color="auto" w:fill="FFFFFF"/>
+            <w:vAlign w:val="center"/>
           </w:tcPr>
           <w:p>
             <w:pPr>
-              <w:jc w:val="center"/>
+              <w:pStyle w:val="ตาราง-กลาง"/>
             </w:pPr>
             <w:r>
-              <w:rPr>
-                <w:rFonts w:ascii="TH Sarabun New" w:hAnsi="TH Sarabun New" w:cs="TH Sarabun New"/>
-                <w:b w:val="0"/>
-                <w:sz w:val="28"/>
-                <w:szCs w:val="28"/>
-                <w:lang w:val="th-TH" w:bidi="th-TH" w:eastAsia="th-TH"/>
-              </w:rPr>
               <w:t>๒๒๐</w:t>
             </w:r>
           </w:p>
         </w:tc>
         <w:tc>
           <w:tcPr>
-            <w:tcW w:type="dxa" w:w="1701"/>
-            <w:shd w:fill="FFFFFF" w:val="clear"/>
+            <w:tcW w:type="dxa" w:w="1814"/>
+            <w:shd w:val="clear" w:color="auto" w:fill="FFFFFF"/>
+            <w:vAlign w:val="center"/>
           </w:tcPr>
           <w:p>
             <w:pPr>
-              <w:jc w:val="center"/>
+              <w:pStyle w:val="ตาราง-กลาง"/>
             </w:pPr>
             <w:r>
-              <w:rPr>
-                <w:rFonts w:ascii="TH Sarabun New" w:hAnsi="TH Sarabun New" w:cs="TH Sarabun New"/>
-                <w:b w:val="0"/>
-                <w:sz w:val="28"/>
-                <w:szCs w:val="28"/>
-                <w:lang w:val="th-TH" w:bidi="th-TH" w:eastAsia="th-TH"/>
-              </w:rPr>
               <w:t>๒๖๘</w:t>
             </w:r>
           </w:p>
         </w:tc>
       </w:tr>
       <w:tr>
+        <w:trPr>
+          <w:cantSplit/>
+        </w:trPr>
         <w:tc>
           <w:tcPr>
-            <w:tcW w:type="dxa" w:w="5669"/>
-            <w:shd w:fill="EBF5FB" w:val="clear"/>
+            <w:tcW w:type="dxa" w:w="5443"/>
+            <w:shd w:val="clear" w:color="auto" w:fill="EBF5FB"/>
+            <w:vAlign w:val="center"/>
           </w:tcPr>
           <w:p>
+            <w:pPr>
+              <w:pStyle w:val="ตาราง"/>
+            </w:pPr>
             <w:r>
-              <w:rPr>
-                <w:rFonts w:ascii="TH Sarabun New" w:hAnsi="TH Sarabun New" w:cs="TH Sarabun New"/>
-                <w:b w:val="0"/>
-                <w:sz w:val="28"/>
-                <w:szCs w:val="28"/>
-                <w:lang w:val="th-TH" w:bidi="th-TH" w:eastAsia="th-TH"/>
-              </w:rPr>
               <w:t>หมวด ๙ การปกครองส่วนท้องถิ่น</w:t>
             </w:r>
           </w:p>
         </w:tc>
         <w:tc>
           <w:tcPr>
-            <w:tcW w:type="dxa" w:w="1701"/>
-            <w:shd w:fill="EBF5FB" w:val="clear"/>
+            <w:tcW w:type="dxa" w:w="1814"/>
+            <w:shd w:val="clear" w:color="auto" w:fill="EBF5FB"/>
+            <w:vAlign w:val="center"/>
           </w:tcPr>
           <w:p>
             <w:pPr>
-              <w:jc w:val="center"/>
+              <w:pStyle w:val="ตาราง-กลาง"/>
             </w:pPr>
             <w:r>
-              <w:rPr>
-                <w:rFonts w:ascii="TH Sarabun New" w:hAnsi="TH Sarabun New" w:cs="TH Sarabun New"/>
-                <w:b w:val="0"/>
-                <w:sz w:val="28"/>
-                <w:szCs w:val="28"/>
-                <w:lang w:val="th-TH" w:bidi="th-TH" w:eastAsia="th-TH"/>
-              </w:rPr>
               <w:t>๒๖๙</w:t>
             </w:r>
           </w:p>
         </w:tc>
         <w:tc>
           <w:tcPr>
-            <w:tcW w:type="dxa" w:w="1701"/>
-            <w:shd w:fill="EBF5FB" w:val="clear"/>
+            <w:tcW w:type="dxa" w:w="1814"/>
+            <w:shd w:val="clear" w:color="auto" w:fill="EBF5FB"/>
+            <w:vAlign w:val="center"/>
           </w:tcPr>
           <w:p>
             <w:pPr>
-              <w:jc w:val="center"/>
+              <w:pStyle w:val="ตาราง-กลาง"/>
             </w:pPr>
             <w:r>
-              <w:rPr>
-                <w:rFonts w:ascii="TH Sarabun New" w:hAnsi="TH Sarabun New" w:cs="TH Sarabun New"/>
-                <w:b w:val="0"/>
-                <w:sz w:val="28"/>
-                <w:szCs w:val="28"/>
-                <w:lang w:val="th-TH" w:bidi="th-TH" w:eastAsia="th-TH"/>
-              </w:rPr>
               <w:t>๒๗๗</w:t>
             </w:r>
           </w:p>
         </w:tc>
       </w:tr>
       <w:tr>
+        <w:trPr>
+          <w:cantSplit/>
+        </w:trPr>
         <w:tc>
           <w:tcPr>
-            <w:tcW w:type="dxa" w:w="5669"/>
-            <w:shd w:fill="FFFFFF" w:val="clear"/>
+            <w:tcW w:type="dxa" w:w="5443"/>
+            <w:shd w:val="clear" w:color="auto" w:fill="FFFFFF"/>
+            <w:vAlign w:val="center"/>
           </w:tcPr>
           <w:p>
+            <w:pPr>
+              <w:pStyle w:val="ตาราง"/>
+            </w:pPr>
             <w:r>
-              <w:rPr>
-                <w:rFonts w:ascii="TH Sarabun New" w:hAnsi="TH Sarabun New" w:cs="TH Sarabun New"/>
-                <w:b w:val="0"/>
-                <w:sz w:val="28"/>
-                <w:szCs w:val="28"/>
-                <w:lang w:val="th-TH" w:bidi="th-TH" w:eastAsia="th-TH"/>
-              </w:rPr>
               <w:t>หมวด ๑๐ การตรวจสอบการใช้อำนาจรัฐ</w:t>
             </w:r>
           </w:p>
         </w:tc>
         <w:tc>
           <w:tcPr>
-            <w:tcW w:type="dxa" w:w="1701"/>
-            <w:shd w:fill="FFFFFF" w:val="clear"/>
+            <w:tcW w:type="dxa" w:w="1814"/>
+            <w:shd w:val="clear" w:color="auto" w:fill="FFFFFF"/>
+            <w:vAlign w:val="center"/>
           </w:tcPr>
           <w:p>
             <w:pPr>
-              <w:jc w:val="center"/>
+              <w:pStyle w:val="ตาราง-กลาง"/>
             </w:pPr>
             <w:r>
-              <w:rPr>
-                <w:rFonts w:ascii="TH Sarabun New" w:hAnsi="TH Sarabun New" w:cs="TH Sarabun New"/>
-                <w:b w:val="0"/>
-                <w:sz w:val="28"/>
-                <w:szCs w:val="28"/>
-                <w:lang w:val="th-TH" w:bidi="th-TH" w:eastAsia="th-TH"/>
-              </w:rPr>
               <w:t>๒๗๘</w:t>
             </w:r>
           </w:p>
         </w:tc>
         <w:tc>
           <w:tcPr>
-            <w:tcW w:type="dxa" w:w="1701"/>
-            <w:shd w:fill="FFFFFF" w:val="clear"/>
+            <w:tcW w:type="dxa" w:w="1814"/>
+            <w:shd w:val="clear" w:color="auto" w:fill="FFFFFF"/>
+            <w:vAlign w:val="center"/>
           </w:tcPr>
           <w:p>
             <w:pPr>
-              <w:jc w:val="center"/>
+              <w:pStyle w:val="ตาราง-กลาง"/>
             </w:pPr>
             <w:r>
-              <w:rPr>
-                <w:rFonts w:ascii="TH Sarabun New" w:hAnsi="TH Sarabun New" w:cs="TH Sarabun New"/>
-                <w:b w:val="0"/>
-                <w:sz w:val="28"/>
-                <w:szCs w:val="28"/>
-                <w:lang w:val="th-TH" w:bidi="th-TH" w:eastAsia="th-TH"/>
-              </w:rPr>
               <w:t>๒๙๓</w:t>
             </w:r>
           </w:p>
         </w:tc>
       </w:tr>
       <w:tr>
+        <w:trPr>
+          <w:cantSplit/>
+        </w:trPr>
         <w:tc>
           <w:tcPr>
-            <w:tcW w:type="dxa" w:w="5669"/>
-            <w:shd w:fill="EBF5FB" w:val="clear"/>
+            <w:tcW w:type="dxa" w:w="5443"/>
+            <w:shd w:val="clear" w:color="auto" w:fill="EBF5FB"/>
+            <w:vAlign w:val="center"/>
           </w:tcPr>
           <w:p>
+            <w:pPr>
+              <w:pStyle w:val="ตาราง"/>
+            </w:pPr>
             <w:r>
-              <w:rPr>
-                <w:rFonts w:ascii="TH Sarabun New" w:hAnsi="TH Sarabun New" w:cs="TH Sarabun New"/>
-                <w:b w:val="0"/>
-                <w:sz w:val="28"/>
-                <w:szCs w:val="28"/>
-                <w:lang w:val="th-TH" w:bidi="th-TH" w:eastAsia="th-TH"/>
-              </w:rPr>
               <w:t>หมวด ๑๑ การตรวจเงินแผ่นดิน</w:t>
             </w:r>
           </w:p>
         </w:tc>
         <w:tc>
           <w:tcPr>
-            <w:tcW w:type="dxa" w:w="1701"/>
-            <w:shd w:fill="EBF5FB" w:val="clear"/>
+            <w:tcW w:type="dxa" w:w="1814"/>
+            <w:shd w:val="clear" w:color="auto" w:fill="EBF5FB"/>
+            <w:vAlign w:val="center"/>
           </w:tcPr>
           <w:p>
             <w:pPr>
-              <w:jc w:val="center"/>
+              <w:pStyle w:val="ตาราง-กลาง"/>
             </w:pPr>
             <w:r>
-              <w:rPr>
-                <w:rFonts w:ascii="TH Sarabun New" w:hAnsi="TH Sarabun New" w:cs="TH Sarabun New"/>
-                <w:b w:val="0"/>
-                <w:sz w:val="28"/>
-                <w:szCs w:val="28"/>
-                <w:lang w:val="th-TH" w:bidi="th-TH" w:eastAsia="th-TH"/>
-              </w:rPr>
               <w:t>๒๙๔</w:t>
             </w:r>
           </w:p>
         </w:tc>
         <w:tc>
           <w:tcPr>
-            <w:tcW w:type="dxa" w:w="1701"/>
-            <w:shd w:fill="EBF5FB" w:val="clear"/>
+            <w:tcW w:type="dxa" w:w="1814"/>
+            <w:shd w:val="clear" w:color="auto" w:fill="EBF5FB"/>
+            <w:vAlign w:val="center"/>
           </w:tcPr>
           <w:p>
             <w:pPr>
-              <w:jc w:val="center"/>
+              <w:pStyle w:val="ตาราง-กลาง"/>
             </w:pPr>
             <w:r>
-              <w:rPr>
-                <w:rFonts w:ascii="TH Sarabun New" w:hAnsi="TH Sarabun New" w:cs="TH Sarabun New"/>
-                <w:b w:val="0"/>
-                <w:sz w:val="28"/>
-                <w:szCs w:val="28"/>
-                <w:lang w:val="th-TH" w:bidi="th-TH" w:eastAsia="th-TH"/>
-              </w:rPr>
               <w:t>๒๙๔</w:t>
             </w:r>
           </w:p>
         </w:tc>
       </w:tr>
       <w:tr>
+        <w:trPr>
+          <w:cantSplit/>
+        </w:trPr>
         <w:tc>
           <w:tcPr>
-            <w:tcW w:type="dxa" w:w="5669"/>
-            <w:shd w:fill="FFFFFF" w:val="clear"/>
+            <w:tcW w:type="dxa" w:w="5443"/>
+            <w:shd w:val="clear" w:color="auto" w:fill="FFFFFF"/>
+            <w:vAlign w:val="center"/>
           </w:tcPr>
           <w:p>
+            <w:pPr>
+              <w:pStyle w:val="ตาราง"/>
+            </w:pPr>
             <w:r>
-              <w:rPr>
-                <w:rFonts w:ascii="TH Sarabun New" w:hAnsi="TH Sarabun New" w:cs="TH Sarabun New"/>
-                <w:b w:val="0"/>
-                <w:sz w:val="28"/>
-                <w:szCs w:val="28"/>
-                <w:lang w:val="th-TH" w:bidi="th-TH" w:eastAsia="th-TH"/>
-              </w:rPr>
               <w:t>หมวด ๑๒ การแก้ไขเพิ่มเติมรัฐธรรมนูญและการร่างรัฐธรรมนูญ</w:t>
             </w:r>
           </w:p>
         </w:tc>
         <w:tc>
           <w:tcPr>
-            <w:tcW w:type="dxa" w:w="1701"/>
-            <w:shd w:fill="FFFFFF" w:val="clear"/>
+            <w:tcW w:type="dxa" w:w="1814"/>
+            <w:shd w:val="clear" w:color="auto" w:fill="FFFFFF"/>
+            <w:vAlign w:val="center"/>
           </w:tcPr>
           <w:p>
             <w:pPr>
-              <w:jc w:val="center"/>
+              <w:pStyle w:val="ตาราง-กลาง"/>
             </w:pPr>
             <w:r>
-              <w:rPr>
-                <w:rFonts w:ascii="TH Sarabun New" w:hAnsi="TH Sarabun New" w:cs="TH Sarabun New"/>
-                <w:b w:val="0"/>
-                <w:sz w:val="28"/>
-                <w:szCs w:val="28"/>
-                <w:lang w:val="th-TH" w:bidi="th-TH" w:eastAsia="th-TH"/>
-              </w:rPr>
               <w:t>๒๙๕</w:t>
             </w:r>
           </w:p>
         </w:tc>
         <w:tc>
           <w:tcPr>
-            <w:tcW w:type="dxa" w:w="1701"/>
-            <w:shd w:fill="FFFFFF" w:val="clear"/>
+            <w:tcW w:type="dxa" w:w="1814"/>
+            <w:shd w:val="clear" w:color="auto" w:fill="FFFFFF"/>
+            <w:vAlign w:val="center"/>
           </w:tcPr>
           <w:p>
             <w:pPr>
-              <w:jc w:val="center"/>
+              <w:pStyle w:val="ตาราง-กลาง"/>
             </w:pPr>
             <w:r>
-              <w:rPr>
-                <w:rFonts w:ascii="TH Sarabun New" w:hAnsi="TH Sarabun New" w:cs="TH Sarabun New"/>
-                <w:b w:val="0"/>
-                <w:sz w:val="28"/>
-                <w:szCs w:val="28"/>
-                <w:lang w:val="th-TH" w:bidi="th-TH" w:eastAsia="th-TH"/>
-              </w:rPr>
               <w:t>๒๙๖</w:t>
             </w:r>
           </w:p>
         </w:tc>
       </w:tr>
       <w:tr>
+        <w:trPr>
+          <w:cantSplit/>
+        </w:trPr>
         <w:tc>
           <w:tcPr>
-            <w:tcW w:type="dxa" w:w="5669"/>
-            <w:shd w:fill="EBF5FB" w:val="clear"/>
+            <w:tcW w:type="dxa" w:w="5443"/>
+            <w:shd w:val="clear" w:color="auto" w:fill="EBF5FB"/>
+            <w:vAlign w:val="center"/>
           </w:tcPr>
           <w:p>
+            <w:pPr>
+              <w:pStyle w:val="ตาราง"/>
+            </w:pPr>
             <w:r>
-              <w:rPr>
-                <w:rFonts w:ascii="TH Sarabun New" w:hAnsi="TH Sarabun New" w:cs="TH Sarabun New"/>
-                <w:b w:val="0"/>
-                <w:sz w:val="28"/>
-                <w:szCs w:val="28"/>
-                <w:lang w:val="th-TH" w:bidi="th-TH" w:eastAsia="th-TH"/>
-              </w:rPr>
               <w:t>หมวด ๑๓ การขัดกันแห่งผลประโยชน์</w:t>
             </w:r>
           </w:p>
         </w:tc>
         <w:tc>
           <w:tcPr>
-            <w:tcW w:type="dxa" w:w="1701"/>
-            <w:shd w:fill="EBF5FB" w:val="clear"/>
+            <w:tcW w:type="dxa" w:w="1814"/>
+            <w:shd w:val="clear" w:color="auto" w:fill="EBF5FB"/>
+            <w:vAlign w:val="center"/>
           </w:tcPr>
           <w:p>
             <w:pPr>
-              <w:jc w:val="center"/>
+              <w:pStyle w:val="ตาราง-กลาง"/>
             </w:pPr>
             <w:r>
-              <w:rPr>
-                <w:rFonts w:ascii="TH Sarabun New" w:hAnsi="TH Sarabun New" w:cs="TH Sarabun New"/>
-                <w:b w:val="0"/>
-                <w:sz w:val="28"/>
-                <w:szCs w:val="28"/>
-                <w:lang w:val="th-TH" w:bidi="th-TH" w:eastAsia="th-TH"/>
-              </w:rPr>
               <w:t>๒๙๗</w:t>
             </w:r>
           </w:p>
         </w:tc>
         <w:tc>
           <w:tcPr>
-            <w:tcW w:type="dxa" w:w="1701"/>
-            <w:shd w:fill="EBF5FB" w:val="clear"/>
+            <w:tcW w:type="dxa" w:w="1814"/>
+            <w:shd w:val="clear" w:color="auto" w:fill="EBF5FB"/>
+            <w:vAlign w:val="center"/>
           </w:tcPr>
           <w:p>
             <w:pPr>
-              <w:jc w:val="center"/>
+              <w:pStyle w:val="ตาราง-กลาง"/>
             </w:pPr>
             <w:r>
-              <w:rPr>
-                <w:rFonts w:ascii="TH Sarabun New" w:hAnsi="TH Sarabun New" w:cs="TH Sarabun New"/>
-                <w:b w:val="0"/>
-                <w:sz w:val="28"/>
-                <w:szCs w:val="28"/>
-                <w:lang w:val="th-TH" w:bidi="th-TH" w:eastAsia="th-TH"/>
-              </w:rPr>
               <w:t>๒๙๙</w:t>
             </w:r>
           </w:p>
         </w:tc>
       </w:tr>
       <w:tr>
+        <w:trPr>
+          <w:cantSplit/>
+        </w:trPr>
         <w:tc>
           <w:tcPr>
-            <w:tcW w:type="dxa" w:w="5669"/>
-            <w:shd w:fill="FFFFFF" w:val="clear"/>
+            <w:tcW w:type="dxa" w:w="5443"/>
+            <w:shd w:val="clear" w:color="auto" w:fill="FFFFFF"/>
+            <w:vAlign w:val="center"/>
           </w:tcPr>
           <w:p>
+            <w:pPr>
+              <w:pStyle w:val="ตาราง"/>
+            </w:pPr>
             <w:r>
-              <w:rPr>
-                <w:rFonts w:ascii="TH Sarabun New" w:hAnsi="TH Sarabun New" w:cs="TH Sarabun New"/>
-                <w:b w:val="0"/>
-                <w:sz w:val="28"/>
-                <w:szCs w:val="28"/>
-                <w:lang w:val="th-TH" w:bidi="th-TH" w:eastAsia="th-TH"/>
-              </w:rPr>
               <w:t>หมวด ๑๔ การปฏิรูปประเทศ</w:t>
             </w:r>
           </w:p>
         </w:tc>
         <w:tc>
           <w:tcPr>
-            <w:tcW w:type="dxa" w:w="1701"/>
-            <w:shd w:fill="FFFFFF" w:val="clear"/>
+            <w:tcW w:type="dxa" w:w="1814"/>
+            <w:shd w:val="clear" w:color="auto" w:fill="FFFFFF"/>
+            <w:vAlign w:val="center"/>
           </w:tcPr>
           <w:p>
             <w:pPr>
-              <w:jc w:val="center"/>
+              <w:pStyle w:val="ตาราง-กลาง"/>
             </w:pPr>
             <w:r>
-              <w:rPr>
-                <w:rFonts w:ascii="TH Sarabun New" w:hAnsi="TH Sarabun New" w:cs="TH Sarabun New"/>
-                <w:b w:val="0"/>
-                <w:sz w:val="28"/>
-                <w:szCs w:val="28"/>
-                <w:lang w:val="th-TH" w:bidi="th-TH" w:eastAsia="th-TH"/>
-              </w:rPr>
               <w:t>๓๐๐</w:t>
             </w:r>
           </w:p>
         </w:tc>
         <w:tc>
           <w:tcPr>
-            <w:tcW w:type="dxa" w:w="1701"/>
-            <w:shd w:fill="FFFFFF" w:val="clear"/>
+            <w:tcW w:type="dxa" w:w="1814"/>
+            <w:shd w:val="clear" w:color="auto" w:fill="FFFFFF"/>
+            <w:vAlign w:val="center"/>
           </w:tcPr>
           <w:p>
             <w:pPr>
-              <w:jc w:val="center"/>
+              <w:pStyle w:val="ตาราง-กลาง"/>
             </w:pPr>
             <w:r>
-              <w:rPr>
-                <w:rFonts w:ascii="TH Sarabun New" w:hAnsi="TH Sarabun New" w:cs="TH Sarabun New"/>
-                <w:b w:val="0"/>
-                <w:sz w:val="28"/>
-                <w:szCs w:val="28"/>
-                <w:lang w:val="th-TH" w:bidi="th-TH" w:eastAsia="th-TH"/>
-              </w:rPr>
               <w:t>๓๐๖</w:t>
             </w:r>
           </w:p>
         </w:tc>
       </w:tr>
       <w:tr>
+        <w:trPr>
+          <w:cantSplit/>
+        </w:trPr>
         <w:tc>
           <w:tcPr>
-            <w:tcW w:type="dxa" w:w="5669"/>
-            <w:shd w:fill="EBF5FB" w:val="clear"/>
+            <w:tcW w:type="dxa" w:w="5443"/>
+            <w:shd w:val="clear" w:color="auto" w:fill="EBF5FB"/>
+            <w:vAlign w:val="center"/>
           </w:tcPr>
           <w:p>
+            <w:pPr>
+              <w:pStyle w:val="ตาราง"/>
+            </w:pPr>
             <w:r>
-              <w:rPr>
-                <w:rFonts w:ascii="TH Sarabun New" w:hAnsi="TH Sarabun New" w:cs="TH Sarabun New"/>
-                <w:b w:val="0"/>
-                <w:sz w:val="28"/>
-                <w:szCs w:val="28"/>
-                <w:lang w:val="th-TH" w:bidi="th-TH" w:eastAsia="th-TH"/>
-              </w:rPr>
               <w:t>หมวด ๑๕ องค์กรอัยการ</w:t>
             </w:r>
           </w:p>
         </w:tc>
         <w:tc>
           <w:tcPr>
-            <w:tcW w:type="dxa" w:w="1701"/>
-            <w:shd w:fill="EBF5FB" w:val="clear"/>
+            <w:tcW w:type="dxa" w:w="1814"/>
+            <w:shd w:val="clear" w:color="auto" w:fill="EBF5FB"/>
+            <w:vAlign w:val="center"/>
           </w:tcPr>
           <w:p>
             <w:pPr>
-              <w:jc w:val="center"/>
+              <w:pStyle w:val="ตาราง-กลาง"/>
             </w:pPr>
             <w:r>
-              <w:rPr>
-                <w:rFonts w:ascii="TH Sarabun New" w:hAnsi="TH Sarabun New" w:cs="TH Sarabun New"/>
-                <w:b w:val="0"/>
-                <w:sz w:val="28"/>
-                <w:szCs w:val="28"/>
-                <w:lang w:val="th-TH" w:bidi="th-TH" w:eastAsia="th-TH"/>
-              </w:rPr>
               <w:t>๓๐๗</w:t>
             </w:r>
           </w:p>
         </w:tc>
         <w:tc>
           <w:tcPr>
-            <w:tcW w:type="dxa" w:w="1701"/>
-            <w:shd w:fill="EBF5FB" w:val="clear"/>
+            <w:tcW w:type="dxa" w:w="1814"/>
+            <w:shd w:val="clear" w:color="auto" w:fill="EBF5FB"/>
+            <w:vAlign w:val="center"/>
           </w:tcPr>
           <w:p>
             <w:pPr>
-              <w:jc w:val="center"/>
+              <w:pStyle w:val="ตาราง-กลาง"/>
             </w:pPr>
             <w:r>
-              <w:rPr>
-                <w:rFonts w:ascii="TH Sarabun New" w:hAnsi="TH Sarabun New" w:cs="TH Sarabun New"/>
-                <w:b w:val="0"/>
-                <w:sz w:val="28"/>
-                <w:szCs w:val="28"/>
-                <w:lang w:val="th-TH" w:bidi="th-TH" w:eastAsia="th-TH"/>
-              </w:rPr>
               <w:t>๓๑๐</w:t>
             </w:r>
           </w:p>
         </w:tc>
       </w:tr>
       <w:tr>
+        <w:trPr>
+          <w:cantSplit/>
+        </w:trPr>
         <w:tc>
           <w:tcPr>
-            <w:tcW w:type="dxa" w:w="5669"/>
-            <w:shd w:fill="FFFFFF" w:val="clear"/>
+            <w:tcW w:type="dxa" w:w="5443"/>
+            <w:shd w:val="clear" w:color="auto" w:fill="FFFFFF"/>
+            <w:vAlign w:val="center"/>
           </w:tcPr>
           <w:p>
+            <w:pPr>
+              <w:pStyle w:val="ตาราง"/>
+            </w:pPr>
             <w:r>
-              <w:rPr>
-                <w:rFonts w:ascii="TH Sarabun New" w:hAnsi="TH Sarabun New" w:cs="TH Sarabun New"/>
-                <w:b w:val="0"/>
-                <w:sz w:val="28"/>
-                <w:szCs w:val="28"/>
-                <w:lang w:val="th-TH" w:bidi="th-TH" w:eastAsia="th-TH"/>
-              </w:rPr>
               <w:t>หมวด ๑๖ องค์กรอิสระ</w:t>
             </w:r>
           </w:p>
         </w:tc>
         <w:tc>
           <w:tcPr>
-            <w:tcW w:type="dxa" w:w="1701"/>
-            <w:shd w:fill="FFFFFF" w:val="clear"/>
+            <w:tcW w:type="dxa" w:w="1814"/>
+            <w:shd w:val="clear" w:color="auto" w:fill="FFFFFF"/>
+            <w:vAlign w:val="center"/>
           </w:tcPr>
           <w:p>
             <w:pPr>
-              <w:jc w:val="center"/>
+              <w:pStyle w:val="ตาราง-กลาง"/>
             </w:pPr>
             <w:r>
-              <w:rPr>
-                <w:rFonts w:ascii="TH Sarabun New" w:hAnsi="TH Sarabun New" w:cs="TH Sarabun New"/>
-                <w:b w:val="0"/>
-                <w:sz w:val="28"/>
-                <w:szCs w:val="28"/>
-                <w:lang w:val="th-TH" w:bidi="th-TH" w:eastAsia="th-TH"/>
-              </w:rPr>
               <w:t>๓๑๑</w:t>
             </w:r>
           </w:p>
         </w:tc>
         <w:tc>
           <w:tcPr>
-            <w:tcW w:type="dxa" w:w="1701"/>
-            <w:shd w:fill="FFFFFF" w:val="clear"/>
+            <w:tcW w:type="dxa" w:w="1814"/>
+            <w:shd w:val="clear" w:color="auto" w:fill="FFFFFF"/>
+            <w:vAlign w:val="center"/>
           </w:tcPr>
           <w:p>
             <w:pPr>
-              <w:jc w:val="center"/>
+              <w:pStyle w:val="ตาราง-กลาง"/>
             </w:pPr>
             <w:r>
-              <w:rPr>
-                <w:rFonts w:ascii="TH Sarabun New" w:hAnsi="TH Sarabun New" w:cs="TH Sarabun New"/>
-                <w:b w:val="0"/>
-                <w:sz w:val="28"/>
-                <w:szCs w:val="28"/>
-                <w:lang w:val="th-TH" w:bidi="th-TH" w:eastAsia="th-TH"/>
-              </w:rPr>
               <w:t>๓๓๗</w:t>
             </w:r>
           </w:p>
         </w:tc>
       </w:tr>
       <w:tr>
+        <w:trPr>
+          <w:cantSplit/>
+        </w:trPr>
         <w:tc>
           <w:tcPr>
-            <w:tcW w:type="dxa" w:w="5669"/>
-            <w:shd w:fill="EBF5FB" w:val="clear"/>
+            <w:tcW w:type="dxa" w:w="5443"/>
+            <w:shd w:val="clear" w:color="auto" w:fill="EBF5FB"/>
+            <w:vAlign w:val="center"/>
           </w:tcPr>
           <w:p>
+            <w:pPr>
+              <w:pStyle w:val="ตาราง"/>
+            </w:pPr>
             <w:r>
-              <w:rPr>
-                <w:rFonts w:ascii="TH Sarabun New" w:hAnsi="TH Sarabun New" w:cs="TH Sarabun New"/>
-                <w:b w:val="0"/>
-                <w:sz w:val="28"/>
-                <w:szCs w:val="28"/>
-                <w:lang w:val="th-TH" w:bidi="th-TH" w:eastAsia="th-TH"/>
-              </w:rPr>
               <w:t>บทเฉพาะกาล</w:t>
             </w:r>
           </w:p>
         </w:tc>
         <w:tc>
           <w:tcPr>
-            <w:tcW w:type="dxa" w:w="1701"/>
-            <w:shd w:fill="EBF5FB" w:val="clear"/>
+            <w:tcW w:type="dxa" w:w="1814"/>
+            <w:shd w:val="clear" w:color="auto" w:fill="EBF5FB"/>
+            <w:vAlign w:val="center"/>
           </w:tcPr>
           <w:p>
             <w:pPr>
-              <w:jc w:val="center"/>
+              <w:pStyle w:val="ตาราง-กลาง"/>
             </w:pPr>
             <w:r>
-              <w:rPr>
-                <w:rFonts w:ascii="TH Sarabun New" w:hAnsi="TH Sarabun New" w:cs="TH Sarabun New"/>
-                <w:b w:val="0"/>
-                <w:sz w:val="28"/>
-                <w:szCs w:val="28"/>
-                <w:lang w:val="th-TH" w:bidi="th-TH" w:eastAsia="th-TH"/>
-              </w:rPr>
               <w:t>๓๓๘</w:t>
             </w:r>
           </w:p>
         </w:tc>
         <w:tc>
           <w:tcPr>
-            <w:tcW w:type="dxa" w:w="1701"/>
-            <w:shd w:fill="EBF5FB" w:val="clear"/>
+            <w:tcW w:type="dxa" w:w="1814"/>
+            <w:shd w:val="clear" w:color="auto" w:fill="EBF5FB"/>
+            <w:vAlign w:val="center"/>
           </w:tcPr>
           <w:p>
             <w:pPr>
-              <w:jc w:val="center"/>
+              <w:pStyle w:val="ตาราง-กลาง"/>
             </w:pPr>
             <w:r>
-              <w:rPr>
-                <w:rFonts w:ascii="TH Sarabun New" w:hAnsi="TH Sarabun New" w:cs="TH Sarabun New"/>
-                <w:b w:val="0"/>
-                <w:sz w:val="28"/>
-                <w:szCs w:val="28"/>
-                <w:lang w:val="th-TH" w:bidi="th-TH" w:eastAsia="th-TH"/>
-              </w:rPr>
               <w:t>๓๖๐</w:t>
             </w:r>
           </w:p>
         </w:tc>
       </w:tr>
       <w:tr>
+        <w:trPr>
+          <w:cantSplit/>
+        </w:trPr>
         <w:tc>
           <w:tcPr>
-            <w:tcW w:type="dxa" w:w="5669"/>
-            <w:shd w:fill="FFFFFF" w:val="clear"/>
+            <w:tcW w:type="dxa" w:w="5443"/>
+            <w:shd w:val="clear" w:color="auto" w:fill="FFFFFF"/>
+            <w:vAlign w:val="center"/>
           </w:tcPr>
           <w:p>
+            <w:pPr>
+              <w:pStyle w:val="ตาราง"/>
+            </w:pPr>
             <w:r>
-              <w:rPr>
-                <w:rFonts w:ascii="TH Sarabun New" w:hAnsi="TH Sarabun New" w:cs="TH Sarabun New"/>
-                <w:b w:val="0"/>
-                <w:sz w:val="28"/>
-                <w:szCs w:val="28"/>
-                <w:lang w:val="th-TH" w:bidi="th-TH" w:eastAsia="th-TH"/>
-              </w:rPr>
               <w:t>หมวด ๑๗ สิทธิชุมชนและการมีส่วนร่วมภาคประชาชน</w:t>
             </w:r>
           </w:p>
         </w:tc>
         <w:tc>
           <w:tcPr>
-            <w:tcW w:type="dxa" w:w="1701"/>
-            <w:shd w:fill="FFFFFF" w:val="clear"/>
+            <w:tcW w:type="dxa" w:w="1814"/>
+            <w:shd w:val="clear" w:color="auto" w:fill="FFFFFF"/>
+            <w:vAlign w:val="center"/>
           </w:tcPr>
           <w:p>
             <w:pPr>
-              <w:jc w:val="center"/>
+              <w:pStyle w:val="ตาราง-กลาง"/>
             </w:pPr>
             <w:r>
-              <w:rPr>
-                <w:rFonts w:ascii="TH Sarabun New" w:hAnsi="TH Sarabun New" w:cs="TH Sarabun New"/>
-                <w:b w:val="0"/>
-                <w:sz w:val="28"/>
-                <w:szCs w:val="28"/>
-                <w:lang w:val="th-TH" w:bidi="th-TH" w:eastAsia="th-TH"/>
-              </w:rPr>
               <w:t>๓๖๑</w:t>
             </w:r>
           </w:p>
         </w:tc>
         <w:tc>
           <w:tcPr>
-            <w:tcW w:type="dxa" w:w="1701"/>
-            <w:shd w:fill="FFFFFF" w:val="clear"/>
+            <w:tcW w:type="dxa" w:w="1814"/>
+            <w:shd w:val="clear" w:color="auto" w:fill="FFFFFF"/>
+            <w:vAlign w:val="center"/>
           </w:tcPr>
           <w:p>
             <w:pPr>
-              <w:jc w:val="center"/>
+              <w:pStyle w:val="ตาราง-กลาง"/>
             </w:pPr>
             <w:r>
-              <w:rPr>
-                <w:rFonts w:ascii="TH Sarabun New" w:hAnsi="TH Sarabun New" w:cs="TH Sarabun New"/>
-                <w:b w:val="0"/>
-                <w:sz w:val="28"/>
-                <w:szCs w:val="28"/>
-                <w:lang w:val="th-TH" w:bidi="th-TH" w:eastAsia="th-TH"/>
-              </w:rPr>
               <w:t>๔๐๐</w:t>
             </w:r>
           </w:p>
         </w:tc>
       </w:tr>
       <w:tr>
+        <w:trPr>
+          <w:cantSplit/>
+        </w:trPr>
         <w:tc>
           <w:tcPr>
-            <w:tcW w:type="dxa" w:w="5669"/>
-            <w:shd w:fill="EBF5FB" w:val="clear"/>
+            <w:tcW w:type="dxa" w:w="5443"/>
+            <w:shd w:val="clear" w:color="auto" w:fill="EBF5FB"/>
+            <w:vAlign w:val="center"/>
           </w:tcPr>
           <w:p>
+            <w:pPr>
+              <w:pStyle w:val="ตาราง"/>
+            </w:pPr>
             <w:r>
-              <w:rPr>
-                <w:rFonts w:ascii="TH Sarabun New" w:hAnsi="TH Sarabun New" w:cs="TH Sarabun New"/>
-                <w:b w:val="0"/>
-                <w:sz w:val="28"/>
-                <w:szCs w:val="28"/>
-                <w:lang w:val="th-TH" w:bidi="th-TH" w:eastAsia="th-TH"/>
-              </w:rPr>
               <w:t>หมวด ๑๘ สิทธิแรงงานและการคุ้มครองผู้ใช้แรงงาน</w:t>
             </w:r>
           </w:p>
         </w:tc>
         <w:tc>
           <w:tcPr>
-            <w:tcW w:type="dxa" w:w="1701"/>
-            <w:shd w:fill="EBF5FB" w:val="clear"/>
+            <w:tcW w:type="dxa" w:w="1814"/>
+            <w:shd w:val="clear" w:color="auto" w:fill="EBF5FB"/>
+            <w:vAlign w:val="center"/>
           </w:tcPr>
           <w:p>
             <w:pPr>
-              <w:jc w:val="center"/>
+              <w:pStyle w:val="ตาราง-กลาง"/>
             </w:pPr>
             <w:r>
-              <w:rPr>
-                <w:rFonts w:ascii="TH Sarabun New" w:hAnsi="TH Sarabun New" w:cs="TH Sarabun New"/>
-                <w:b w:val="0"/>
-                <w:sz w:val="28"/>
-                <w:szCs w:val="28"/>
-                <w:lang w:val="th-TH" w:bidi="th-TH" w:eastAsia="th-TH"/>
-              </w:rPr>
               <w:t>๔๐๑</w:t>
             </w:r>
           </w:p>
         </w:tc>
         <w:tc>
           <w:tcPr>
-            <w:tcW w:type="dxa" w:w="1701"/>
-            <w:shd w:fill="EBF5FB" w:val="clear"/>
+            <w:tcW w:type="dxa" w:w="1814"/>
+            <w:shd w:val="clear" w:color="auto" w:fill="EBF5FB"/>
+            <w:vAlign w:val="center"/>
           </w:tcPr>
           <w:p>
             <w:pPr>
-              <w:jc w:val="center"/>
+              <w:pStyle w:val="ตาราง-กลาง"/>
             </w:pPr>
             <w:r>
-              <w:rPr>
-                <w:rFonts w:ascii="TH Sarabun New" w:hAnsi="TH Sarabun New" w:cs="TH Sarabun New"/>
-                <w:b w:val="0"/>
-                <w:sz w:val="28"/>
-                <w:szCs w:val="28"/>
-                <w:lang w:val="th-TH" w:bidi="th-TH" w:eastAsia="th-TH"/>
-              </w:rPr>
               <w:t>๔๔๐</w:t>
             </w:r>
           </w:p>
         </w:tc>
       </w:tr>
       <w:tr>
+        <w:trPr>
+          <w:cantSplit/>
+        </w:trPr>
         <w:tc>
           <w:tcPr>
-            <w:tcW w:type="dxa" w:w="5669"/>
-            <w:shd w:fill="FFFFFF" w:val="clear"/>
+            <w:tcW w:type="dxa" w:w="5443"/>
+            <w:shd w:val="clear" w:color="auto" w:fill="FFFFFF"/>
+            <w:vAlign w:val="center"/>
           </w:tcPr>
           <w:p>
+            <w:pPr>
+              <w:pStyle w:val="ตาราง"/>
+            </w:pPr>
             <w:r>
-              <w:rPr>
-                <w:rFonts w:ascii="TH Sarabun New" w:hAnsi="TH Sarabun New" w:cs="TH Sarabun New"/>
-                <w:b w:val="0"/>
-                <w:sz w:val="28"/>
-                <w:szCs w:val="28"/>
-                <w:lang w:val="th-TH" w:bidi="th-TH" w:eastAsia="th-TH"/>
-              </w:rPr>
               <w:t>หมวด ๑๙ สิทธิด้านสิ่งแวดล้อมและทรัพยากรธรรมชาติ</w:t>
             </w:r>
           </w:p>
         </w:tc>
         <w:tc>
           <w:tcPr>
-            <w:tcW w:type="dxa" w:w="1701"/>
-            <w:shd w:fill="FFFFFF" w:val="clear"/>
+            <w:tcW w:type="dxa" w:w="1814"/>
+            <w:shd w:val="clear" w:color="auto" w:fill="FFFFFF"/>
+            <w:vAlign w:val="center"/>
           </w:tcPr>
           <w:p>
             <w:pPr>
-              <w:jc w:val="center"/>
+              <w:pStyle w:val="ตาราง-กลาง"/>
             </w:pPr>
             <w:r>
-              <w:rPr>
-                <w:rFonts w:ascii="TH Sarabun New" w:hAnsi="TH Sarabun New" w:cs="TH Sarabun New"/>
-                <w:b w:val="0"/>
-                <w:sz w:val="28"/>
-                <w:szCs w:val="28"/>
-                <w:lang w:val="th-TH" w:bidi="th-TH" w:eastAsia="th-TH"/>
-              </w:rPr>
               <w:t>๔๔๑</w:t>
             </w:r>
           </w:p>
         </w:tc>
         <w:tc>
           <w:tcPr>
-            <w:tcW w:type="dxa" w:w="1701"/>
-            <w:shd w:fill="FFFFFF" w:val="clear"/>
+            <w:tcW w:type="dxa" w:w="1814"/>
+            <w:shd w:val="clear" w:color="auto" w:fill="FFFFFF"/>
+            <w:vAlign w:val="center"/>
           </w:tcPr>
           <w:p>
             <w:pPr>
-              <w:jc w:val="center"/>
+              <w:pStyle w:val="ตาราง-กลาง"/>
             </w:pPr>
             <w:r>
-              <w:rPr>
-                <w:rFonts w:ascii="TH Sarabun New" w:hAnsi="TH Sarabun New" w:cs="TH Sarabun New"/>
-                <w:b w:val="0"/>
-                <w:sz w:val="28"/>
-                <w:szCs w:val="28"/>
-                <w:lang w:val="th-TH" w:bidi="th-TH" w:eastAsia="th-TH"/>
-              </w:rPr>
               <w:t>๔๘๐</w:t>
             </w:r>
           </w:p>
         </w:tc>
       </w:tr>
       <w:tr>
+        <w:trPr>
+          <w:cantSplit/>
+        </w:trPr>
         <w:tc>
           <w:tcPr>
-            <w:tcW w:type="dxa" w:w="5669"/>
-            <w:shd w:fill="EBF5FB" w:val="clear"/>
+            <w:tcW w:type="dxa" w:w="5443"/>
+            <w:shd w:val="clear" w:color="auto" w:fill="EBF5FB"/>
+            <w:vAlign w:val="center"/>
           </w:tcPr>
           <w:p>
+            <w:pPr>
+              <w:pStyle w:val="ตาราง"/>
+            </w:pPr>
             <w:r>
-              <w:rPr>
-                <w:rFonts w:ascii="TH Sarabun New" w:hAnsi="TH Sarabun New" w:cs="TH Sarabun New"/>
-                <w:b w:val="0"/>
-                <w:sz w:val="28"/>
-                <w:szCs w:val="28"/>
-                <w:lang w:val="th-TH" w:bidi="th-TH" w:eastAsia="th-TH"/>
-              </w:rPr>
               <w:t>หมวด ๒๐ เทคโนโลยี นวัตกรรม และเศรษฐกิจดิจิทัล</w:t>
             </w:r>
           </w:p>
         </w:tc>
         <w:tc>
           <w:tcPr>
-            <w:tcW w:type="dxa" w:w="1701"/>
-            <w:shd w:fill="EBF5FB" w:val="clear"/>
+            <w:tcW w:type="dxa" w:w="1814"/>
+            <w:shd w:val="clear" w:color="auto" w:fill="EBF5FB"/>
+            <w:vAlign w:val="center"/>
           </w:tcPr>
           <w:p>
             <w:pPr>
-              <w:jc w:val="center"/>
+              <w:pStyle w:val="ตาราง-กลาง"/>
             </w:pPr>
             <w:r>
-              <w:rPr>
-                <w:rFonts w:ascii="TH Sarabun New" w:hAnsi="TH Sarabun New" w:cs="TH Sarabun New"/>
-                <w:b w:val="0"/>
-                <w:sz w:val="28"/>
-                <w:szCs w:val="28"/>
-                <w:lang w:val="th-TH" w:bidi="th-TH" w:eastAsia="th-TH"/>
-              </w:rPr>
               <w:t>๔๘๑</w:t>
             </w:r>
           </w:p>
         </w:tc>
         <w:tc>
           <w:tcPr>
-            <w:tcW w:type="dxa" w:w="1701"/>
-            <w:shd w:fill="EBF5FB" w:val="clear"/>
+            <w:tcW w:type="dxa" w:w="1814"/>
+            <w:shd w:val="clear" w:color="auto" w:fill="EBF5FB"/>
+            <w:vAlign w:val="center"/>
           </w:tcPr>
           <w:p>
             <w:pPr>
-              <w:jc w:val="center"/>
+              <w:pStyle w:val="ตาราง-กลาง"/>
             </w:pPr>
             <w:r>
-              <w:rPr>
-                <w:rFonts w:ascii="TH Sarabun New" w:hAnsi="TH Sarabun New" w:cs="TH Sarabun New"/>
-                <w:b w:val="0"/>
-                <w:sz w:val="28"/>
-                <w:szCs w:val="28"/>
-                <w:lang w:val="th-TH" w:bidi="th-TH" w:eastAsia="th-TH"/>
-              </w:rPr>
               <w:t>๕๒๐</w:t>
             </w:r>
           </w:p>
         </w:tc>
       </w:tr>
       <w:tr>
+        <w:trPr>
+          <w:cantSplit/>
+        </w:trPr>
         <w:tc>
           <w:tcPr>
-            <w:tcW w:type="dxa" w:w="5669"/>
-            <w:shd w:fill="FFFFFF" w:val="clear"/>
+            <w:tcW w:type="dxa" w:w="5443"/>
+            <w:shd w:val="clear" w:color="auto" w:fill="FFFFFF"/>
+            <w:vAlign w:val="center"/>
           </w:tcPr>
           <w:p>
+            <w:pPr>
+              <w:pStyle w:val="ตาราง"/>
+            </w:pPr>
             <w:r>
-              <w:rPr>
-                <w:rFonts w:ascii="TH Sarabun New" w:hAnsi="TH Sarabun New" w:cs="TH Sarabun New"/>
-                <w:b w:val="0"/>
-                <w:sz w:val="28"/>
-                <w:szCs w:val="28"/>
-                <w:lang w:val="th-TH" w:bidi="th-TH" w:eastAsia="th-TH"/>
-              </w:rPr>
               <w:t>หมวด ๒๑ ความมั่นคงทางอาหารและการเกษตร</w:t>
             </w:r>
           </w:p>
         </w:tc>
         <w:tc>
           <w:tcPr>
-            <w:tcW w:type="dxa" w:w="1701"/>
-            <w:shd w:fill="FFFFFF" w:val="clear"/>
+            <w:tcW w:type="dxa" w:w="1814"/>
+            <w:shd w:val="clear" w:color="auto" w:fill="FFFFFF"/>
+            <w:vAlign w:val="center"/>
           </w:tcPr>
           <w:p>
             <w:pPr>
-              <w:jc w:val="center"/>
+              <w:pStyle w:val="ตาราง-กลาง"/>
             </w:pPr>
             <w:r>
-              <w:rPr>
-                <w:rFonts w:ascii="TH Sarabun New" w:hAnsi="TH Sarabun New" w:cs="TH Sarabun New"/>
-                <w:b w:val="0"/>
-                <w:sz w:val="28"/>
-                <w:szCs w:val="28"/>
-                <w:lang w:val="th-TH" w:bidi="th-TH" w:eastAsia="th-TH"/>
-              </w:rPr>
               <w:t>๕๒๑</w:t>
             </w:r>
           </w:p>
         </w:tc>
         <w:tc>
           <w:tcPr>
-            <w:tcW w:type="dxa" w:w="1701"/>
-            <w:shd w:fill="FFFFFF" w:val="clear"/>
+            <w:tcW w:type="dxa" w:w="1814"/>
+            <w:shd w:val="clear" w:color="auto" w:fill="FFFFFF"/>
+            <w:vAlign w:val="center"/>
           </w:tcPr>
           <w:p>
             <w:pPr>
-              <w:jc w:val="center"/>
+              <w:pStyle w:val="ตาราง-กลาง"/>
             </w:pPr>
             <w:r>
-              <w:rPr>
-                <w:rFonts w:ascii="TH Sarabun New" w:hAnsi="TH Sarabun New" w:cs="TH Sarabun New"/>
-                <w:b w:val="0"/>
-                <w:sz w:val="28"/>
-                <w:szCs w:val="28"/>
-                <w:lang w:val="th-TH" w:bidi="th-TH" w:eastAsia="th-TH"/>
-              </w:rPr>
               <w:t>๕๖๐</w:t>
             </w:r>
           </w:p>
         </w:tc>
       </w:tr>
       <w:tr>
+        <w:trPr>
+          <w:cantSplit/>
+        </w:trPr>
         <w:tc>
           <w:tcPr>
-            <w:tcW w:type="dxa" w:w="5669"/>
-            <w:shd w:fill="EBF5FB" w:val="clear"/>
+            <w:tcW w:type="dxa" w:w="5443"/>
+            <w:shd w:val="clear" w:color="auto" w:fill="EBF5FB"/>
+            <w:vAlign w:val="center"/>
           </w:tcPr>
           <w:p>
+            <w:pPr>
+              <w:pStyle w:val="ตาราง"/>
+            </w:pPr>
             <w:r>
-              <w:rPr>
-                <w:rFonts w:ascii="TH Sarabun New" w:hAnsi="TH Sarabun New" w:cs="TH Sarabun New"/>
-                <w:b w:val="0"/>
-                <w:sz w:val="28"/>
-                <w:szCs w:val="28"/>
-                <w:lang w:val="th-TH" w:bidi="th-TH" w:eastAsia="th-TH"/>
-              </w:rPr>
               <w:t>หมวด ๒๒ สิทธิเด็ก เยาวชน ผู้สูงอายุ และผู้พิการ</w:t>
             </w:r>
           </w:p>
         </w:tc>
         <w:tc>
           <w:tcPr>
-            <w:tcW w:type="dxa" w:w="1701"/>
-            <w:shd w:fill="EBF5FB" w:val="clear"/>
+            <w:tcW w:type="dxa" w:w="1814"/>
+            <w:shd w:val="clear" w:color="auto" w:fill="EBF5FB"/>
+            <w:vAlign w:val="center"/>
           </w:tcPr>
           <w:p>
             <w:pPr>
-              <w:jc w:val="center"/>
+              <w:pStyle w:val="ตาราง-กลาง"/>
             </w:pPr>
             <w:r>
-              <w:rPr>
-                <w:rFonts w:ascii="TH Sarabun New" w:hAnsi="TH Sarabun New" w:cs="TH Sarabun New"/>
-                <w:b w:val="0"/>
-                <w:sz w:val="28"/>
-                <w:szCs w:val="28"/>
-                <w:lang w:val="th-TH" w:bidi="th-TH" w:eastAsia="th-TH"/>
-              </w:rPr>
               <w:t>๕๖๑</w:t>
             </w:r>
           </w:p>
         </w:tc>
         <w:tc>
           <w:tcPr>
-            <w:tcW w:type="dxa" w:w="1701"/>
-            <w:shd w:fill="EBF5FB" w:val="clear"/>
+            <w:tcW w:type="dxa" w:w="1814"/>
+            <w:shd w:val="clear" w:color="auto" w:fill="EBF5FB"/>
+            <w:vAlign w:val="center"/>
           </w:tcPr>
           <w:p>
             <w:pPr>
-              <w:jc w:val="center"/>
+              <w:pStyle w:val="ตาราง-กลาง"/>
             </w:pPr>
             <w:r>
-              <w:rPr>
-                <w:rFonts w:ascii="TH Sarabun New" w:hAnsi="TH Sarabun New" w:cs="TH Sarabun New"/>
-                <w:b w:val="0"/>
-                <w:sz w:val="28"/>
-                <w:szCs w:val="28"/>
-                <w:lang w:val="th-TH" w:bidi="th-TH" w:eastAsia="th-TH"/>
-              </w:rPr>
               <w:t>๖๐๐</w:t>
             </w:r>
           </w:p>
         </w:tc>
       </w:tr>
       <w:tr>
+        <w:trPr>
+          <w:cantSplit/>
+        </w:trPr>
         <w:tc>
           <w:tcPr>
-            <w:tcW w:type="dxa" w:w="5669"/>
-            <w:shd w:fill="FFFFFF" w:val="clear"/>
+            <w:tcW w:type="dxa" w:w="5443"/>
+            <w:shd w:val="clear" w:color="auto" w:fill="FFFFFF"/>
+            <w:vAlign w:val="center"/>
           </w:tcPr>
           <w:p>
+            <w:pPr>
+              <w:pStyle w:val="ตาราง"/>
+            </w:pPr>
             <w:r>
-              <w:rPr>
-                <w:rFonts w:ascii="TH Sarabun New" w:hAnsi="TH Sarabun New" w:cs="TH Sarabun New"/>
-                <w:b w:val="0"/>
-                <w:sz w:val="28"/>
-                <w:szCs w:val="28"/>
-                <w:lang w:val="th-TH" w:bidi="th-TH" w:eastAsia="th-TH"/>
-              </w:rPr>
               <w:t>หมวด ๒๓ การศึกษา วิทยาศาสตร์ และวิจัย</w:t>
             </w:r>
           </w:p>
         </w:tc>
         <w:tc>
           <w:tcPr>
-            <w:tcW w:type="dxa" w:w="1701"/>
-            <w:shd w:fill="FFFFFF" w:val="clear"/>
+            <w:tcW w:type="dxa" w:w="1814"/>
+            <w:shd w:val="clear" w:color="auto" w:fill="FFFFFF"/>
+            <w:vAlign w:val="center"/>
           </w:tcPr>
           <w:p>
             <w:pPr>
-              <w:jc w:val="center"/>
+              <w:pStyle w:val="ตาราง-กลาง"/>
             </w:pPr>
             <w:r>
-              <w:rPr>
-                <w:rFonts w:ascii="TH Sarabun New" w:hAnsi="TH Sarabun New" w:cs="TH Sarabun New"/>
-                <w:b w:val="0"/>
-                <w:sz w:val="28"/>
-                <w:szCs w:val="28"/>
-                <w:lang w:val="th-TH" w:bidi="th-TH" w:eastAsia="th-TH"/>
-              </w:rPr>
               <w:t>๖๐๑</w:t>
             </w:r>
           </w:p>
         </w:tc>
         <w:tc>
           <w:tcPr>
-            <w:tcW w:type="dxa" w:w="1701"/>
-            <w:shd w:fill="FFFFFF" w:val="clear"/>
+            <w:tcW w:type="dxa" w:w="1814"/>
+            <w:shd w:val="clear" w:color="auto" w:fill="FFFFFF"/>
+            <w:vAlign w:val="center"/>
           </w:tcPr>
           <w:p>
             <w:pPr>
-              <w:jc w:val="center"/>
+              <w:pStyle w:val="ตาราง-กลาง"/>
             </w:pPr>
             <w:r>
-              <w:rPr>
-                <w:rFonts w:ascii="TH Sarabun New" w:hAnsi="TH Sarabun New" w:cs="TH Sarabun New"/>
-                <w:b w:val="0"/>
-                <w:sz w:val="28"/>
-                <w:szCs w:val="28"/>
-                <w:lang w:val="th-TH" w:bidi="th-TH" w:eastAsia="th-TH"/>
-              </w:rPr>
               <w:t>๖๔๐</w:t>
             </w:r>
           </w:p>
         </w:tc>
       </w:tr>
       <w:tr>
+        <w:trPr>
+          <w:cantSplit/>
+        </w:trPr>
         <w:tc>
           <w:tcPr>
-            <w:tcW w:type="dxa" w:w="5669"/>
-            <w:shd w:fill="EBF5FB" w:val="clear"/>
+            <w:tcW w:type="dxa" w:w="5443"/>
+            <w:shd w:val="clear" w:color="auto" w:fill="EBF5FB"/>
+            <w:vAlign w:val="center"/>
           </w:tcPr>
           <w:p>
+            <w:pPr>
+              <w:pStyle w:val="ตาราง"/>
+            </w:pPr>
             <w:r>
-              <w:rPr>
-                <w:rFonts w:ascii="TH Sarabun New" w:hAnsi="TH Sarabun New" w:cs="TH Sarabun New"/>
-                <w:b w:val="0"/>
-                <w:sz w:val="28"/>
-                <w:szCs w:val="28"/>
-                <w:lang w:val="th-TH" w:bidi="th-TH" w:eastAsia="th-TH"/>
-              </w:rPr>
               <w:t>หมวด ๒๔ สาธารณสุขและระบบสุขภาพ</w:t>
             </w:r>
           </w:p>
         </w:tc>
         <w:tc>
           <w:tcPr>
-            <w:tcW w:type="dxa" w:w="1701"/>
-            <w:shd w:fill="EBF5FB" w:val="clear"/>
+            <w:tcW w:type="dxa" w:w="1814"/>
+            <w:shd w:val="clear" w:color="auto" w:fill="EBF5FB"/>
+            <w:vAlign w:val="center"/>
           </w:tcPr>
           <w:p>
             <w:pPr>
-              <w:jc w:val="center"/>
+              <w:pStyle w:val="ตาราง-กลาง"/>
             </w:pPr>
             <w:r>
-              <w:rPr>
-                <w:rFonts w:ascii="TH Sarabun New" w:hAnsi="TH Sarabun New" w:cs="TH Sarabun New"/>
-                <w:b w:val="0"/>
-                <w:sz w:val="28"/>
-                <w:szCs w:val="28"/>
-                <w:lang w:val="th-TH" w:bidi="th-TH" w:eastAsia="th-TH"/>
-              </w:rPr>
               <w:t>๖๔๑</w:t>
             </w:r>
           </w:p>
         </w:tc>
         <w:tc>
           <w:tcPr>
-            <w:tcW w:type="dxa" w:w="1701"/>
-            <w:shd w:fill="EBF5FB" w:val="clear"/>
+            <w:tcW w:type="dxa" w:w="1814"/>
+            <w:shd w:val="clear" w:color="auto" w:fill="EBF5FB"/>
+            <w:vAlign w:val="center"/>
           </w:tcPr>
           <w:p>
             <w:pPr>
-              <w:jc w:val="center"/>
+              <w:pStyle w:val="ตาราง-กลาง"/>
             </w:pPr>
             <w:r>
-              <w:rPr>
-                <w:rFonts w:ascii="TH Sarabun New" w:hAnsi="TH Sarabun New" w:cs="TH Sarabun New"/>
-                <w:b w:val="0"/>
-                <w:sz w:val="28"/>
-                <w:szCs w:val="28"/>
-                <w:lang w:val="th-TH" w:bidi="th-TH" w:eastAsia="th-TH"/>
-              </w:rPr>
               <w:t>๖๘๐</w:t>
             </w:r>
           </w:p>
         </w:tc>
       </w:tr>
       <w:tr>
+        <w:trPr>
+          <w:cantSplit/>
+        </w:trPr>
         <w:tc>
           <w:tcPr>
-            <w:tcW w:type="dxa" w:w="5669"/>
-            <w:shd w:fill="FFFFFF" w:val="clear"/>
+            <w:tcW w:type="dxa" w:w="5443"/>
+            <w:shd w:val="clear" w:color="auto" w:fill="FFFFFF"/>
+            <w:vAlign w:val="center"/>
           </w:tcPr>
           <w:p>
+            <w:pPr>
+              <w:pStyle w:val="ตาราง"/>
+            </w:pPr>
             <w:r>
-              <w:rPr>
-                <w:rFonts w:ascii="TH Sarabun New" w:hAnsi="TH Sarabun New" w:cs="TH Sarabun New"/>
-                <w:b w:val="0"/>
-                <w:sz w:val="28"/>
-                <w:szCs w:val="28"/>
-                <w:lang w:val="th-TH" w:bidi="th-TH" w:eastAsia="th-TH"/>
-              </w:rPr>
               <w:t>หมวด ๒๕ การต่อต้านการทุจริตและธรรมาภิบาล</w:t>
             </w:r>
           </w:p>
         </w:tc>
         <w:tc>
           <w:tcPr>
-            <w:tcW w:type="dxa" w:w="1701"/>
-            <w:shd w:fill="FFFFFF" w:val="clear"/>
+            <w:tcW w:type="dxa" w:w="1814"/>
+            <w:shd w:val="clear" w:color="auto" w:fill="FFFFFF"/>
+            <w:vAlign w:val="center"/>
           </w:tcPr>
           <w:p>
             <w:pPr>
-              <w:jc w:val="center"/>
+              <w:pStyle w:val="ตาราง-กลาง"/>
             </w:pPr>
             <w:r>
-              <w:rPr>
-                <w:rFonts w:ascii="TH Sarabun New" w:hAnsi="TH Sarabun New" w:cs="TH Sarabun New"/>
-                <w:b w:val="0"/>
-                <w:sz w:val="28"/>
-                <w:szCs w:val="28"/>
-                <w:lang w:val="th-TH" w:bidi="th-TH" w:eastAsia="th-TH"/>
-              </w:rPr>
               <w:t>๖๘๑</w:t>
             </w:r>
           </w:p>
         </w:tc>
         <w:tc>
           <w:tcPr>
-            <w:tcW w:type="dxa" w:w="1701"/>
-            <w:shd w:fill="FFFFFF" w:val="clear"/>
+            <w:tcW w:type="dxa" w:w="1814"/>
+            <w:shd w:val="clear" w:color="auto" w:fill="FFFFFF"/>
+            <w:vAlign w:val="center"/>
           </w:tcPr>
           <w:p>
             <w:pPr>
-              <w:jc w:val="center"/>
+              <w:pStyle w:val="ตาราง-กลาง"/>
             </w:pPr>
             <w:r>
-              <w:rPr>
-                <w:rFonts w:ascii="TH Sarabun New" w:hAnsi="TH Sarabun New" w:cs="TH Sarabun New"/>
-                <w:b w:val="0"/>
-                <w:sz w:val="28"/>
-                <w:szCs w:val="28"/>
-                <w:lang w:val="th-TH" w:bidi="th-TH" w:eastAsia="th-TH"/>
-              </w:rPr>
               <w:t>๗๒๐</w:t>
             </w:r>
           </w:p>
         </w:tc>
       </w:tr>
       <w:tr>
+        <w:trPr>
+          <w:cantSplit/>
+        </w:trPr>
         <w:tc>
           <w:tcPr>
-            <w:tcW w:type="dxa" w:w="5669"/>
-            <w:shd w:fill="EBF5FB" w:val="clear"/>
+            <w:tcW w:type="dxa" w:w="5443"/>
+            <w:shd w:val="clear" w:color="auto" w:fill="EBF5FB"/>
+            <w:vAlign w:val="center"/>
           </w:tcPr>
           <w:p>
+            <w:pPr>
+              <w:pStyle w:val="ตาราง"/>
+            </w:pPr>
             <w:r>
-              <w:rPr>
-                <w:rFonts w:ascii="TH Sarabun New" w:hAnsi="TH Sarabun New" w:cs="TH Sarabun New"/>
-                <w:b w:val="0"/>
-                <w:sz w:val="28"/>
-                <w:szCs w:val="28"/>
-                <w:lang w:val="th-TH" w:bidi="th-TH" w:eastAsia="th-TH"/>
-              </w:rPr>
               <w:t>หมวด ๒๖ สื่อมวลชน เสรีภาพสื่อ และข้อมูลข่าวสาร</w:t>
             </w:r>
           </w:p>
         </w:tc>
         <w:tc>
           <w:tcPr>
-            <w:tcW w:type="dxa" w:w="1701"/>
-            <w:shd w:fill="EBF5FB" w:val="clear"/>
+            <w:tcW w:type="dxa" w:w="1814"/>
+            <w:shd w:val="clear" w:color="auto" w:fill="EBF5FB"/>
+            <w:vAlign w:val="center"/>
           </w:tcPr>
           <w:p>
             <w:pPr>
-              <w:jc w:val="center"/>
+              <w:pStyle w:val="ตาราง-กลาง"/>
             </w:pPr>
             <w:r>
-              <w:rPr>
-                <w:rFonts w:ascii="TH Sarabun New" w:hAnsi="TH Sarabun New" w:cs="TH Sarabun New"/>
-                <w:b w:val="0"/>
-                <w:sz w:val="28"/>
-                <w:szCs w:val="28"/>
-                <w:lang w:val="th-TH" w:bidi="th-TH" w:eastAsia="th-TH"/>
-              </w:rPr>
               <w:t>๗๒๑</w:t>
             </w:r>
           </w:p>
         </w:tc>
         <w:tc>
           <w:tcPr>
-            <w:tcW w:type="dxa" w:w="1701"/>
-            <w:shd w:fill="EBF5FB" w:val="clear"/>
+            <w:tcW w:type="dxa" w:w="1814"/>
+            <w:shd w:val="clear" w:color="auto" w:fill="EBF5FB"/>
+            <w:vAlign w:val="center"/>
           </w:tcPr>
           <w:p>
             <w:pPr>
-              <w:jc w:val="center"/>
+              <w:pStyle w:val="ตาราง-กลาง"/>
             </w:pPr>
             <w:r>
-              <w:rPr>
-                <w:rFonts w:ascii="TH Sarabun New" w:hAnsi="TH Sarabun New" w:cs="TH Sarabun New"/>
-                <w:b w:val="0"/>
-                <w:sz w:val="28"/>
-                <w:szCs w:val="28"/>
-                <w:lang w:val="th-TH" w:bidi="th-TH" w:eastAsia="th-TH"/>
-              </w:rPr>
               <w:t>๗๖๐</w:t>
             </w:r>
           </w:p>
         </w:tc>
       </w:tr>
       <w:tr>
+        <w:trPr>
+          <w:cantSplit/>
+        </w:trPr>
         <w:tc>
           <w:tcPr>
-            <w:tcW w:type="dxa" w:w="5669"/>
-            <w:shd w:fill="FFFFFF" w:val="clear"/>
+            <w:tcW w:type="dxa" w:w="5443"/>
+            <w:shd w:val="clear" w:color="auto" w:fill="FFFFFF"/>
+            <w:vAlign w:val="center"/>
           </w:tcPr>
           <w:p>
+            <w:pPr>
+              <w:pStyle w:val="ตาราง"/>
+            </w:pPr>
             <w:r>
-              <w:rPr>
-                <w:rFonts w:ascii="TH Sarabun New" w:hAnsi="TH Sarabun New" w:cs="TH Sarabun New"/>
-                <w:b w:val="0"/>
-                <w:sz w:val="28"/>
-                <w:szCs w:val="28"/>
-                <w:lang w:val="th-TH" w:bidi="th-TH" w:eastAsia="th-TH"/>
-              </w:rPr>
               <w:t>หมวด ๒๗ การคลัง งบประมาณ และเศรษฐกิจภาคประชาชน</w:t>
             </w:r>
           </w:p>
         </w:tc>
         <w:tc>
           <w:tcPr>
-            <w:tcW w:type="dxa" w:w="1701"/>
-            <w:shd w:fill="FFFFFF" w:val="clear"/>
+            <w:tcW w:type="dxa" w:w="1814"/>
+            <w:shd w:val="clear" w:color="auto" w:fill="FFFFFF"/>
+            <w:vAlign w:val="center"/>
           </w:tcPr>
           <w:p>
             <w:pPr>
-              <w:jc w:val="center"/>
+              <w:pStyle w:val="ตาราง-กลาง"/>
             </w:pPr>
             <w:r>
-              <w:rPr>
-                <w:rFonts w:ascii="TH Sarabun New" w:hAnsi="TH Sarabun New" w:cs="TH Sarabun New"/>
-                <w:b w:val="0"/>
-                <w:sz w:val="28"/>
-                <w:szCs w:val="28"/>
-                <w:lang w:val="th-TH" w:bidi="th-TH" w:eastAsia="th-TH"/>
-              </w:rPr>
               <w:t>๗๖๑</w:t>
             </w:r>
           </w:p>
         </w:tc>
         <w:tc>
           <w:tcPr>
-            <w:tcW w:type="dxa" w:w="1701"/>
-            <w:shd w:fill="FFFFFF" w:val="clear"/>
+            <w:tcW w:type="dxa" w:w="1814"/>
+            <w:shd w:val="clear" w:color="auto" w:fill="FFFFFF"/>
+            <w:vAlign w:val="center"/>
           </w:tcPr>
           <w:p>
             <w:pPr>
-              <w:jc w:val="center"/>
+              <w:pStyle w:val="ตาราง-กลาง"/>
             </w:pPr>
             <w:r>
-              <w:rPr>
-                <w:rFonts w:ascii="TH Sarabun New" w:hAnsi="TH Sarabun New" w:cs="TH Sarabun New"/>
-                <w:b w:val="0"/>
-                <w:sz w:val="28"/>
-                <w:szCs w:val="28"/>
-                <w:lang w:val="th-TH" w:bidi="th-TH" w:eastAsia="th-TH"/>
-              </w:rPr>
               <w:t>๘๐๐</w:t>
             </w:r>
           </w:p>
         </w:tc>
       </w:tr>
       <w:tr>
+        <w:trPr>
+          <w:cantSplit/>
+        </w:trPr>
         <w:tc>
           <w:tcPr>
-            <w:tcW w:type="dxa" w:w="5669"/>
-            <w:shd w:fill="EBF5FB" w:val="clear"/>
+            <w:tcW w:type="dxa" w:w="5443"/>
+            <w:shd w:val="clear" w:color="auto" w:fill="EBF5FB"/>
+            <w:vAlign w:val="center"/>
           </w:tcPr>
           <w:p>
+            <w:pPr>
+              <w:pStyle w:val="ตาราง"/>
+            </w:pPr>
             <w:r>
-              <w:rPr>
-                <w:rFonts w:ascii="TH Sarabun New" w:hAnsi="TH Sarabun New" w:cs="TH Sarabun New"/>
-                <w:b w:val="0"/>
-                <w:sz w:val="28"/>
-                <w:szCs w:val="28"/>
-                <w:lang w:val="th-TH" w:bidi="th-TH" w:eastAsia="th-TH"/>
-              </w:rPr>
               <w:t>หมวด ๒๘ กองทัพ ความมั่นคง และการควบคุมโดยพลเรือน</w:t>
             </w:r>
           </w:p>
         </w:tc>
         <w:tc>
           <w:tcPr>
-            <w:tcW w:type="dxa" w:w="1701"/>
-            <w:shd w:fill="EBF5FB" w:val="clear"/>
+            <w:tcW w:type="dxa" w:w="1814"/>
+            <w:shd w:val="clear" w:color="auto" w:fill="EBF5FB"/>
+            <w:vAlign w:val="center"/>
           </w:tcPr>
           <w:p>
             <w:pPr>
-              <w:jc w:val="center"/>
+              <w:pStyle w:val="ตาราง-กลาง"/>
             </w:pPr>
             <w:r>
-              <w:rPr>
-                <w:rFonts w:ascii="TH Sarabun New" w:hAnsi="TH Sarabun New" w:cs="TH Sarabun New"/>
-                <w:b w:val="0"/>
-                <w:sz w:val="28"/>
-                <w:szCs w:val="28"/>
-                <w:lang w:val="th-TH" w:bidi="th-TH" w:eastAsia="th-TH"/>
-              </w:rPr>
               <w:t>๘๐๑</w:t>
             </w:r>
           </w:p>
         </w:tc>
         <w:tc>
           <w:tcPr>
-            <w:tcW w:type="dxa" w:w="1701"/>
-            <w:shd w:fill="EBF5FB" w:val="clear"/>
+            <w:tcW w:type="dxa" w:w="1814"/>
+            <w:shd w:val="clear" w:color="auto" w:fill="EBF5FB"/>
+            <w:vAlign w:val="center"/>
           </w:tcPr>
           <w:p>
             <w:pPr>
-              <w:jc w:val="center"/>
+              <w:pStyle w:val="ตาราง-กลาง"/>
             </w:pPr>
             <w:r>
-              <w:rPr>
-                <w:rFonts w:ascii="TH Sarabun New" w:hAnsi="TH Sarabun New" w:cs="TH Sarabun New"/>
-                <w:b w:val="0"/>
-                <w:sz w:val="28"/>
-                <w:szCs w:val="28"/>
-                <w:lang w:val="th-TH" w:bidi="th-TH" w:eastAsia="th-TH"/>
-              </w:rPr>
               <w:t>๘๔๐</w:t>
             </w:r>
           </w:p>
         </w:tc>
       </w:tr>
       <w:tr>
+        <w:trPr>
+          <w:cantSplit/>
+        </w:trPr>
         <w:tc>
           <w:tcPr>
-            <w:tcW w:type="dxa" w:w="5669"/>
-            <w:shd w:fill="FFFFFF" w:val="clear"/>
+            <w:tcW w:type="dxa" w:w="5443"/>
+            <w:shd w:val="clear" w:color="auto" w:fill="FFFFFF"/>
+            <w:vAlign w:val="center"/>
           </w:tcPr>
           <w:p>
+            <w:pPr>
+              <w:pStyle w:val="ตาราง"/>
+            </w:pPr>
             <w:r>
-              <w:rPr>
-                <w:rFonts w:ascii="TH Sarabun New" w:hAnsi="TH Sarabun New" w:cs="TH Sarabun New"/>
-                <w:b w:val="0"/>
-                <w:sz w:val="28"/>
-                <w:szCs w:val="28"/>
-                <w:lang w:val="th-TH" w:bidi="th-TH" w:eastAsia="th-TH"/>
-              </w:rPr>
               <w:t>หมวด ๒๙ ความสัมพันธ์ระหว่างประเทศและสนธิสัญญา</w:t>
             </w:r>
           </w:p>
         </w:tc>
         <w:tc>
           <w:tcPr>
-            <w:tcW w:type="dxa" w:w="1701"/>
-            <w:shd w:fill="FFFFFF" w:val="clear"/>
+            <w:tcW w:type="dxa" w:w="1814"/>
+            <w:shd w:val="clear" w:color="auto" w:fill="FFFFFF"/>
+            <w:vAlign w:val="center"/>
           </w:tcPr>
           <w:p>
             <w:pPr>
-              <w:jc w:val="center"/>
+              <w:pStyle w:val="ตาราง-กลาง"/>
             </w:pPr>
             <w:r>
-              <w:rPr>
-                <w:rFonts w:ascii="TH Sarabun New" w:hAnsi="TH Sarabun New" w:cs="TH Sarabun New"/>
-                <w:b w:val="0"/>
-                <w:sz w:val="28"/>
-                <w:szCs w:val="28"/>
-                <w:lang w:val="th-TH" w:bidi="th-TH" w:eastAsia="th-TH"/>
-              </w:rPr>
               <w:t>๘๔๑</w:t>
             </w:r>
           </w:p>
         </w:tc>
         <w:tc>
           <w:tcPr>
-            <w:tcW w:type="dxa" w:w="1701"/>
-            <w:shd w:fill="FFFFFF" w:val="clear"/>
+            <w:tcW w:type="dxa" w:w="1814"/>
+            <w:shd w:val="clear" w:color="auto" w:fill="FFFFFF"/>
+            <w:vAlign w:val="center"/>
           </w:tcPr>
           <w:p>
             <w:pPr>
-              <w:jc w:val="center"/>
+              <w:pStyle w:val="ตาราง-กลาง"/>
             </w:pPr>
             <w:r>
-              <w:rPr>
-                <w:rFonts w:ascii="TH Sarabun New" w:hAnsi="TH Sarabun New" w:cs="TH Sarabun New"/>
-                <w:b w:val="0"/>
-                <w:sz w:val="28"/>
-                <w:szCs w:val="28"/>
-                <w:lang w:val="th-TH" w:bidi="th-TH" w:eastAsia="th-TH"/>
-              </w:rPr>
               <w:t>๘๗๙</w:t>
             </w:r>
           </w:p>
         </w:tc>
       </w:tr>
       <w:tr>
+        <w:trPr>
+          <w:cantSplit/>
+        </w:trPr>
         <w:tc>
           <w:tcPr>
-            <w:tcW w:type="dxa" w:w="5669"/>
-            <w:shd w:fill="EBF5FB" w:val="clear"/>
+            <w:tcW w:type="dxa" w:w="5443"/>
+            <w:shd w:val="clear" w:color="auto" w:fill="EBF5FB"/>
+            <w:vAlign w:val="center"/>
           </w:tcPr>
           <w:p>
+            <w:pPr>
+              <w:pStyle w:val="ตาราง"/>
+            </w:pPr>
             <w:r>
-              <w:rPr>
-                <w:rFonts w:ascii="TH Sarabun New" w:hAnsi="TH Sarabun New" w:cs="TH Sarabun New"/>
-                <w:b w:val="0"/>
-                <w:sz w:val="28"/>
-                <w:szCs w:val="28"/>
-                <w:lang w:val="th-TH" w:bidi="th-TH" w:eastAsia="th-TH"/>
-              </w:rPr>
               <w:t>หมวด ๓๐ สิทธิวัฒนธรรม ภาษา และชาติพันธุ์</w:t>
             </w:r>
           </w:p>
         </w:tc>
         <w:tc>
           <w:tcPr>
-            <w:tcW w:type="dxa" w:w="1701"/>
-            <w:shd w:fill="EBF5FB" w:val="clear"/>
+            <w:tcW w:type="dxa" w:w="1814"/>
+            <w:shd w:val="clear" w:color="auto" w:fill="EBF5FB"/>
+            <w:vAlign w:val="center"/>
           </w:tcPr>
           <w:p>
             <w:pPr>
-              <w:jc w:val="center"/>
+              <w:pStyle w:val="ตาราง-กลาง"/>
             </w:pPr>
             <w:r>
-              <w:rPr>
-                <w:rFonts w:ascii="TH Sarabun New" w:hAnsi="TH Sarabun New" w:cs="TH Sarabun New"/>
-                <w:b w:val="0"/>
-                <w:sz w:val="28"/>
-                <w:szCs w:val="28"/>
-                <w:lang w:val="th-TH" w:bidi="th-TH" w:eastAsia="th-TH"/>
-              </w:rPr>
               <w:t>๘๘๐</w:t>
             </w:r>
           </w:p>
         </w:tc>
         <w:tc>
           <w:tcPr>
-            <w:tcW w:type="dxa" w:w="1701"/>
-            <w:shd w:fill="EBF5FB" w:val="clear"/>
+            <w:tcW w:type="dxa" w:w="1814"/>
+            <w:shd w:val="clear" w:color="auto" w:fill="EBF5FB"/>
+            <w:vAlign w:val="center"/>
           </w:tcPr>
           <w:p>
             <w:pPr>
-              <w:jc w:val="center"/>
+              <w:pStyle w:val="ตาราง-กลาง"/>
             </w:pPr>
             <w:r>
-              <w:rPr>
-                <w:rFonts w:ascii="TH Sarabun New" w:hAnsi="TH Sarabun New" w:cs="TH Sarabun New"/>
-                <w:b w:val="0"/>
-                <w:sz w:val="28"/>
-                <w:szCs w:val="28"/>
-                <w:lang w:val="th-TH" w:bidi="th-TH" w:eastAsia="th-TH"/>
-              </w:rPr>
               <w:t>๙๑๘</w:t>
             </w:r>
           </w:p>
         </w:tc>
       </w:tr>
       <w:tr>
+        <w:trPr>
+          <w:cantSplit/>
+        </w:trPr>
         <w:tc>
           <w:tcPr>
-            <w:tcW w:type="dxa" w:w="5669"/>
-            <w:shd w:fill="FFFFFF" w:val="clear"/>
+            <w:tcW w:type="dxa" w:w="5443"/>
+            <w:shd w:val="clear" w:color="auto" w:fill="FFFFFF"/>
+            <w:vAlign w:val="center"/>
           </w:tcPr>
           <w:p>
+            <w:pPr>
+              <w:pStyle w:val="ตาราง"/>
+            </w:pPr>
             <w:r>
-              <w:rPr>
-                <w:rFonts w:ascii="TH Sarabun New" w:hAnsi="TH Sarabun New" w:cs="TH Sarabun New"/>
-                <w:b w:val="0"/>
-                <w:sz w:val="28"/>
-                <w:szCs w:val="28"/>
-                <w:lang w:val="th-TH" w:bidi="th-TH" w:eastAsia="th-TH"/>
-              </w:rPr>
               <w:t>หมวด ๓๑ ที่อยู่อาศัยและการพัฒนาเมือง</w:t>
             </w:r>
           </w:p>
         </w:tc>
         <w:tc>
           <w:tcPr>
-            <w:tcW w:type="dxa" w:w="1701"/>
-            <w:shd w:fill="FFFFFF" w:val="clear"/>
+            <w:tcW w:type="dxa" w:w="1814"/>
+            <w:shd w:val="clear" w:color="auto" w:fill="FFFFFF"/>
+            <w:vAlign w:val="center"/>
           </w:tcPr>
           <w:p>
             <w:pPr>
-              <w:jc w:val="center"/>
+              <w:pStyle w:val="ตาราง-กลาง"/>
             </w:pPr>
             <w:r>
-              <w:rPr>
-                <w:rFonts w:ascii="TH Sarabun New" w:hAnsi="TH Sarabun New" w:cs="TH Sarabun New"/>
-                <w:b w:val="0"/>
-                <w:sz w:val="28"/>
-                <w:szCs w:val="28"/>
-                <w:lang w:val="th-TH" w:bidi="th-TH" w:eastAsia="th-TH"/>
-              </w:rPr>
               <w:t>๙๑๙</w:t>
             </w:r>
           </w:p>
         </w:tc>
         <w:tc>
           <w:tcPr>
-            <w:tcW w:type="dxa" w:w="1701"/>
-            <w:shd w:fill="FFFFFF" w:val="clear"/>
+            <w:tcW w:type="dxa" w:w="1814"/>
+            <w:shd w:val="clear" w:color="auto" w:fill="FFFFFF"/>
+            <w:vAlign w:val="center"/>
           </w:tcPr>
           <w:p>
             <w:pPr>
-              <w:jc w:val="center"/>
+              <w:pStyle w:val="ตาราง-กลาง"/>
             </w:pPr>
             <w:r>
-              <w:rPr>
-                <w:rFonts w:ascii="TH Sarabun New" w:hAnsi="TH Sarabun New" w:cs="TH Sarabun New"/>
-                <w:b w:val="0"/>
-                <w:sz w:val="28"/>
-                <w:szCs w:val="28"/>
-                <w:lang w:val="th-TH" w:bidi="th-TH" w:eastAsia="th-TH"/>
-              </w:rPr>
               <w:t>๙๕๗</w:t>
             </w:r>
           </w:p>
         </w:tc>
       </w:tr>
       <w:tr>
+        <w:trPr>
+          <w:cantSplit/>
+        </w:trPr>
         <w:tc>
           <w:tcPr>
-            <w:tcW w:type="dxa" w:w="5669"/>
-            <w:shd w:fill="EBF5FB" w:val="clear"/>
+            <w:tcW w:type="dxa" w:w="5443"/>
+            <w:shd w:val="clear" w:color="auto" w:fill="EBF5FB"/>
+            <w:vAlign w:val="center"/>
           </w:tcPr>
           <w:p>
+            <w:pPr>
+              <w:pStyle w:val="ตาราง"/>
+            </w:pPr>
             <w:r>
-              <w:rPr>
-                <w:rFonts w:ascii="TH Sarabun New" w:hAnsi="TH Sarabun New" w:cs="TH Sarabun New"/>
-                <w:b w:val="0"/>
-                <w:sz w:val="28"/>
-                <w:szCs w:val="28"/>
-                <w:lang w:val="th-TH" w:bidi="th-TH" w:eastAsia="th-TH"/>
-              </w:rPr>
               <w:t>หมวด ๓๒ พลังงาน สาธารณูปโภค และการขนส่ง</w:t>
             </w:r>
           </w:p>
         </w:tc>
         <w:tc>
           <w:tcPr>
-            <w:tcW w:type="dxa" w:w="1701"/>
-            <w:shd w:fill="EBF5FB" w:val="clear"/>
+            <w:tcW w:type="dxa" w:w="1814"/>
+            <w:shd w:val="clear" w:color="auto" w:fill="EBF5FB"/>
+            <w:vAlign w:val="center"/>
           </w:tcPr>
           <w:p>
             <w:pPr>
-              <w:jc w:val="center"/>
+              <w:pStyle w:val="ตาราง-กลาง"/>
             </w:pPr>
             <w:r>
-              <w:rPr>
-                <w:rFonts w:ascii="TH Sarabun New" w:hAnsi="TH Sarabun New" w:cs="TH Sarabun New"/>
-                <w:b w:val="0"/>
-                <w:sz w:val="28"/>
-                <w:szCs w:val="28"/>
-                <w:lang w:val="th-TH" w:bidi="th-TH" w:eastAsia="th-TH"/>
-              </w:rPr>
               <w:t>๙๕๘</w:t>
             </w:r>
           </w:p>
         </w:tc>
         <w:tc>
           <w:tcPr>
-            <w:tcW w:type="dxa" w:w="1701"/>
-            <w:shd w:fill="EBF5FB" w:val="clear"/>
+            <w:tcW w:type="dxa" w:w="1814"/>
+            <w:shd w:val="clear" w:color="auto" w:fill="EBF5FB"/>
+            <w:vAlign w:val="center"/>
           </w:tcPr>
           <w:p>
             <w:pPr>
-              <w:jc w:val="center"/>
+              <w:pStyle w:val="ตาราง-กลาง"/>
             </w:pPr>
             <w:r>
-              <w:rPr>
-                <w:rFonts w:ascii="TH Sarabun New" w:hAnsi="TH Sarabun New" w:cs="TH Sarabun New"/>
-                <w:b w:val="0"/>
-                <w:sz w:val="28"/>
-                <w:szCs w:val="28"/>
-                <w:lang w:val="th-TH" w:bidi="th-TH" w:eastAsia="th-TH"/>
-              </w:rPr>
               <w:t>๙๙๖</w:t>
             </w:r>
           </w:p>
         </w:tc>
       </w:tr>
       <w:tr>
+        <w:trPr>
+          <w:cantSplit/>
+        </w:trPr>
         <w:tc>
           <w:tcPr>
-            <w:tcW w:type="dxa" w:w="5669"/>
-            <w:shd w:fill="FFFFFF" w:val="clear"/>
+            <w:tcW w:type="dxa" w:w="5443"/>
+            <w:shd w:val="clear" w:color="auto" w:fill="FFFFFF"/>
+            <w:vAlign w:val="center"/>
           </w:tcPr>
           <w:p>
+            <w:pPr>
+              <w:pStyle w:val="ตาราง"/>
+            </w:pPr>
             <w:r>
-              <w:rPr>
-                <w:rFonts w:ascii="TH Sarabun New" w:hAnsi="TH Sarabun New" w:cs="TH Sarabun New"/>
-                <w:b w:val="0"/>
-                <w:sz w:val="28"/>
-                <w:szCs w:val="28"/>
-                <w:lang w:val="th-TH" w:bidi="th-TH" w:eastAsia="th-TH"/>
-              </w:rPr>
               <w:t>หมวด ๓๓ กีฬา นันทนาการ และการท่องเที่ยว</w:t>
             </w:r>
           </w:p>
         </w:tc>
         <w:tc>
           <w:tcPr>
-            <w:tcW w:type="dxa" w:w="1701"/>
-            <w:shd w:fill="FFFFFF" w:val="clear"/>
+            <w:tcW w:type="dxa" w:w="1814"/>
+            <w:shd w:val="clear" w:color="auto" w:fill="FFFFFF"/>
+            <w:vAlign w:val="center"/>
           </w:tcPr>
           <w:p>
             <w:pPr>
-              <w:jc w:val="center"/>
+              <w:pStyle w:val="ตาราง-กลาง"/>
             </w:pPr>
             <w:r>
-              <w:rPr>
-                <w:rFonts w:ascii="TH Sarabun New" w:hAnsi="TH Sarabun New" w:cs="TH Sarabun New"/>
-                <w:b w:val="0"/>
-                <w:sz w:val="28"/>
-                <w:szCs w:val="28"/>
-                <w:lang w:val="th-TH" w:bidi="th-TH" w:eastAsia="th-TH"/>
-              </w:rPr>
               <w:t>๙๙๗</w:t>
             </w:r>
           </w:p>
         </w:tc>
         <w:tc>
           <w:tcPr>
-            <w:tcW w:type="dxa" w:w="1701"/>
-            <w:shd w:fill="FFFFFF" w:val="clear"/>
+            <w:tcW w:type="dxa" w:w="1814"/>
+            <w:shd w:val="clear" w:color="auto" w:fill="FFFFFF"/>
+            <w:vAlign w:val="center"/>
           </w:tcPr>
           <w:p>
             <w:pPr>
-              <w:jc w:val="center"/>
+              <w:pStyle w:val="ตาราง-กลาง"/>
             </w:pPr>
             <w:r>
-              <w:rPr>
-                <w:rFonts w:ascii="TH Sarabun New" w:hAnsi="TH Sarabun New" w:cs="TH Sarabun New"/>
-                <w:b w:val="0"/>
-                <w:sz w:val="28"/>
-                <w:szCs w:val="28"/>
-                <w:lang w:val="th-TH" w:bidi="th-TH" w:eastAsia="th-TH"/>
-              </w:rPr>
               <w:t>๑๐๓๕</w:t>
             </w:r>
           </w:p>
         </w:tc>
       </w:tr>
       <w:tr>
+        <w:trPr>
+          <w:cantSplit/>
+        </w:trPr>
         <w:tc>
           <w:tcPr>
-            <w:tcW w:type="dxa" w:w="5669"/>
-            <w:shd w:fill="EBF5FB" w:val="clear"/>
+            <w:tcW w:type="dxa" w:w="5443"/>
+            <w:shd w:val="clear" w:color="auto" w:fill="EBF5FB"/>
+            <w:vAlign w:val="center"/>
           </w:tcPr>
           <w:p>
+            <w:pPr>
+              <w:pStyle w:val="ตาราง"/>
+            </w:pPr>
             <w:r>
-              <w:rPr>
-                <w:rFonts w:ascii="TH Sarabun New" w:hAnsi="TH Sarabun New" w:cs="TH Sarabun New"/>
-                <w:b w:val="0"/>
-                <w:sz w:val="28"/>
-                <w:szCs w:val="28"/>
-                <w:lang w:val="th-TH" w:bidi="th-TH" w:eastAsia="th-TH"/>
-              </w:rPr>
               <w:t>หมวด ๓๔ สถานการณ์ฉุกเฉินและภัยพิบัติ</w:t>
             </w:r>
           </w:p>
         </w:tc>
         <w:tc>
           <w:tcPr>
-            <w:tcW w:type="dxa" w:w="1701"/>
-            <w:shd w:fill="EBF5FB" w:val="clear"/>
+            <w:tcW w:type="dxa" w:w="1814"/>
+            <w:shd w:val="clear" w:color="auto" w:fill="EBF5FB"/>
+            <w:vAlign w:val="center"/>
           </w:tcPr>
           <w:p>
             <w:pPr>
-              <w:jc w:val="center"/>
+              <w:pStyle w:val="ตาราง-กลาง"/>
             </w:pPr>
             <w:r>
-              <w:rPr>
-                <w:rFonts w:ascii="TH Sarabun New" w:hAnsi="TH Sarabun New" w:cs="TH Sarabun New"/>
-                <w:b w:val="0"/>
-                <w:sz w:val="28"/>
-                <w:szCs w:val="28"/>
-                <w:lang w:val="th-TH" w:bidi="th-TH" w:eastAsia="th-TH"/>
-              </w:rPr>
               <w:t>๑๐๓๖</w:t>
             </w:r>
           </w:p>
         </w:tc>
         <w:tc>
           <w:tcPr>
-            <w:tcW w:type="dxa" w:w="1701"/>
-            <w:shd w:fill="EBF5FB" w:val="clear"/>
+            <w:tcW w:type="dxa" w:w="1814"/>
+            <w:shd w:val="clear" w:color="auto" w:fill="EBF5FB"/>
+            <w:vAlign w:val="center"/>
           </w:tcPr>
           <w:p>
             <w:pPr>
-              <w:jc w:val="center"/>
+              <w:pStyle w:val="ตาราง-กลาง"/>
             </w:pPr>
             <w:r>
-              <w:rPr>
-                <w:rFonts w:ascii="TH Sarabun New" w:hAnsi="TH Sarabun New" w:cs="TH Sarabun New"/>
-                <w:b w:val="0"/>
-                <w:sz w:val="28"/>
-                <w:szCs w:val="28"/>
-                <w:lang w:val="th-TH" w:bidi="th-TH" w:eastAsia="th-TH"/>
-              </w:rPr>
               <w:t>๑๐๗๔</w:t>
             </w:r>
           </w:p>
         </w:tc>
       </w:tr>
       <w:tr>
+        <w:trPr>
+          <w:cantSplit/>
+        </w:trPr>
         <w:tc>
           <w:tcPr>
-            <w:tcW w:type="dxa" w:w="5669"/>
-            <w:shd w:fill="FFFFFF" w:val="clear"/>
+            <w:tcW w:type="dxa" w:w="5443"/>
+            <w:shd w:val="clear" w:color="auto" w:fill="FFFFFF"/>
+            <w:vAlign w:val="center"/>
           </w:tcPr>
           <w:p>
+            <w:pPr>
+              <w:pStyle w:val="ตาราง"/>
+            </w:pPr>
             <w:r>
-              <w:rPr>
-                <w:rFonts w:ascii="TH Sarabun New" w:hAnsi="TH Sarabun New" w:cs="TH Sarabun New"/>
-                <w:b w:val="0"/>
-                <w:sz w:val="28"/>
-                <w:szCs w:val="28"/>
-                <w:lang w:val="th-TH" w:bidi="th-TH" w:eastAsia="th-TH"/>
-              </w:rPr>
               <w:t>หมวด ๓๕ ความยุติธรรมในระยะเปลี่ยนผ่าน</w:t>
             </w:r>
           </w:p>
         </w:tc>
         <w:tc>
           <w:tcPr>
-            <w:tcW w:type="dxa" w:w="1701"/>
-            <w:shd w:fill="FFFFFF" w:val="clear"/>
+            <w:tcW w:type="dxa" w:w="1814"/>
+            <w:shd w:val="clear" w:color="auto" w:fill="FFFFFF"/>
+            <w:vAlign w:val="center"/>
           </w:tcPr>
           <w:p>
             <w:pPr>
-              <w:jc w:val="center"/>
+              <w:pStyle w:val="ตาราง-กลาง"/>
             </w:pPr>
             <w:r>
-              <w:rPr>
-                <w:rFonts w:ascii="TH Sarabun New" w:hAnsi="TH Sarabun New" w:cs="TH Sarabun New"/>
-                <w:b w:val="0"/>
-                <w:sz w:val="28"/>
-                <w:szCs w:val="28"/>
-                <w:lang w:val="th-TH" w:bidi="th-TH" w:eastAsia="th-TH"/>
-              </w:rPr>
               <w:t>๑๐๗๕</w:t>
             </w:r>
           </w:p>
         </w:tc>
         <w:tc>
           <w:tcPr>
-            <w:tcW w:type="dxa" w:w="1701"/>
-            <w:shd w:fill="FFFFFF" w:val="clear"/>
+            <w:tcW w:type="dxa" w:w="1814"/>
+            <w:shd w:val="clear" w:color="auto" w:fill="FFFFFF"/>
+            <w:vAlign w:val="center"/>
           </w:tcPr>
           <w:p>
             <w:pPr>
-              <w:jc w:val="center"/>
+              <w:pStyle w:val="ตาราง-กลาง"/>
             </w:pPr>
             <w:r>
-              <w:rPr>
-                <w:rFonts w:ascii="TH Sarabun New" w:hAnsi="TH Sarabun New" w:cs="TH Sarabun New"/>
-                <w:b w:val="0"/>
-                <w:sz w:val="28"/>
-                <w:szCs w:val="28"/>
-                <w:lang w:val="th-TH" w:bidi="th-TH" w:eastAsia="th-TH"/>
-              </w:rPr>
               <w:t>๑๑๑๓</w:t>
             </w:r>
           </w:p>
         </w:tc>
       </w:tr>
       <w:tr>
+        <w:trPr>
+          <w:cantSplit/>
+        </w:trPr>
         <w:tc>
           <w:tcPr>
-            <w:tcW w:type="dxa" w:w="5669"/>
-            <w:shd w:fill="EBF5FB" w:val="clear"/>
+            <w:tcW w:type="dxa" w:w="5443"/>
+            <w:shd w:val="clear" w:color="auto" w:fill="EBF5FB"/>
+            <w:vAlign w:val="center"/>
           </w:tcPr>
           <w:p>
+            <w:pPr>
+              <w:pStyle w:val="ตาราง"/>
+            </w:pPr>
             <w:r>
-              <w:rPr>
-                <w:rFonts w:ascii="TH Sarabun New" w:hAnsi="TH Sarabun New" w:cs="TH Sarabun New"/>
-                <w:b w:val="0"/>
-                <w:sz w:val="28"/>
-                <w:szCs w:val="28"/>
-                <w:lang w:val="th-TH" w:bidi="th-TH" w:eastAsia="th-TH"/>
-              </w:rPr>
               <w:t>หมวด ๓๖ บทลงโทษและมาตรการบังคับตามรัฐธรรมนูญ</w:t>
             </w:r>
           </w:p>
         </w:tc>
         <w:tc>
           <w:tcPr>
-            <w:tcW w:type="dxa" w:w="1701"/>
-            <w:shd w:fill="EBF5FB" w:val="clear"/>
+            <w:tcW w:type="dxa" w:w="1814"/>
+            <w:shd w:val="clear" w:color="auto" w:fill="EBF5FB"/>
+            <w:vAlign w:val="center"/>
           </w:tcPr>
           <w:p>
             <w:pPr>
-              <w:jc w:val="center"/>
+              <w:pStyle w:val="ตาราง-กลาง"/>
             </w:pPr>
             <w:r>
-              <w:rPr>
-                <w:rFonts w:ascii="TH Sarabun New" w:hAnsi="TH Sarabun New" w:cs="TH Sarabun New"/>
-                <w:b w:val="0"/>
-                <w:sz w:val="28"/>
-                <w:szCs w:val="28"/>
-                <w:lang w:val="th-TH" w:bidi="th-TH" w:eastAsia="th-TH"/>
-              </w:rPr>
               <w:t>๑๑๑๔</w:t>
             </w:r>
           </w:p>
         </w:tc>
         <w:tc>
           <w:tcPr>
-            <w:tcW w:type="dxa" w:w="1701"/>
-            <w:shd w:fill="EBF5FB" w:val="clear"/>
+            <w:tcW w:type="dxa" w:w="1814"/>
+            <w:shd w:val="clear" w:color="auto" w:fill="EBF5FB"/>
+            <w:vAlign w:val="center"/>
           </w:tcPr>
           <w:p>
             <w:pPr>
-              <w:jc w:val="center"/>
+              <w:pStyle w:val="ตาราง-กลาง"/>
             </w:pPr>
             <w:r>
-              <w:rPr>
-                <w:rFonts w:ascii="TH Sarabun New" w:hAnsi="TH Sarabun New" w:cs="TH Sarabun New"/>
-                <w:b w:val="0"/>
-                <w:sz w:val="28"/>
-                <w:szCs w:val="28"/>
-                <w:lang w:val="th-TH" w:bidi="th-TH" w:eastAsia="th-TH"/>
-              </w:rPr>
               <w:t>๑๑๕๒</w:t>
             </w:r>
           </w:p>
         </w:tc>
       </w:tr>
       <w:tr>
+        <w:trPr>
+          <w:cantSplit/>
+        </w:trPr>
         <w:tc>
           <w:tcPr>
-            <w:tcW w:type="dxa" w:w="5669"/>
-            <w:shd w:fill="FFFFFF" w:val="clear"/>
+            <w:tcW w:type="dxa" w:w="5443"/>
+            <w:shd w:val="clear" w:color="auto" w:fill="FFFFFF"/>
+            <w:vAlign w:val="center"/>
           </w:tcPr>
           <w:p>
+            <w:pPr>
+              <w:pStyle w:val="ตาราง"/>
+            </w:pPr>
             <w:r>
-              <w:rPr>
-                <w:rFonts w:ascii="TH Sarabun New" w:hAnsi="TH Sarabun New" w:cs="TH Sarabun New"/>
-                <w:b w:val="0"/>
-                <w:sz w:val="28"/>
-                <w:szCs w:val="28"/>
-                <w:lang w:val="th-TH" w:bidi="th-TH" w:eastAsia="th-TH"/>
-              </w:rPr>
               <w:t>หมวดพิเศษ อำนาจสูงสุดพิทักษ์ประชาชน (The Supreme People's Power)</w:t>
             </w:r>
           </w:p>
         </w:tc>
         <w:tc>
           <w:tcPr>
-            <w:tcW w:type="dxa" w:w="1701"/>
-            <w:shd w:fill="FFFFFF" w:val="clear"/>
+            <w:tcW w:type="dxa" w:w="1814"/>
+            <w:shd w:val="clear" w:color="auto" w:fill="FFFFFF"/>
+            <w:vAlign w:val="center"/>
           </w:tcPr>
           <w:p>
             <w:pPr>
-              <w:jc w:val="center"/>
+              <w:pStyle w:val="ตาราง-กลาง"/>
             </w:pPr>
             <w:r>
-              <w:rPr>
-                <w:rFonts w:ascii="TH Sarabun New" w:hAnsi="TH Sarabun New" w:cs="TH Sarabun New"/>
-                <w:b w:val="0"/>
-                <w:sz w:val="28"/>
-                <w:szCs w:val="28"/>
-                <w:lang w:val="th-TH" w:bidi="th-TH" w:eastAsia="th-TH"/>
-              </w:rPr>
               <w:t>๑๑๕๓</w:t>
             </w:r>
           </w:p>
         </w:tc>
         <w:tc>
           <w:tcPr>
-            <w:tcW w:type="dxa" w:w="1701"/>
-            <w:shd w:fill="FFFFFF" w:val="clear"/>
+            <w:tcW w:type="dxa" w:w="1814"/>
+            <w:shd w:val="clear" w:color="auto" w:fill="FFFFFF"/>
+            <w:vAlign w:val="center"/>
           </w:tcPr>
           <w:p>
             <w:pPr>
-              <w:jc w:val="center"/>
+              <w:pStyle w:val="ตาราง-กลาง"/>
             </w:pPr>
             <w:r>
-              <w:rPr>
-                <w:rFonts w:ascii="TH Sarabun New" w:hAnsi="TH Sarabun New" w:cs="TH Sarabun New"/>
-                <w:b w:val="0"/>
-                <w:sz w:val="28"/>
-                <w:szCs w:val="28"/>
-                <w:lang w:val="th-TH" w:bidi="th-TH" w:eastAsia="th-TH"/>
-              </w:rPr>
               <w:t>๑๑๖๐</w:t>
             </w:r>
           </w:p>
@@ -2484,71 +1999,33 @@
     </w:tbl>
     <w:p>
       <w:pPr>
-        <w:spacing w:before="360"/>
-        <w:rPr>
-          <w:noProof/>
-        </w:rPr>
+        <w:pStyle w:val="สรุป"/>
       </w:pPr>
       <w:r>
-        <w:rPr>
-          <w:rFonts w:ascii="TH Sarabun New" w:hAnsi="TH Sarabun New" w:cs="TH Sarabun New"/>
-          <w:b/>
-          <w:sz w:val="32"/>
-          <w:szCs w:val="32"/>
-          <w:bCs/>
-          <w:lang w:val="th-TH" w:bidi="th-TH" w:eastAsia="th-TH"/>
-        </w:rPr>
         <w:t>รวมทั้งสิ้น ๓๘ หมวด  ๑๑๖๐ มาตรา</w:t>
       </w:r>
     </w:p>
     <w:sectPr>
       <w:headerReference w:type="default" r:id="rId9"/>
-      <w:footerReference w:type="default" r:id="rId10"/>
       <w:pgSz w:w="11906" w:h="16838"/>
-      <w:pgMar w:top="1440" w:right="1440" w:bottom="1440" w:left="1797" w:header="720" w:footer="720" w:gutter="0"/>
+      <w:pgMar w:top="1417" w:right="1134" w:bottom="1134" w:left="1701" w:header="709" w:footer="567" w:gutter="0"/>
       <w:cols w:space="720"/>
       <w:docGrid w:linePitch="360"/>
+      <w:pgNumType w:fmt="thaiNumbers"/>
     </w:sectPr>
   </w:body>
 </w:document>
 </file>
 
-<file path=word/footer1.xml><?xml version="1.0" encoding="utf-8"?>
-<w:ftr xmlns:m="http://schemas.openxmlformats.org/officeDocument/2006/math" xmlns:mc="http://schemas.openxmlformats.org/markup-compatibility/2006" xmlns:mo="http://schemas.microsoft.com/office/mac/office/2008/main" xmlns:mv="urn:schemas-microsoft-com:mac:vml" xmlns:o="urn:schemas-microsoft-com:office:office" xmlns:r="http://schemas.openxmlformats.org/officeDocument/2006/relationships" xmlns:v="urn:schemas-microsoft-com:vml" xmlns:w10="urn:schemas-microsoft-com:office:word" xmlns:w14="http://schemas.microsoft.com/office/word/2010/wordml" xmlns:w="http://schemas.openxmlformats.org/wordprocessingml/2006/main" xmlns:wne="http://schemas.microsoft.com/office/word/2006/wordml" xmlns:wp14="http://schemas.microsoft.com/office/word/2010/wordprocessingDrawing" xmlns:wp="http://schemas.openxmlformats.org/drawingml/2006/wordprocessingDrawing" xmlns:wpc="http://schemas.microsoft.com/office/word/2010/wordprocessingCanvas" xmlns:wpg="http://schemas.microsoft.com/office/word/2010/wordprocessingGroup" xmlns:wpi="http://schemas.microsoft.com/office/word/2010/wordprocessingInk" xmlns:wps="http://schemas.microsoft.com/office/word/2010/wordprocessingShape" mc:Ignorable="w14 wp14">
-  <w:p>
-    <w:pPr>
-      <w:pStyle w:val="Footer"/>
-      <w:jc w:val="center"/>
-    </w:pPr>
-    <w:r>
-      <w:fldChar w:fldCharType="begin"/>
-    </w:r>
-    <w:r>
-      <w:instrText xml:space="preserve"> PAGE </w:instrText>
-    </w:r>
-    <w:r>
-      <w:fldChar w:fldCharType="end"/>
-    </w:r>
-  </w:p>
-</w:ftr>
-</file>
-
 <file path=word/header1.xml><?xml version="1.0" encoding="utf-8"?>
 <w:hdr xmlns:m="http://schemas.openxmlformats.org/officeDocument/2006/math" xmlns:mc="http://schemas.openxmlformats.org/markup-compatibility/2006" xmlns:mo="http://schemas.microsoft.com/office/mac/office/2008/main" xmlns:mv="urn:schemas-microsoft-com:mac:vml" xmlns:o="urn:schemas-microsoft-com:office:office" xmlns:r="http://schemas.openxmlformats.org/officeDocument/2006/relationships" xmlns:v="urn:schemas-microsoft-com:vml" xmlns:w10="urn:schemas-microsoft-com:office:word" xmlns:w14="http://schemas.microsoft.com/office/word/2010/wordml" xmlns:w="http://schemas.openxmlformats.org/wordprocessingml/2006/main" xmlns:wne="http://schemas.microsoft.com/office/word/2006/wordml" xmlns:wp14="http://schemas.microsoft.com/office/word/2010/wordprocessingDrawing" xmlns:wp="http://schemas.openxmlformats.org/drawingml/2006/wordprocessingDrawing" xmlns:wpc="http://schemas.microsoft.com/office/word/2010/wordprocessingCanvas" xmlns:wpg="http://schemas.microsoft.com/office/word/2010/wordprocessingGroup" xmlns:wpi="http://schemas.microsoft.com/office/word/2010/wordprocessingInk" xmlns:wps="http://schemas.microsoft.com/office/word/2010/wordprocessingShape" mc:Ignorable="w14 wp14">
   <w:p>
     <w:pPr>
-      <w:pStyle w:val="Header"/>
+      <w:pStyle w:val="หัวกระดาษ"/>
       <w:jc w:val="center"/>
     </w:pPr>
     <w:r>
-      <w:rPr>
-        <w:rFonts w:ascii="TH Sarabun New" w:hAnsi="TH Sarabun New" w:cs="TH Sarabun New"/>
-        <w:b w:val="0"/>
-        <w:sz w:val="24"/>
-        <w:szCs w:val="24"/>
-        <w:lang w:val="th-TH" w:bidi="th-TH" w:eastAsia="th-TH"/>
-      </w:rPr>
-      <w:t>ราชกิจจานุเบกษา  ฉบับพิเศษ</w:t>
+      <w:t>รัฐธรรมนูญแห่งราชอาณาจักรไทย พุทธศักราช ๒๕๒๕</w:t>
     </w:r>
   </w:p>
 </w:hdr>
@@ -2762,19 +2239,16 @@
   <w:docDefaults>
     <w:rPrDefault>
       <w:rPr>
-        <w:rFonts w:asciiTheme="minorHAnsi" w:eastAsiaTheme="minorEastAsia" w:hAnsiTheme="minorHAnsi" w:cstheme="minorBidi"/>
-        <w:sz w:val="22"/>
-        <w:szCs w:val="22"/>
-        <w:lang w:val="en-US" w:eastAsia="en-US" w:bidi="ar-SA"/>
-        <w:rFonts w:ascii="TH Sarabun New" w:hAnsi="TH Sarabun New" w:cs="TH Sarabun New" w:eastAsia="TH Sarabun New"/>
+        <w:rFonts w:ascii="TH Sarabun New" w:hAnsi="TH Sarabun New" w:eastAsia="TH Sarabun New" w:cs="TH Sarabun New"/>
+        <w:noProof/>
         <w:sz w:val="32"/>
         <w:szCs w:val="32"/>
-        <w:lang w:val="th-TH" w:bidi="th-TH" w:eastAsia="th-TH"/>
+        <w:lang w:val="th-TH" w:eastAsia="th-TH" w:bidi="th-TH"/>
       </w:rPr>
     </w:rPrDefault>
     <w:pPrDefault>
       <w:pPr>
-        <w:spacing w:after="200" w:line="276" w:lineRule="auto"/>
+        <w:spacing w:after="0" w:line="240" w:lineRule="auto"/>
       </w:pPr>
     </w:pPrDefault>
   </w:docDefaults>
@@ -2922,11 +2396,13 @@
     <w:qFormat/>
     <w:rsid w:val="00FC693F"/>
     <w:pPr>
-      <w:spacing w:before="0" w:after="60" w:line="276" w:lineRule="auto"/>
+      <w:widowControl/>
+      <w:spacing w:before="0" w:after="0" w:line="240" w:lineRule="auto"/>
     </w:pPr>
     <w:rPr>
-      <w:rFonts w:ascii="TH Sarabun New" w:hAnsi="TH Sarabun New" w:cs="TH Sarabun New"/>
+      <w:rFonts w:ascii="TH Sarabun New" w:hAnsi="TH Sarabun New" w:eastAsia="TH Sarabun New" w:cs="TH Sarabun New"/>
       <w:sz w:val="32"/>
+      <w:szCs w:val="32"/>
     </w:rPr>
   </w:style>
   <w:style w:type="paragraph" w:styleId="Header">
@@ -14610,6 +14086,119 @@
         <w:shd w:val="clear" w:color="auto" w:fill="FBCAA2" w:themeFill="accent6" w:themeFillTint="7F"/>
       </w:tcPr>
     </w:tblStylePr>
+  </w:style>
+  <w:style w:type="paragraph" w:customStyle="1" w:styleId="หัวกระดาษ">
+    <w:name w:val="หัวกระดาษ"/>
+    <w:basedOn w:val="Normal"/>
+    <w:qFormat/>
+    <w:pPr>
+      <w:keepNext w:val="0"/>
+      <w:pageBreakBefore w:val="0"/>
+      <w:tabs>
+        <w:tab w:pos="4535" w:val="center"/>
+        <w:tab w:pos="9071" w:val="right"/>
+      </w:tabs>
+      <w:spacing w:before="0" w:after="0"/>
+      <w:pBdr>
+        <w:bottom w:val="single" w:sz="6" w:space="4" w:color="000000"/>
+      </w:pBdr>
+    </w:pPr>
+    <w:rPr>
+      <w:rFonts w:ascii="TH Sarabun New" w:hAnsi="TH Sarabun New" w:eastAsia="TH Sarabun New" w:cs="TH Sarabun New"/>
+      <w:color w:val="000000"/>
+      <w:sz w:val="24"/>
+      <w:szCs w:val="24"/>
+    </w:rPr>
+  </w:style>
+  <w:style w:type="paragraph" w:customStyle="1" w:styleId="สารบัญ">
+    <w:name w:val="สารบัญ"/>
+    <w:basedOn w:val="Normal"/>
+    <w:qFormat/>
+    <w:pPr>
+      <w:keepNext w:val="0"/>
+      <w:pageBreakBefore w:val="0"/>
+      <w:spacing w:before="240" w:after="0"/>
+      <w:jc w:val="center"/>
+    </w:pPr>
+    <w:rPr>
+      <w:rFonts w:ascii="TH Sarabun New" w:hAnsi="TH Sarabun New" w:eastAsia="TH Sarabun New" w:cs="TH Sarabun New"/>
+      <w:b/>
+      <w:bCs/>
+      <w:color w:val="000000"/>
+      <w:sz w:val="52"/>
+      <w:szCs w:val="52"/>
+    </w:rPr>
+  </w:style>
+  <w:style w:type="paragraph" w:customStyle="1" w:styleId="สารบัญ-ชื่อ">
+    <w:name w:val="สารบัญ-ชื่อ"/>
+    <w:basedOn w:val="Normal"/>
+    <w:qFormat/>
+    <w:pPr>
+      <w:keepNext w:val="0"/>
+      <w:pageBreakBefore w:val="0"/>
+      <w:spacing w:before="0" w:after="360"/>
+      <w:jc w:val="center"/>
+    </w:pPr>
+    <w:rPr>
+      <w:rFonts w:ascii="TH Sarabun New" w:hAnsi="TH Sarabun New" w:eastAsia="TH Sarabun New" w:cs="TH Sarabun New"/>
+      <w:b/>
+      <w:bCs/>
+      <w:color w:val="000000"/>
+      <w:sz w:val="36"/>
+      <w:szCs w:val="36"/>
+    </w:rPr>
+  </w:style>
+  <w:style w:type="paragraph" w:customStyle="1" w:styleId="ตาราง">
+    <w:name w:val="ตาราง"/>
+    <w:basedOn w:val="Normal"/>
+    <w:qFormat/>
+    <w:pPr>
+      <w:keepNext w:val="0"/>
+      <w:pageBreakBefore w:val="0"/>
+      <w:spacing w:before="0" w:after="0"/>
+    </w:pPr>
+    <w:rPr>
+      <w:rFonts w:ascii="TH Sarabun New" w:hAnsi="TH Sarabun New" w:eastAsia="TH Sarabun New" w:cs="TH Sarabun New"/>
+      <w:color w:val="000000"/>
+      <w:sz w:val="30"/>
+      <w:szCs w:val="30"/>
+    </w:rPr>
+  </w:style>
+  <w:style w:type="paragraph" w:customStyle="1" w:styleId="ตาราง-กลาง">
+    <w:name w:val="ตาราง-กลาง"/>
+    <w:basedOn w:val="Normal"/>
+    <w:qFormat/>
+    <w:pPr>
+      <w:keepNext w:val="0"/>
+      <w:pageBreakBefore w:val="0"/>
+      <w:spacing w:before="0" w:after="0"/>
+      <w:jc w:val="center"/>
+    </w:pPr>
+    <w:rPr>
+      <w:rFonts w:ascii="TH Sarabun New" w:hAnsi="TH Sarabun New" w:eastAsia="TH Sarabun New" w:cs="TH Sarabun New"/>
+      <w:color w:val="000000"/>
+      <w:sz w:val="30"/>
+      <w:szCs w:val="30"/>
+    </w:rPr>
+  </w:style>
+  <w:style w:type="paragraph" w:customStyle="1" w:styleId="สรุป">
+    <w:name w:val="สรุป"/>
+    <w:basedOn w:val="Normal"/>
+    <w:qFormat/>
+    <w:pPr>
+      <w:keepNext w:val="0"/>
+      <w:pageBreakBefore w:val="0"/>
+      <w:spacing w:before="240" w:after="0"/>
+      <w:jc w:val="right"/>
+    </w:pPr>
+    <w:rPr>
+      <w:rFonts w:ascii="TH Sarabun New" w:hAnsi="TH Sarabun New" w:eastAsia="TH Sarabun New" w:cs="TH Sarabun New"/>
+      <w:b/>
+      <w:bCs/>
+      <w:color w:val="000000"/>
+      <w:sz w:val="32"/>
+      <w:szCs w:val="32"/>
+    </w:rPr>
   </w:style>
 </w:styles>
 </file>

</xml_diff>

<commit_message>
Move บทเฉพาะกาล to the end of the 2525 charter and renumber
หมวด ๑๗-๓๖ now start at ม.๓๓๘, หมวดพิเศษ is ม.๑๑๓๐-๑๑๓๗ (coup ban ม.๑๑๓๗) and
บทเฉพาะกาล is ม.๑๑๓๘-๑๑๖๐, followed by the countersignature. Ids, cross-refs,
nav ranges, dashboard tabs, glossary and the chapter source files follow the new
numbers; compare panes and the 2375 charter are untouched. js/constitution.js
also had stale special-chapter numbers (๑๑๒๙-๑๑๓๖), fixed in the same pass.

Co-Authored-By: Claude Opus 5.5 <noreply@anthropic.com>
Claude-Session: https://claude.ai/code/session_01GWidoSqKEDFLRmf2kvfPx4
</commit_message>
<xml_diff>
--- a/files/สารบัญรัฐธรรมนูญ.docx
+++ b/files/สารบัญรัฐธรรมนูญ.docx
@@ -911,7 +911,7 @@
               <w:pStyle w:val="ตาราง"/>
             </w:pPr>
             <w:r>
-              <w:t>บทเฉพาะกาล</w:t>
+              <w:t>หมวด ๑๗ สิทธิชุมชนและการมีส่วนร่วมภาคประชาชน</w:t>
             </w:r>
           </w:p>
         </w:tc>
@@ -941,7 +941,7 @@
               <w:pStyle w:val="ตาราง-กลาง"/>
             </w:pPr>
             <w:r>
-              <w:t>๓๖๐</w:t>
+              <w:t>๓๗๗</w:t>
             </w:r>
           </w:p>
         </w:tc>
@@ -961,7 +961,7 @@
               <w:pStyle w:val="ตาราง"/>
             </w:pPr>
             <w:r>
-              <w:t>หมวด ๑๗ สิทธิชุมชนและการมีส่วนร่วมภาคประชาชน</w:t>
+              <w:t>หมวด ๑๘ สิทธิแรงงานและการคุ้มครองผู้ใช้แรงงาน</w:t>
             </w:r>
           </w:p>
         </w:tc>
@@ -976,7 +976,7 @@
               <w:pStyle w:val="ตาราง-กลาง"/>
             </w:pPr>
             <w:r>
-              <w:t>๓๖๑</w:t>
+              <w:t>๓๗๘</w:t>
             </w:r>
           </w:p>
         </w:tc>
@@ -991,7 +991,7 @@
               <w:pStyle w:val="ตาราง-กลาง"/>
             </w:pPr>
             <w:r>
-              <w:t>๔๐๐</w:t>
+              <w:t>๔๑๗</w:t>
             </w:r>
           </w:p>
         </w:tc>
@@ -1011,7 +1011,7 @@
               <w:pStyle w:val="ตาราง"/>
             </w:pPr>
             <w:r>
-              <w:t>หมวด ๑๘ สิทธิแรงงานและการคุ้มครองผู้ใช้แรงงาน</w:t>
+              <w:t>หมวด ๑๙ สิทธิด้านสิ่งแวดล้อมและทรัพยากรธรรมชาติ</w:t>
             </w:r>
           </w:p>
         </w:tc>
@@ -1026,7 +1026,7 @@
               <w:pStyle w:val="ตาราง-กลาง"/>
             </w:pPr>
             <w:r>
-              <w:t>๔๐๑</w:t>
+              <w:t>๔๑๘</w:t>
             </w:r>
           </w:p>
         </w:tc>
@@ -1041,7 +1041,7 @@
               <w:pStyle w:val="ตาราง-กลาง"/>
             </w:pPr>
             <w:r>
-              <w:t>๔๔๐</w:t>
+              <w:t>๔๕๗</w:t>
             </w:r>
           </w:p>
         </w:tc>
@@ -1061,7 +1061,7 @@
               <w:pStyle w:val="ตาราง"/>
             </w:pPr>
             <w:r>
-              <w:t>หมวด ๑๙ สิทธิด้านสิ่งแวดล้อมและทรัพยากรธรรมชาติ</w:t>
+              <w:t>หมวด ๒๐ เทคโนโลยี นวัตกรรม และเศรษฐกิจดิจิทัล</w:t>
             </w:r>
           </w:p>
         </w:tc>
@@ -1076,7 +1076,7 @@
               <w:pStyle w:val="ตาราง-กลาง"/>
             </w:pPr>
             <w:r>
-              <w:t>๔๔๑</w:t>
+              <w:t>๔๕๘</w:t>
             </w:r>
           </w:p>
         </w:tc>
@@ -1091,7 +1091,7 @@
               <w:pStyle w:val="ตาราง-กลาง"/>
             </w:pPr>
             <w:r>
-              <w:t>๔๘๐</w:t>
+              <w:t>๔๙๗</w:t>
             </w:r>
           </w:p>
         </w:tc>
@@ -1111,7 +1111,7 @@
               <w:pStyle w:val="ตาราง"/>
             </w:pPr>
             <w:r>
-              <w:t>หมวด ๒๐ เทคโนโลยี นวัตกรรม และเศรษฐกิจดิจิทัล</w:t>
+              <w:t>หมวด ๒๑ ความมั่นคงทางอาหารและการเกษตร</w:t>
             </w:r>
           </w:p>
         </w:tc>
@@ -1126,7 +1126,7 @@
               <w:pStyle w:val="ตาราง-กลาง"/>
             </w:pPr>
             <w:r>
-              <w:t>๔๘๑</w:t>
+              <w:t>๔๙๘</w:t>
             </w:r>
           </w:p>
         </w:tc>
@@ -1141,7 +1141,7 @@
               <w:pStyle w:val="ตาราง-กลาง"/>
             </w:pPr>
             <w:r>
-              <w:t>๕๒๐</w:t>
+              <w:t>๕๓๗</w:t>
             </w:r>
           </w:p>
         </w:tc>
@@ -1161,7 +1161,7 @@
               <w:pStyle w:val="ตาราง"/>
             </w:pPr>
             <w:r>
-              <w:t>หมวด ๒๑ ความมั่นคงทางอาหารและการเกษตร</w:t>
+              <w:t>หมวด ๒๒ สิทธิเด็ก เยาวชน ผู้สูงอายุ และผู้พิการ</w:t>
             </w:r>
           </w:p>
         </w:tc>
@@ -1176,7 +1176,7 @@
               <w:pStyle w:val="ตาราง-กลาง"/>
             </w:pPr>
             <w:r>
-              <w:t>๕๒๑</w:t>
+              <w:t>๕๓๘</w:t>
             </w:r>
           </w:p>
         </w:tc>
@@ -1191,7 +1191,7 @@
               <w:pStyle w:val="ตาราง-กลาง"/>
             </w:pPr>
             <w:r>
-              <w:t>๕๖๐</w:t>
+              <w:t>๕๗๗</w:t>
             </w:r>
           </w:p>
         </w:tc>
@@ -1211,7 +1211,7 @@
               <w:pStyle w:val="ตาราง"/>
             </w:pPr>
             <w:r>
-              <w:t>หมวด ๒๒ สิทธิเด็ก เยาวชน ผู้สูงอายุ และผู้พิการ</w:t>
+              <w:t>หมวด ๒๓ การศึกษา วิทยาศาสตร์ และวิจัย</w:t>
             </w:r>
           </w:p>
         </w:tc>
@@ -1226,7 +1226,7 @@
               <w:pStyle w:val="ตาราง-กลาง"/>
             </w:pPr>
             <w:r>
-              <w:t>๕๖๑</w:t>
+              <w:t>๕๗๘</w:t>
             </w:r>
           </w:p>
         </w:tc>
@@ -1241,7 +1241,7 @@
               <w:pStyle w:val="ตาราง-กลาง"/>
             </w:pPr>
             <w:r>
-              <w:t>๖๐๐</w:t>
+              <w:t>๖๑๗</w:t>
             </w:r>
           </w:p>
         </w:tc>
@@ -1261,7 +1261,7 @@
               <w:pStyle w:val="ตาราง"/>
             </w:pPr>
             <w:r>
-              <w:t>หมวด ๒๓ การศึกษา วิทยาศาสตร์ และวิจัย</w:t>
+              <w:t>หมวด ๒๔ สาธารณสุขและระบบสุขภาพ</w:t>
             </w:r>
           </w:p>
         </w:tc>
@@ -1276,7 +1276,7 @@
               <w:pStyle w:val="ตาราง-กลาง"/>
             </w:pPr>
             <w:r>
-              <w:t>๖๐๑</w:t>
+              <w:t>๖๑๘</w:t>
             </w:r>
           </w:p>
         </w:tc>
@@ -1291,7 +1291,7 @@
               <w:pStyle w:val="ตาราง-กลาง"/>
             </w:pPr>
             <w:r>
-              <w:t>๖๔๐</w:t>
+              <w:t>๖๕๗</w:t>
             </w:r>
           </w:p>
         </w:tc>
@@ -1311,7 +1311,7 @@
               <w:pStyle w:val="ตาราง"/>
             </w:pPr>
             <w:r>
-              <w:t>หมวด ๒๔ สาธารณสุขและระบบสุขภาพ</w:t>
+              <w:t>หมวด ๒๕ การต่อต้านการทุจริตและธรรมาภิบาล</w:t>
             </w:r>
           </w:p>
         </w:tc>
@@ -1326,7 +1326,7 @@
               <w:pStyle w:val="ตาราง-กลาง"/>
             </w:pPr>
             <w:r>
-              <w:t>๖๔๑</w:t>
+              <w:t>๖๕๘</w:t>
             </w:r>
           </w:p>
         </w:tc>
@@ -1341,7 +1341,7 @@
               <w:pStyle w:val="ตาราง-กลาง"/>
             </w:pPr>
             <w:r>
-              <w:t>๖๘๐</w:t>
+              <w:t>๖๙๗</w:t>
             </w:r>
           </w:p>
         </w:tc>
@@ -1361,7 +1361,7 @@
               <w:pStyle w:val="ตาราง"/>
             </w:pPr>
             <w:r>
-              <w:t>หมวด ๒๕ การต่อต้านการทุจริตและธรรมาภิบาล</w:t>
+              <w:t>หมวด ๒๖ สื่อมวลชน เสรีภาพสื่อ และข้อมูลข่าวสาร</w:t>
             </w:r>
           </w:p>
         </w:tc>
@@ -1376,7 +1376,7 @@
               <w:pStyle w:val="ตาราง-กลาง"/>
             </w:pPr>
             <w:r>
-              <w:t>๖๘๑</w:t>
+              <w:t>๖๙๘</w:t>
             </w:r>
           </w:p>
         </w:tc>
@@ -1391,7 +1391,7 @@
               <w:pStyle w:val="ตาราง-กลาง"/>
             </w:pPr>
             <w:r>
-              <w:t>๗๒๐</w:t>
+              <w:t>๗๓๗</w:t>
             </w:r>
           </w:p>
         </w:tc>
@@ -1411,7 +1411,7 @@
               <w:pStyle w:val="ตาราง"/>
             </w:pPr>
             <w:r>
-              <w:t>หมวด ๒๖ สื่อมวลชน เสรีภาพสื่อ และข้อมูลข่าวสาร</w:t>
+              <w:t>หมวด ๒๗ การคลัง งบประมาณ และเศรษฐกิจภาคประชาชน</w:t>
             </w:r>
           </w:p>
         </w:tc>
@@ -1426,7 +1426,7 @@
               <w:pStyle w:val="ตาราง-กลาง"/>
             </w:pPr>
             <w:r>
-              <w:t>๗๒๑</w:t>
+              <w:t>๗๓๘</w:t>
             </w:r>
           </w:p>
         </w:tc>
@@ -1441,7 +1441,7 @@
               <w:pStyle w:val="ตาราง-กลาง"/>
             </w:pPr>
             <w:r>
-              <w:t>๗๖๐</w:t>
+              <w:t>๗๗๗</w:t>
             </w:r>
           </w:p>
         </w:tc>
@@ -1461,7 +1461,7 @@
               <w:pStyle w:val="ตาราง"/>
             </w:pPr>
             <w:r>
-              <w:t>หมวด ๒๗ การคลัง งบประมาณ และเศรษฐกิจภาคประชาชน</w:t>
+              <w:t>หมวด ๒๘ กองทัพ ความมั่นคง และการควบคุมโดยพลเรือน</w:t>
             </w:r>
           </w:p>
         </w:tc>
@@ -1476,7 +1476,7 @@
               <w:pStyle w:val="ตาราง-กลาง"/>
             </w:pPr>
             <w:r>
-              <w:t>๗๖๑</w:t>
+              <w:t>๗๗๘</w:t>
             </w:r>
           </w:p>
         </w:tc>
@@ -1491,7 +1491,7 @@
               <w:pStyle w:val="ตาราง-กลาง"/>
             </w:pPr>
             <w:r>
-              <w:t>๘๐๐</w:t>
+              <w:t>๘๑๗</w:t>
             </w:r>
           </w:p>
         </w:tc>
@@ -1511,7 +1511,7 @@
               <w:pStyle w:val="ตาราง"/>
             </w:pPr>
             <w:r>
-              <w:t>หมวด ๒๘ กองทัพ ความมั่นคง และการควบคุมโดยพลเรือน</w:t>
+              <w:t>หมวด ๒๙ ความสัมพันธ์ระหว่างประเทศและสนธิสัญญา</w:t>
             </w:r>
           </w:p>
         </w:tc>
@@ -1526,7 +1526,7 @@
               <w:pStyle w:val="ตาราง-กลาง"/>
             </w:pPr>
             <w:r>
-              <w:t>๘๐๑</w:t>
+              <w:t>๘๑๘</w:t>
             </w:r>
           </w:p>
         </w:tc>
@@ -1541,7 +1541,7 @@
               <w:pStyle w:val="ตาราง-กลาง"/>
             </w:pPr>
             <w:r>
-              <w:t>๘๔๐</w:t>
+              <w:t>๘๕๖</w:t>
             </w:r>
           </w:p>
         </w:tc>
@@ -1561,7 +1561,7 @@
               <w:pStyle w:val="ตาราง"/>
             </w:pPr>
             <w:r>
-              <w:t>หมวด ๒๙ ความสัมพันธ์ระหว่างประเทศและสนธิสัญญา</w:t>
+              <w:t>หมวด ๓๐ สิทธิวัฒนธรรม ภาษา และชาติพันธุ์</w:t>
             </w:r>
           </w:p>
         </w:tc>
@@ -1576,7 +1576,7 @@
               <w:pStyle w:val="ตาราง-กลาง"/>
             </w:pPr>
             <w:r>
-              <w:t>๘๔๑</w:t>
+              <w:t>๘๕๗</w:t>
             </w:r>
           </w:p>
         </w:tc>
@@ -1591,7 +1591,7 @@
               <w:pStyle w:val="ตาราง-กลาง"/>
             </w:pPr>
             <w:r>
-              <w:t>๘๗๙</w:t>
+              <w:t>๘๙๕</w:t>
             </w:r>
           </w:p>
         </w:tc>
@@ -1611,7 +1611,7 @@
               <w:pStyle w:val="ตาราง"/>
             </w:pPr>
             <w:r>
-              <w:t>หมวด ๓๐ สิทธิวัฒนธรรม ภาษา และชาติพันธุ์</w:t>
+              <w:t>หมวด ๓๑ ที่อยู่อาศัยและการพัฒนาเมือง</w:t>
             </w:r>
           </w:p>
         </w:tc>
@@ -1626,7 +1626,7 @@
               <w:pStyle w:val="ตาราง-กลาง"/>
             </w:pPr>
             <w:r>
-              <w:t>๘๘๐</w:t>
+              <w:t>๘๙๖</w:t>
             </w:r>
           </w:p>
         </w:tc>
@@ -1641,7 +1641,7 @@
               <w:pStyle w:val="ตาราง-กลาง"/>
             </w:pPr>
             <w:r>
-              <w:t>๙๑๘</w:t>
+              <w:t>๙๓๔</w:t>
             </w:r>
           </w:p>
         </w:tc>
@@ -1661,7 +1661,7 @@
               <w:pStyle w:val="ตาราง"/>
             </w:pPr>
             <w:r>
-              <w:t>หมวด ๓๑ ที่อยู่อาศัยและการพัฒนาเมือง</w:t>
+              <w:t>หมวด ๓๒ พลังงาน สาธารณูปโภค และการขนส่ง</w:t>
             </w:r>
           </w:p>
         </w:tc>
@@ -1676,7 +1676,7 @@
               <w:pStyle w:val="ตาราง-กลาง"/>
             </w:pPr>
             <w:r>
-              <w:t>๙๑๙</w:t>
+              <w:t>๙๓๕</w:t>
             </w:r>
           </w:p>
         </w:tc>
@@ -1691,7 +1691,7 @@
               <w:pStyle w:val="ตาราง-กลาง"/>
             </w:pPr>
             <w:r>
-              <w:t>๙๕๗</w:t>
+              <w:t>๙๗๓</w:t>
             </w:r>
           </w:p>
         </w:tc>
@@ -1711,7 +1711,7 @@
               <w:pStyle w:val="ตาราง"/>
             </w:pPr>
             <w:r>
-              <w:t>หมวด ๓๒ พลังงาน สาธารณูปโภค และการขนส่ง</w:t>
+              <w:t>หมวด ๓๓ กีฬา นันทนาการ และการท่องเที่ยว</w:t>
             </w:r>
           </w:p>
         </w:tc>
@@ -1726,7 +1726,7 @@
               <w:pStyle w:val="ตาราง-กลาง"/>
             </w:pPr>
             <w:r>
-              <w:t>๙๕๘</w:t>
+              <w:t>๙๗๔</w:t>
             </w:r>
           </w:p>
         </w:tc>
@@ -1741,7 +1741,7 @@
               <w:pStyle w:val="ตาราง-กลาง"/>
             </w:pPr>
             <w:r>
-              <w:t>๙๙๖</w:t>
+              <w:t>๑๐๑๒</w:t>
             </w:r>
           </w:p>
         </w:tc>
@@ -1761,7 +1761,7 @@
               <w:pStyle w:val="ตาราง"/>
             </w:pPr>
             <w:r>
-              <w:t>หมวด ๓๓ กีฬา นันทนาการ และการท่องเที่ยว</w:t>
+              <w:t>หมวด ๓๔ สถานการณ์ฉุกเฉินและภัยพิบัติ</w:t>
             </w:r>
           </w:p>
         </w:tc>
@@ -1776,7 +1776,7 @@
               <w:pStyle w:val="ตาราง-กลาง"/>
             </w:pPr>
             <w:r>
-              <w:t>๙๙๗</w:t>
+              <w:t>๑๐๑๓</w:t>
             </w:r>
           </w:p>
         </w:tc>
@@ -1791,7 +1791,7 @@
               <w:pStyle w:val="ตาราง-กลาง"/>
             </w:pPr>
             <w:r>
-              <w:t>๑๐๓๕</w:t>
+              <w:t>๑๐๕๑</w:t>
             </w:r>
           </w:p>
         </w:tc>
@@ -1811,7 +1811,7 @@
               <w:pStyle w:val="ตาราง"/>
             </w:pPr>
             <w:r>
-              <w:t>หมวด ๓๔ สถานการณ์ฉุกเฉินและภัยพิบัติ</w:t>
+              <w:t>หมวด ๓๕ ความยุติธรรมในระยะเปลี่ยนผ่าน</w:t>
             </w:r>
           </w:p>
         </w:tc>
@@ -1826,7 +1826,7 @@
               <w:pStyle w:val="ตาราง-กลาง"/>
             </w:pPr>
             <w:r>
-              <w:t>๑๐๓๖</w:t>
+              <w:t>๑๐๕๒</w:t>
             </w:r>
           </w:p>
         </w:tc>
@@ -1841,7 +1841,7 @@
               <w:pStyle w:val="ตาราง-กลาง"/>
             </w:pPr>
             <w:r>
-              <w:t>๑๐๗๔</w:t>
+              <w:t>๑๐๙๐</w:t>
             </w:r>
           </w:p>
         </w:tc>
@@ -1861,7 +1861,7 @@
               <w:pStyle w:val="ตาราง"/>
             </w:pPr>
             <w:r>
-              <w:t>หมวด ๓๕ ความยุติธรรมในระยะเปลี่ยนผ่าน</w:t>
+              <w:t>หมวด ๓๖ บทลงโทษและมาตรการบังคับตามรัฐธรรมนูญ</w:t>
             </w:r>
           </w:p>
         </w:tc>
@@ -1876,7 +1876,7 @@
               <w:pStyle w:val="ตาราง-กลาง"/>
             </w:pPr>
             <w:r>
-              <w:t>๑๐๗๕</w:t>
+              <w:t>๑๐๙๑</w:t>
             </w:r>
           </w:p>
         </w:tc>
@@ -1891,7 +1891,7 @@
               <w:pStyle w:val="ตาราง-กลาง"/>
             </w:pPr>
             <w:r>
-              <w:t>๑๑๑๓</w:t>
+              <w:t>๑๑๒๙</w:t>
             </w:r>
           </w:p>
         </w:tc>
@@ -1911,7 +1911,7 @@
               <w:pStyle w:val="ตาราง"/>
             </w:pPr>
             <w:r>
-              <w:t>หมวด ๓๖ บทลงโทษและมาตรการบังคับตามรัฐธรรมนูญ</w:t>
+              <w:t>หมวดพิเศษ อำนาจสูงสุดพิทักษ์ประชาชน (The Supreme People's Power)</w:t>
             </w:r>
           </w:p>
         </w:tc>
@@ -1926,7 +1926,7 @@
               <w:pStyle w:val="ตาราง-กลาง"/>
             </w:pPr>
             <w:r>
-              <w:t>๑๑๑๔</w:t>
+              <w:t>๑๑๓๐</w:t>
             </w:r>
           </w:p>
         </w:tc>
@@ -1941,7 +1941,7 @@
               <w:pStyle w:val="ตาราง-กลาง"/>
             </w:pPr>
             <w:r>
-              <w:t>๑๑๕๒</w:t>
+              <w:t>๑๑๓๗</w:t>
             </w:r>
           </w:p>
         </w:tc>
@@ -1961,7 +1961,7 @@
               <w:pStyle w:val="ตาราง"/>
             </w:pPr>
             <w:r>
-              <w:t>หมวดพิเศษ อำนาจสูงสุดพิทักษ์ประชาชน (The Supreme People's Power)</w:t>
+              <w:t>บทเฉพาะกาล</w:t>
             </w:r>
           </w:p>
         </w:tc>
@@ -1976,7 +1976,7 @@
               <w:pStyle w:val="ตาราง-กลาง"/>
             </w:pPr>
             <w:r>
-              <w:t>๑๑๕๓</w:t>
+              <w:t>๑๑๓๘</w:t>
             </w:r>
           </w:p>
         </w:tc>

</xml_diff>